<commit_message>
fa26 lab update, TM4C to MSPM0
</commit_message>
<xml_diff>
--- a/Lab05.docx
+++ b/Lab05.docx
@@ -1,6 +1,6 @@
 
 <file path=word/document.xml><?xml version="1.0" encoding="utf-8"?>
-<w:document xmlns:wpc="http://schemas.microsoft.com/office/word/2010/wordprocessingCanvas" xmlns:cx="http://schemas.microsoft.com/office/drawing/2014/chartex" xmlns:cx1="http://schemas.microsoft.com/office/drawing/2015/9/8/chartex" xmlns:cx2="http://schemas.microsoft.com/office/drawing/2015/10/21/chartex" xmlns:cx3="http://schemas.microsoft.com/office/drawing/2016/5/9/chartex" xmlns:cx4="http://schemas.microsoft.com/office/drawing/2016/5/10/chartex" xmlns:cx5="http://schemas.microsoft.com/office/drawing/2016/5/11/chartex" xmlns:cx6="http://schemas.microsoft.com/office/drawing/2016/5/12/chartex" xmlns:cx7="http://schemas.microsoft.com/office/drawing/2016/5/13/chartex" xmlns:cx8="http://schemas.microsoft.com/office/drawing/2016/5/14/chartex" xmlns:mc="http://schemas.openxmlformats.org/markup-compatibility/2006" xmlns:aink="http://schemas.microsoft.com/office/drawing/2016/ink" xmlns:am3d="http://schemas.microsoft.com/office/drawing/2017/model3d" xmlns:o="urn:schemas-microsoft-com:office:office" xmlns:oel="http://schemas.microsoft.com/office/2019/extlst" xmlns:r="http://schemas.openxmlformats.org/officeDocument/2006/relationships" xmlns:m="http://schemas.openxmlformats.org/officeDocument/2006/math" xmlns:v="urn:schemas-microsoft-com:vml" xmlns:wp14="http://schemas.microsoft.com/office/word/2010/wordprocessingDrawing" xmlns:wp="http://schemas.openxmlformats.org/drawingml/2006/wordprocessingDrawing" xmlns:w10="urn:schemas-microsoft-com:office:word" xmlns:w="http://schemas.openxmlformats.org/wordprocessingml/2006/main" xmlns:w14="http://schemas.microsoft.com/office/word/2010/wordml" xmlns:w15="http://schemas.microsoft.com/office/word/2012/wordml" xmlns:w16cex="http://schemas.microsoft.com/office/word/2018/wordml/cex" xmlns:w16cid="http://schemas.microsoft.com/office/word/2016/wordml/cid" xmlns:w16="http://schemas.microsoft.com/office/word/2018/wordml" xmlns:w16du="http://schemas.microsoft.com/office/word/2023/wordml/word16du" xmlns:w16sdtdh="http://schemas.microsoft.com/office/word/2020/wordml/sdtdatahash" xmlns:w16sdtfl="http://schemas.microsoft.com/office/word/2024/wordml/sdtformatlock" xmlns:w16se="http://schemas.microsoft.com/office/word/2015/wordml/symex" xmlns:wpg="http://schemas.microsoft.com/office/word/2010/wordprocessingGroup" xmlns:wpi="http://schemas.microsoft.com/office/word/2010/wordprocessingInk" xmlns:wne="http://schemas.microsoft.com/office/word/2006/wordml" xmlns:wps="http://schemas.microsoft.com/office/word/2010/wordprocessingShape" mc:Ignorable="w14 w15 w16se w16cid w16 w16cex w16sdtdh w16sdtfl w16du wp14">
+<w:document xmlns:wpc="http://schemas.microsoft.com/office/word/2010/wordprocessingCanvas" xmlns:cx="http://schemas.microsoft.com/office/drawing/2014/chartex" xmlns:cx1="http://schemas.microsoft.com/office/drawing/2015/9/8/chartex" xmlns:cx2="http://schemas.microsoft.com/office/drawing/2015/10/21/chartex" xmlns:cx3="http://schemas.microsoft.com/office/drawing/2016/5/9/chartex" xmlns:cx4="http://schemas.microsoft.com/office/drawing/2016/5/10/chartex" xmlns:cx5="http://schemas.microsoft.com/office/drawing/2016/5/11/chartex" xmlns:cx6="http://schemas.microsoft.com/office/drawing/2016/5/12/chartex" xmlns:cx7="http://schemas.microsoft.com/office/drawing/2016/5/13/chartex" xmlns:cx8="http://schemas.microsoft.com/office/drawing/2016/5/14/chartex" xmlns:mc="http://schemas.openxmlformats.org/markup-compatibility/2006" xmlns:aink="http://schemas.microsoft.com/office/drawing/2016/ink" xmlns:am3d="http://schemas.microsoft.com/office/drawing/2017/model3d" xmlns:o="urn:schemas-microsoft-com:office:office" xmlns:oel="http://schemas.microsoft.com/office/2019/extlst" xmlns:r="http://schemas.openxmlformats.org/officeDocument/2006/relationships" xmlns:m="http://schemas.openxmlformats.org/officeDocument/2006/math" xmlns:v="urn:schemas-microsoft-com:vml" xmlns:wp14="http://schemas.microsoft.com/office/word/2010/wordprocessingDrawing" xmlns:wp="http://schemas.openxmlformats.org/drawingml/2006/wordprocessingDrawing" xmlns:w10="urn:schemas-microsoft-com:office:word" xmlns:w="http://schemas.openxmlformats.org/wordprocessingml/2006/main" xmlns:w14="http://schemas.microsoft.com/office/word/2010/wordml" xmlns:w15="http://schemas.microsoft.com/office/word/2012/wordml" xmlns:w16cei="http://schemas.microsoft.com/office/word/2026/wordml/cei" xmlns:w16cex="http://schemas.microsoft.com/office/word/2018/wordml/cex" xmlns:w16cid="http://schemas.microsoft.com/office/word/2016/wordml/cid" xmlns:w16="http://schemas.microsoft.com/office/word/2018/wordml" xmlns:w16du="http://schemas.microsoft.com/office/word/2023/wordml/word16du" xmlns:w16sdtdh="http://schemas.microsoft.com/office/word/2020/wordml/sdtdatahash" xmlns:w16sdtfl="http://schemas.microsoft.com/office/word/2024/wordml/sdtformatlock" xmlns:w16se="http://schemas.microsoft.com/office/word/2015/wordml/symex" xmlns:wpg="http://schemas.microsoft.com/office/word/2010/wordprocessingGroup" xmlns:wpi="http://schemas.microsoft.com/office/word/2010/wordprocessingInk" xmlns:wne="http://schemas.microsoft.com/office/word/2006/wordml" xmlns:wps="http://schemas.microsoft.com/office/word/2010/wordprocessingShape" mc:Ignorable="w14 w15 w16se w16cid w16 w16cex w16sdtdh w16sdtfl w16du wp14">
   <w:body>
     <w:p>
       <w:pPr>
@@ -75,7 +75,7 @@
         <w:rPr>
           <w:rFonts w:ascii="Times New Roman" w:hAnsi="Times New Roman" w:cs="Times New Roman"/>
         </w:rPr>
-        <w:t>4</w:t>
+        <w:t>6</w:t>
       </w:r>
       <w:r>
         <w:rPr>
@@ -1692,7 +1692,21 @@
           <w:rFonts w:ascii="Times New Roman" w:eastAsia="Calibri" w:hAnsi="Times New Roman" w:cs="Times New Roman"/>
           <w:color w:val="000000" w:themeColor="text1"/>
         </w:rPr>
-        <w:t>Create a simple SPI/SSI interface,</w:t>
+        <w:t>Create a</w:t>
+      </w:r>
+      <w:r>
+        <w:rPr>
+          <w:rFonts w:ascii="Times New Roman" w:eastAsia="Calibri" w:hAnsi="Times New Roman" w:cs="Times New Roman"/>
+          <w:color w:val="000000" w:themeColor="text1"/>
+        </w:rPr>
+        <w:t>n output-only</w:t>
+      </w:r>
+      <w:r>
+        <w:rPr>
+          <w:rFonts w:ascii="Times New Roman" w:eastAsia="Calibri" w:hAnsi="Times New Roman" w:cs="Times New Roman"/>
+          <w:color w:val="000000" w:themeColor="text1"/>
+        </w:rPr>
+        <w:t xml:space="preserve"> SPI interface,</w:t>
       </w:r>
     </w:p>
     <w:p>
@@ -1769,34 +1783,69 @@
         <w:rPr>
           <w:rFonts w:ascii="Times New Roman" w:hAnsi="Times New Roman" w:cs="Times New Roman"/>
         </w:rPr>
-        <w:t xml:space="preserve">Search </w:t>
-      </w:r>
-      <w:hyperlink r:id="rId8">
-        <w:r>
-          <w:rPr>
-            <w:rStyle w:val="Hyperlink"/>
-            <w:rFonts w:ascii="Times New Roman" w:hAnsi="Times New Roman" w:cs="Times New Roman"/>
-          </w:rPr>
-          <w:t>http://www.ti.com/</w:t>
-        </w:r>
-      </w:hyperlink>
-      <w:r>
-        <w:rPr>
-          <w:rFonts w:ascii="Times New Roman" w:hAnsi="Times New Roman" w:cs="Times New Roman"/>
-        </w:rPr>
-        <w:t xml:space="preserve"> for a data sheet on the </w:t>
-      </w:r>
-      <w:r>
-        <w:rPr>
-          <w:rFonts w:ascii="Times New Roman" w:hAnsi="Times New Roman" w:cs="Times New Roman"/>
-        </w:rPr>
-        <w:t xml:space="preserve">TLV5616CP and </w:t>
-      </w:r>
-      <w:r>
-        <w:rPr>
-          <w:rFonts w:ascii="Times New Roman" w:hAnsi="Times New Roman" w:cs="Times New Roman"/>
-        </w:rPr>
-        <w:t xml:space="preserve">TLV5618CP 12-bit DAC, </w:t>
+        <w:t xml:space="preserve">Search for a </w:t>
+      </w:r>
+      <w:proofErr w:type="gramStart"/>
+      <w:r>
+        <w:rPr>
+          <w:rFonts w:ascii="Times New Roman" w:hAnsi="Times New Roman" w:cs="Times New Roman"/>
+        </w:rPr>
+        <w:t>data sheet</w:t>
+      </w:r>
+      <w:r>
+        <w:rPr>
+          <w:rFonts w:ascii="Times New Roman" w:hAnsi="Times New Roman" w:cs="Times New Roman"/>
+        </w:rPr>
+        <w:t>s</w:t>
+      </w:r>
+      <w:proofErr w:type="gramEnd"/>
+      <w:r>
+        <w:rPr>
+          <w:rFonts w:ascii="Times New Roman" w:hAnsi="Times New Roman" w:cs="Times New Roman"/>
+        </w:rPr>
+        <w:t xml:space="preserve"> on the </w:t>
+      </w:r>
+      <w:r>
+        <w:rPr>
+          <w:rFonts w:ascii="Times New Roman" w:hAnsi="Times New Roman" w:cs="Times New Roman"/>
+        </w:rPr>
+        <w:t>MCP4921-E/P</w:t>
+      </w:r>
+      <w:r>
+        <w:rPr>
+          <w:rFonts w:ascii="Times New Roman" w:hAnsi="Times New Roman" w:cs="Times New Roman"/>
+        </w:rPr>
+        <w:t xml:space="preserve"> </w:t>
+      </w:r>
+      <w:r>
+        <w:rPr>
+          <w:rFonts w:ascii="Times New Roman" w:hAnsi="Times New Roman" w:cs="Times New Roman"/>
+        </w:rPr>
+        <w:t>12-bit DAC</w:t>
+      </w:r>
+      <w:r>
+        <w:rPr>
+          <w:rFonts w:ascii="Times New Roman" w:hAnsi="Times New Roman" w:cs="Times New Roman"/>
+        </w:rPr>
+        <w:t xml:space="preserve"> and </w:t>
+      </w:r>
+      <w:r>
+        <w:rPr>
+          <w:rFonts w:ascii="Times New Roman" w:hAnsi="Times New Roman" w:cs="Times New Roman"/>
+        </w:rPr>
+        <w:t>LM4890M</w:t>
+      </w:r>
+      <w:r>
+        <w:rPr>
+          <w:rFonts w:ascii="Times New Roman" w:hAnsi="Times New Roman" w:cs="Times New Roman"/>
+        </w:rPr>
+        <w:t xml:space="preserve"> amp</w:t>
+      </w:r>
+      <w:r>
+        <w:rPr>
+          <w:rFonts w:ascii="Times New Roman" w:hAnsi="Times New Roman" w:cs="Times New Roman"/>
+        </w:rPr>
+        <w:t xml:space="preserve">, </w:t>
       </w:r>
     </w:p>
     <w:p>
@@ -1817,7 +1866,7 @@
           <w:rFonts w:ascii="Times New Roman" w:eastAsia="Times New Roman" w:hAnsi="Times New Roman" w:cs="Times New Roman"/>
         </w:rPr>
       </w:pPr>
-      <w:hyperlink r:id="rId9" w:anchor="3_7" w:history="1">
+      <w:hyperlink r:id="rId8" w:anchor="3_7" w:history="1">
         <w:proofErr w:type="spellStart"/>
         <w:r>
           <w:rPr>
@@ -1854,7 +1903,7 @@
           <w:color w:val="000000" w:themeColor="text1"/>
         </w:rPr>
       </w:pPr>
-      <w:hyperlink r:id="rId10" w:history="1">
+      <w:hyperlink r:id="rId9" w:history="1">
         <w:proofErr w:type="spellStart"/>
         <w:r>
           <w:rPr>
@@ -1902,7 +1951,7 @@
           <w:rFonts w:ascii="Times New Roman" w:hAnsi="Times New Roman" w:cs="Times New Roman"/>
         </w:rPr>
       </w:pPr>
-      <w:hyperlink r:id="rId11" w:anchor="T_3" w:history="1">
+      <w:hyperlink r:id="rId10" w:anchor="M_3" w:history="1">
         <w:proofErr w:type="spellStart"/>
         <w:r>
           <w:rPr>
@@ -1917,7 +1966,21 @@
             <w:rStyle w:val="Hyperlink"/>
             <w:rFonts w:ascii="Times New Roman" w:hAnsi="Times New Roman" w:cs="Times New Roman"/>
           </w:rPr>
-          <w:t xml:space="preserve"> Section T.3</w:t>
+          <w:t xml:space="preserve"> Section </w:t>
+        </w:r>
+        <w:r>
+          <w:rPr>
+            <w:rStyle w:val="Hyperlink"/>
+            <w:rFonts w:ascii="Times New Roman" w:hAnsi="Times New Roman" w:cs="Times New Roman"/>
+          </w:rPr>
+          <w:t>M</w:t>
+        </w:r>
+        <w:r>
+          <w:rPr>
+            <w:rStyle w:val="Hyperlink"/>
+            <w:rFonts w:ascii="Times New Roman" w:hAnsi="Times New Roman" w:cs="Times New Roman"/>
+          </w:rPr>
+          <w:t>.3</w:t>
         </w:r>
       </w:hyperlink>
       <w:r>
@@ -1945,7 +2008,7 @@
           <w:color w:val="000000" w:themeColor="text1"/>
         </w:rPr>
       </w:pPr>
-      <w:hyperlink r:id="rId12" w:anchor="T_5" w:history="1">
+      <w:hyperlink r:id="rId11" w:anchor="M_5" w:history="1">
         <w:proofErr w:type="spellStart"/>
         <w:r>
           <w:rPr>
@@ -1960,7 +2023,7 @@
             <w:rStyle w:val="Hyperlink"/>
             <w:rFonts w:ascii="Times New Roman" w:hAnsi="Times New Roman" w:cs="Times New Roman"/>
           </w:rPr>
-          <w:t xml:space="preserve"> Section T.5</w:t>
+          <w:t xml:space="preserve"> Section M.5</w:t>
         </w:r>
       </w:hyperlink>
       <w:r>
@@ -1973,7 +2036,19 @@
         <w:rPr>
           <w:rFonts w:ascii="Times New Roman" w:hAnsi="Times New Roman" w:cs="Times New Roman"/>
         </w:rPr>
-        <w:t xml:space="preserve"> Section 7.5 on SSI interfacing</w:t>
+        <w:t xml:space="preserve"> Section 7.5 on S</w:t>
+      </w:r>
+      <w:r>
+        <w:rPr>
+          <w:rFonts w:ascii="Times New Roman" w:hAnsi="Times New Roman" w:cs="Times New Roman"/>
+        </w:rPr>
+        <w:t>P</w:t>
+      </w:r>
+      <w:r>
+        <w:rPr>
+          <w:rFonts w:ascii="Times New Roman" w:hAnsi="Times New Roman" w:cs="Times New Roman"/>
+        </w:rPr>
+        <w:t>I interfacing</w:t>
       </w:r>
       <w:r>
         <w:rPr>
@@ -2031,36 +2106,25 @@
           <w:color w:val="000000" w:themeColor="text1"/>
         </w:rPr>
       </w:pPr>
-      <w:r>
-        <w:rPr>
-          <w:rFonts w:ascii="Times New Roman" w:hAnsi="Times New Roman" w:cs="Times New Roman"/>
-        </w:rPr>
-        <w:t>PeriodicTimer0AInts_xxx project,</w:t>
-      </w:r>
-    </w:p>
-    <w:p>
-      <w:pPr>
-        <w:pStyle w:val="ListParagraph"/>
-        <w:numPr>
-          <w:ilvl w:val="1"/>
-          <w:numId w:val="20"/>
-        </w:numPr>
-        <w:rPr>
-          <w:rFonts w:ascii="Times New Roman" w:eastAsia="Times New Roman" w:hAnsi="Times New Roman" w:cs="Times New Roman"/>
-          <w:color w:val="000000" w:themeColor="text1"/>
-        </w:rPr>
-      </w:pPr>
-      <w:r>
-        <w:rPr>
-          <w:rFonts w:ascii="Times New Roman" w:hAnsi="Times New Roman" w:cs="Times New Roman"/>
-        </w:rPr>
-        <w:t xml:space="preserve">Max5353_xxx </w:t>
-      </w:r>
-      <w:r>
-        <w:rPr>
-          <w:rFonts w:ascii="Times New Roman" w:hAnsi="Times New Roman" w:cs="Times New Roman"/>
-        </w:rPr>
-        <w:t>project</w:t>
+      <w:proofErr w:type="spellStart"/>
+      <w:r>
+        <w:rPr>
+          <w:rFonts w:ascii="Times New Roman" w:hAnsi="Times New Roman" w:cs="Times New Roman"/>
+        </w:rPr>
+        <w:t>Timer</w:t>
+      </w:r>
+      <w:r>
+        <w:rPr>
+          <w:rFonts w:ascii="Times New Roman" w:hAnsi="Times New Roman" w:cs="Times New Roman"/>
+        </w:rPr>
+        <w:t>PeriodicInts</w:t>
+      </w:r>
+      <w:proofErr w:type="spellEnd"/>
+      <w:r>
+        <w:rPr>
+          <w:rFonts w:ascii="Times New Roman" w:hAnsi="Times New Roman" w:cs="Times New Roman"/>
+        </w:rPr>
+        <w:t xml:space="preserve"> project,</w:t>
       </w:r>
     </w:p>
     <w:p>
@@ -2318,7 +2382,7 @@
               <w:rPr>
                 <w:rFonts w:ascii="Times New Roman" w:hAnsi="Times New Roman" w:cs="Times New Roman"/>
               </w:rPr>
-              <w:t>EK-TM4C123GXL</w:t>
+              <w:t>LP-MSPM0G3507</w:t>
             </w:r>
           </w:p>
         </w:tc>
@@ -2332,15 +2396,6 @@
                 <w:rFonts w:ascii="Times New Roman" w:hAnsi="Times New Roman" w:cs="Times New Roman"/>
               </w:rPr>
             </w:pPr>
-            <w:hyperlink r:id="rId13">
-              <w:r>
-                <w:rPr>
-                  <w:rStyle w:val="Hyperlink"/>
-                  <w:rFonts w:ascii="Times New Roman" w:hAnsi="Times New Roman" w:cs="Times New Roman"/>
-                </w:rPr>
-                <w:t>EK-TM4C123GXL datasheet</w:t>
-              </w:r>
-            </w:hyperlink>
           </w:p>
         </w:tc>
         <w:tc>
@@ -2357,19 +2412,7 @@
               <w:rPr>
                 <w:rFonts w:ascii="Times New Roman" w:hAnsi="Times New Roman" w:cs="Times New Roman"/>
               </w:rPr>
-              <w:t>$1</w:t>
-            </w:r>
-            <w:r>
-              <w:rPr>
-                <w:rFonts w:ascii="Times New Roman" w:hAnsi="Times New Roman" w:cs="Times New Roman"/>
-              </w:rPr>
-              <w:t>6</w:t>
-            </w:r>
-            <w:r>
-              <w:rPr>
-                <w:rFonts w:ascii="Times New Roman" w:hAnsi="Times New Roman" w:cs="Times New Roman"/>
-              </w:rPr>
-              <w:t>.99</w:t>
+              <w:t>$18.69</w:t>
             </w:r>
           </w:p>
         </w:tc>
@@ -2387,7 +2430,6 @@
               <w:rPr>
                 <w:rFonts w:ascii="Times New Roman" w:hAnsi="Times New Roman" w:cs="Times New Roman"/>
                 <w:b/>
-                <w:bCs/>
               </w:rPr>
               <w:t>TI</w:t>
             </w:r>
@@ -2643,38 +2685,19 @@
               <w:rPr>
                 <w:rFonts w:ascii="Times New Roman" w:hAnsi="Times New Roman" w:cs="Times New Roman"/>
               </w:rPr>
-              <w:t>TLV5616</w:t>
+              <w:t>MCP4921-E/P</w:t>
             </w:r>
             <w:r>
               <w:rPr>
                 <w:rFonts w:ascii="Times New Roman" w:hAnsi="Times New Roman" w:cs="Times New Roman"/>
               </w:rPr>
-              <w:t>CP</w:t>
+              <w:t xml:space="preserve"> </w:t>
             </w:r>
             <w:r>
               <w:rPr>
                 <w:rFonts w:ascii="Times New Roman" w:hAnsi="Times New Roman" w:cs="Times New Roman"/>
               </w:rPr>
-              <w:t xml:space="preserve"> 12-bit DAC</w:t>
-            </w:r>
-            <w:r>
-              <w:rPr>
-                <w:rFonts w:ascii="Times New Roman" w:hAnsi="Times New Roman" w:cs="Times New Roman"/>
-              </w:rPr>
-              <w:br/>
-              <w:t>or TLV5618</w:t>
-            </w:r>
-            <w:r>
-              <w:rPr>
-                <w:rFonts w:ascii="Times New Roman" w:hAnsi="Times New Roman" w:cs="Times New Roman"/>
-              </w:rPr>
-              <w:t>A</w:t>
-            </w:r>
-            <w:r>
-              <w:rPr>
-                <w:rFonts w:ascii="Times New Roman" w:hAnsi="Times New Roman" w:cs="Times New Roman"/>
-              </w:rPr>
-              <w:t>CP 12-bit DAC</w:t>
+              <w:t>12-bit DAC</w:t>
             </w:r>
           </w:p>
         </w:tc>
@@ -2688,25 +2711,27 @@
                 <w:rFonts w:ascii="Times New Roman" w:hAnsi="Times New Roman" w:cs="Times New Roman"/>
               </w:rPr>
             </w:pPr>
-            <w:hyperlink r:id="rId14">
+            <w:hyperlink r:id="rId12" w:history="1">
               <w:r>
                 <w:rPr>
                   <w:rStyle w:val="Hyperlink"/>
                   <w:rFonts w:ascii="Times New Roman" w:hAnsi="Times New Roman" w:cs="Times New Roman"/>
                 </w:rPr>
-                <w:t>TLV5616 datasheet</w:t>
+                <w:t>MCP</w:t>
               </w:r>
-            </w:hyperlink>
-            <w:r>
-              <w:t xml:space="preserve"> </w:t>
-            </w:r>
-            <w:hyperlink r:id="rId15" w:history="1">
               <w:r>
                 <w:rPr>
                   <w:rStyle w:val="Hyperlink"/>
                   <w:rFonts w:ascii="Times New Roman" w:hAnsi="Times New Roman" w:cs="Times New Roman"/>
                 </w:rPr>
-                <w:t>TLV5618 datasheet</w:t>
+                <w:t>4</w:t>
+              </w:r>
+              <w:r>
+                <w:rPr>
+                  <w:rStyle w:val="Hyperlink"/>
+                  <w:rFonts w:ascii="Times New Roman" w:hAnsi="Times New Roman" w:cs="Times New Roman"/>
+                </w:rPr>
+                <w:t>921 data sheet</w:t>
               </w:r>
             </w:hyperlink>
           </w:p>
@@ -2725,13 +2750,7 @@
               <w:rPr>
                 <w:rFonts w:ascii="Times New Roman" w:hAnsi="Times New Roman" w:cs="Times New Roman"/>
               </w:rPr>
-              <w:t>$9.</w:t>
-            </w:r>
-            <w:r>
-              <w:rPr>
-                <w:rFonts w:ascii="Times New Roman" w:hAnsi="Times New Roman" w:cs="Times New Roman"/>
-              </w:rPr>
-              <w:t>61</w:t>
+              <w:t>$2.81</w:t>
             </w:r>
           </w:p>
         </w:tc>
@@ -2813,7 +2832,7 @@
                 <w:rFonts w:ascii="Times New Roman" w:hAnsi="Times New Roman" w:cs="Times New Roman"/>
               </w:rPr>
             </w:pPr>
-            <w:hyperlink r:id="rId16" w:history="1">
+            <w:hyperlink r:id="rId13" w:history="1">
               <w:r>
                 <w:rPr>
                   <w:rStyle w:val="Hyperlink"/>
@@ -2835,13 +2854,41 @@
                 <w:rFonts w:ascii="Times New Roman" w:hAnsi="Times New Roman" w:cs="Times New Roman"/>
               </w:rPr>
             </w:pPr>
-            <w:hyperlink r:id="rId17" w:history="1">
+            <w:hyperlink r:id="rId14" w:history="1">
               <w:r>
                 <w:rPr>
                   <w:rStyle w:val="Hyperlink"/>
                   <w:rFonts w:ascii="Times New Roman" w:hAnsi="Times New Roman" w:cs="Times New Roman"/>
                 </w:rPr>
-                <w:t>LM4890M data sheet</w:t>
+                <w:t>LM48</w:t>
+              </w:r>
+              <w:r>
+                <w:rPr>
+                  <w:rStyle w:val="Hyperlink"/>
+                  <w:rFonts w:ascii="Times New Roman" w:hAnsi="Times New Roman" w:cs="Times New Roman"/>
+                </w:rPr>
+                <w:t>9</w:t>
+              </w:r>
+              <w:r>
+                <w:rPr>
+                  <w:rStyle w:val="Hyperlink"/>
+                  <w:rFonts w:ascii="Times New Roman" w:hAnsi="Times New Roman" w:cs="Times New Roman"/>
+                </w:rPr>
+                <w:t>0</w:t>
+              </w:r>
+              <w:r>
+                <w:rPr>
+                  <w:rStyle w:val="Hyperlink"/>
+                  <w:rFonts w:ascii="Times New Roman" w:hAnsi="Times New Roman" w:cs="Times New Roman"/>
+                </w:rPr>
+                <w:t>M</w:t>
+              </w:r>
+              <w:r>
+                <w:rPr>
+                  <w:rStyle w:val="Hyperlink"/>
+                  <w:rFonts w:ascii="Times New Roman" w:hAnsi="Times New Roman" w:cs="Times New Roman"/>
+                </w:rPr>
+                <w:t xml:space="preserve"> data sheet</w:t>
               </w:r>
             </w:hyperlink>
           </w:p>
@@ -2960,7 +3007,13 @@
               <w:rPr>
                 <w:rFonts w:ascii="Times New Roman" w:hAnsi="Times New Roman" w:cs="Times New Roman"/>
               </w:rPr>
-              <w:t>LM4041CILPR shunt diode</w:t>
+              <w:t xml:space="preserve">LM4041C12ILP </w:t>
+            </w:r>
+            <w:r>
+              <w:rPr>
+                <w:rFonts w:ascii="Times New Roman" w:hAnsi="Times New Roman" w:cs="Times New Roman"/>
+              </w:rPr>
+              <w:t>shunt diode</w:t>
             </w:r>
           </w:p>
           <w:p>
@@ -2969,12 +3022,6 @@
                 <w:rFonts w:ascii="Times New Roman" w:hAnsi="Times New Roman" w:cs="Times New Roman"/>
               </w:rPr>
             </w:pPr>
-            <w:r>
-              <w:rPr>
-                <w:rFonts w:ascii="Times New Roman" w:hAnsi="Times New Roman" w:cs="Times New Roman"/>
-              </w:rPr>
-              <w:t>or LM4041C12ILP</w:t>
-            </w:r>
           </w:p>
         </w:tc>
         <w:tc>
@@ -2987,13 +3034,27 @@
                 <w:rFonts w:ascii="Times New Roman" w:hAnsi="Times New Roman" w:cs="Times New Roman"/>
               </w:rPr>
             </w:pPr>
-            <w:hyperlink r:id="rId18">
+            <w:hyperlink r:id="rId15">
               <w:r>
                 <w:rPr>
                   <w:rStyle w:val="Hyperlink"/>
                   <w:rFonts w:ascii="Times New Roman" w:hAnsi="Times New Roman" w:cs="Times New Roman"/>
                 </w:rPr>
-                <w:t>LM4041C datasheet</w:t>
+                <w:t>LM40</w:t>
+              </w:r>
+              <w:r>
+                <w:rPr>
+                  <w:rStyle w:val="Hyperlink"/>
+                  <w:rFonts w:ascii="Times New Roman" w:hAnsi="Times New Roman" w:cs="Times New Roman"/>
+                </w:rPr>
+                <w:t>4</w:t>
+              </w:r>
+              <w:r>
+                <w:rPr>
+                  <w:rStyle w:val="Hyperlink"/>
+                  <w:rFonts w:ascii="Times New Roman" w:hAnsi="Times New Roman" w:cs="Times New Roman"/>
+                </w:rPr>
+                <w:t>1C datasheet</w:t>
               </w:r>
             </w:hyperlink>
           </w:p>
@@ -3068,192 +3129,6 @@
           </w:p>
         </w:tc>
       </w:tr>
-      <w:tr>
-        <w:trPr>
-          <w:trHeight w:val="300"/>
-        </w:trPr>
-        <w:tc>
-          <w:tcPr>
-            <w:tcW w:w="2970" w:type="dxa"/>
-          </w:tcPr>
-          <w:p>
-            <w:pPr>
-              <w:rPr>
-                <w:rFonts w:ascii="Times New Roman" w:hAnsi="Times New Roman" w:cs="Times New Roman"/>
-              </w:rPr>
-            </w:pPr>
-            <w:r>
-              <w:rPr>
-                <w:rFonts w:ascii="Times New Roman" w:hAnsi="Times New Roman" w:cs="Times New Roman"/>
-              </w:rPr>
-              <w:t>TPA731D audio amp</w:t>
-            </w:r>
-          </w:p>
-        </w:tc>
-        <w:tc>
-          <w:tcPr>
-            <w:tcW w:w="2820" w:type="dxa"/>
-          </w:tcPr>
-          <w:p>
-            <w:pPr>
-              <w:rPr>
-                <w:rFonts w:ascii="Times New Roman" w:hAnsi="Times New Roman" w:cs="Times New Roman"/>
-              </w:rPr>
-            </w:pPr>
-            <w:hyperlink r:id="rId19">
-              <w:r>
-                <w:rPr>
-                  <w:rStyle w:val="Hyperlink"/>
-                  <w:rFonts w:ascii="Times New Roman" w:hAnsi="Times New Roman" w:cs="Times New Roman"/>
-                </w:rPr>
-                <w:t>TPA731 datasheet</w:t>
-              </w:r>
-            </w:hyperlink>
-          </w:p>
-        </w:tc>
-        <w:tc>
-          <w:tcPr>
-            <w:tcW w:w="1335" w:type="dxa"/>
-          </w:tcPr>
-          <w:p>
-            <w:pPr>
-              <w:rPr>
-                <w:rFonts w:ascii="Times New Roman" w:hAnsi="Times New Roman" w:cs="Times New Roman"/>
-              </w:rPr>
-            </w:pPr>
-            <w:r>
-              <w:rPr>
-                <w:rFonts w:ascii="Times New Roman" w:hAnsi="Times New Roman" w:cs="Times New Roman"/>
-              </w:rPr>
-              <w:t>$</w:t>
-            </w:r>
-            <w:r>
-              <w:rPr>
-                <w:rFonts w:ascii="Times New Roman" w:hAnsi="Times New Roman" w:cs="Times New Roman"/>
-              </w:rPr>
-              <w:t>2.54</w:t>
-            </w:r>
-          </w:p>
-        </w:tc>
-        <w:tc>
-          <w:tcPr>
-            <w:tcW w:w="2235" w:type="dxa"/>
-          </w:tcPr>
-          <w:p>
-            <w:pPr>
-              <w:rPr>
-                <w:rFonts w:ascii="Times New Roman" w:hAnsi="Times New Roman" w:cs="Times New Roman"/>
-              </w:rPr>
-            </w:pPr>
-            <w:r>
-              <w:rPr>
-                <w:rFonts w:ascii="Times New Roman" w:hAnsi="Times New Roman" w:cs="Times New Roman"/>
-                <w:b/>
-                <w:bCs/>
-              </w:rPr>
-              <w:t>Mouser</w:t>
-            </w:r>
-            <w:r>
-              <w:rPr>
-                <w:rFonts w:ascii="Times New Roman" w:hAnsi="Times New Roman" w:cs="Times New Roman"/>
-              </w:rPr>
-              <w:t>, Digikey</w:t>
-            </w:r>
-          </w:p>
-        </w:tc>
-      </w:tr>
-      <w:tr>
-        <w:trPr>
-          <w:trHeight w:val="300"/>
-        </w:trPr>
-        <w:tc>
-          <w:tcPr>
-            <w:tcW w:w="2970" w:type="dxa"/>
-          </w:tcPr>
-          <w:p>
-            <w:pPr>
-              <w:rPr>
-                <w:rFonts w:ascii="Times New Roman" w:hAnsi="Times New Roman" w:cs="Times New Roman"/>
-              </w:rPr>
-            </w:pPr>
-            <w:r>
-              <w:rPr>
-                <w:rFonts w:ascii="Times New Roman" w:hAnsi="Times New Roman" w:cs="Times New Roman"/>
-              </w:rPr>
-              <w:t>MC34119</w:t>
-            </w:r>
-            <w:r>
-              <w:rPr>
-                <w:rFonts w:ascii="Times New Roman" w:hAnsi="Times New Roman" w:cs="Times New Roman"/>
-              </w:rPr>
-              <w:t>P</w:t>
-            </w:r>
-            <w:r>
-              <w:rPr>
-                <w:rFonts w:ascii="Times New Roman" w:hAnsi="Times New Roman" w:cs="Times New Roman"/>
-              </w:rPr>
-              <w:t xml:space="preserve"> (discontinued)</w:t>
-            </w:r>
-          </w:p>
-        </w:tc>
-        <w:tc>
-          <w:tcPr>
-            <w:tcW w:w="2820" w:type="dxa"/>
-          </w:tcPr>
-          <w:p>
-            <w:pPr>
-              <w:rPr>
-                <w:rFonts w:ascii="Times New Roman" w:hAnsi="Times New Roman" w:cs="Times New Roman"/>
-              </w:rPr>
-            </w:pPr>
-            <w:hyperlink r:id="rId20">
-              <w:r>
-                <w:rPr>
-                  <w:rStyle w:val="Hyperlink"/>
-                  <w:rFonts w:ascii="Times New Roman" w:hAnsi="Times New Roman" w:cs="Times New Roman"/>
-                </w:rPr>
-                <w:t>MC34119 datasheet</w:t>
-              </w:r>
-            </w:hyperlink>
-          </w:p>
-        </w:tc>
-        <w:tc>
-          <w:tcPr>
-            <w:tcW w:w="1335" w:type="dxa"/>
-          </w:tcPr>
-          <w:p>
-            <w:pPr>
-              <w:rPr>
-                <w:rFonts w:ascii="Times New Roman" w:hAnsi="Times New Roman" w:cs="Times New Roman"/>
-              </w:rPr>
-            </w:pPr>
-            <w:r>
-              <w:rPr>
-                <w:rFonts w:ascii="Times New Roman" w:hAnsi="Times New Roman" w:cs="Times New Roman"/>
-              </w:rPr>
-              <w:t>N/A</w:t>
-            </w:r>
-          </w:p>
-        </w:tc>
-        <w:tc>
-          <w:tcPr>
-            <w:tcW w:w="2235" w:type="dxa"/>
-          </w:tcPr>
-          <w:p>
-            <w:pPr>
-              <w:rPr>
-                <w:rFonts w:ascii="Times New Roman" w:hAnsi="Times New Roman" w:cs="Times New Roman"/>
-              </w:rPr>
-            </w:pPr>
-            <w:r>
-              <w:rPr>
-                <w:rFonts w:ascii="Times New Roman" w:hAnsi="Times New Roman" w:cs="Times New Roman"/>
-              </w:rPr>
-              <w:t>EER Checkout Desk</w:t>
-            </w:r>
-          </w:p>
-        </w:tc>
-      </w:tr>
     </w:tbl>
     <w:p>
       <w:pPr>
@@ -3274,55 +3149,54 @@
         </w:rPr>
         <w:t xml:space="preserve"> must solder the LM4890 to an SOIC to DIP breakout.</w:t>
       </w:r>
-      <w:r>
-        <w:rPr>
-          <w:rFonts w:ascii="Times New Roman" w:hAnsi="Times New Roman" w:cs="Times New Roman"/>
-        </w:rPr>
-        <w:t xml:space="preserve"> </w:t>
-      </w:r>
-      <w:r>
-        <w:rPr>
-          <w:rFonts w:ascii="Times New Roman" w:hAnsi="Times New Roman" w:cs="Times New Roman"/>
-        </w:rPr>
-        <w:t>can use TPA731D or MC34119P</w:t>
-      </w:r>
-      <w:r>
-        <w:rPr>
-          <w:rFonts w:ascii="Times New Roman" w:hAnsi="Times New Roman" w:cs="Times New Roman"/>
-        </w:rPr>
-        <w:t xml:space="preserve"> (not both)</w:t>
-      </w:r>
-    </w:p>
-    <w:p>
-      <w:pPr>
-        <w:rPr>
-          <w:rFonts w:ascii="Times New Roman" w:hAnsi="Times New Roman" w:cs="Times New Roman"/>
-        </w:rPr>
-      </w:pPr>
-      <w:r>
-        <w:rPr>
-          <w:rFonts w:ascii="Times New Roman" w:hAnsi="Times New Roman" w:cs="Times New Roman"/>
-        </w:rPr>
-        <w:t>You can use LM4041CILPR or LM4041C12ILP (not both)</w:t>
-      </w:r>
-    </w:p>
-    <w:p>
-      <w:pPr>
-        <w:rPr>
-          <w:rFonts w:ascii="Times New Roman" w:hAnsi="Times New Roman" w:cs="Times New Roman"/>
-        </w:rPr>
-      </w:pPr>
-      <w:r>
-        <w:rPr>
-          <w:rFonts w:ascii="Times New Roman" w:hAnsi="Times New Roman" w:cs="Times New Roman"/>
-        </w:rPr>
-        <w:t>You can use TLV5616CP (single) or TLV5618ACP (dual) DAC</w:t>
-      </w:r>
-      <w:r>
-        <w:rPr>
-          <w:rFonts w:ascii="Times New Roman" w:hAnsi="Times New Roman" w:cs="Times New Roman"/>
-        </w:rPr>
-        <w:t xml:space="preserve"> (not both)</w:t>
+    </w:p>
+    <w:p>
+      <w:pPr>
+        <w:rPr>
+          <w:rFonts w:ascii="Times New Roman" w:hAnsi="Times New Roman" w:cs="Times New Roman"/>
+        </w:rPr>
+      </w:pPr>
+      <w:r>
+        <w:rPr>
+          <w:rFonts w:ascii="Times New Roman" w:hAnsi="Times New Roman" w:cs="Times New Roman"/>
+        </w:rPr>
+        <w:t xml:space="preserve">You can use </w:t>
+      </w:r>
+      <w:r>
+        <w:rPr>
+          <w:rFonts w:ascii="Times New Roman" w:hAnsi="Times New Roman" w:cs="Times New Roman"/>
+        </w:rPr>
+        <w:t xml:space="preserve">the adjustable </w:t>
+      </w:r>
+      <w:r>
+        <w:rPr>
+          <w:rFonts w:ascii="Times New Roman" w:hAnsi="Times New Roman" w:cs="Times New Roman"/>
+        </w:rPr>
+        <w:t xml:space="preserve">LM4041CILPR </w:t>
+      </w:r>
+      <w:r>
+        <w:rPr>
+          <w:rFonts w:ascii="Times New Roman" w:hAnsi="Times New Roman" w:cs="Times New Roman"/>
+        </w:rPr>
+        <w:t>instead of the</w:t>
+      </w:r>
+      <w:r>
+        <w:rPr>
+          <w:rFonts w:ascii="Times New Roman" w:hAnsi="Times New Roman" w:cs="Times New Roman"/>
+        </w:rPr>
+        <w:t xml:space="preserve"> LM4041C12ILP (</w:t>
+      </w:r>
+      <w:r>
+        <w:rPr>
+          <w:rFonts w:ascii="Times New Roman" w:hAnsi="Times New Roman" w:cs="Times New Roman"/>
+        </w:rPr>
+        <w:t>the adjustable is hard</w:t>
+      </w:r>
+      <w:r>
+        <w:rPr>
+          <w:rFonts w:ascii="Times New Roman" w:hAnsi="Times New Roman" w:cs="Times New Roman"/>
+        </w:rPr>
+        <w:t>)</w:t>
       </w:r>
     </w:p>
     <w:p>
@@ -3337,7 +3211,6 @@
         <w:rPr>
           <w:rFonts w:ascii="Times New Roman" w:hAnsi="Times New Roman" w:cs="Times New Roman"/>
         </w:rPr>
-        <w:lastRenderedPageBreak/>
         <w:t>Lab Overview</w:t>
       </w:r>
       <w:bookmarkEnd w:id="11"/>
@@ -3420,25 +3293,38 @@
         <w:rPr>
           <w:rFonts w:ascii="Times New Roman" w:hAnsi="Times New Roman" w:cs="Times New Roman"/>
         </w:rPr>
+        <w:lastRenderedPageBreak/>
         <w:t>You</w:t>
       </w:r>
       <w:r>
         <w:rPr>
           <w:rFonts w:ascii="Times New Roman" w:hAnsi="Times New Roman" w:cs="Times New Roman"/>
         </w:rPr>
-        <w:t xml:space="preserve"> will interface a TI TLV5616</w:t>
-      </w:r>
-      <w:r>
-        <w:rPr>
-          <w:rFonts w:ascii="Times New Roman" w:hAnsi="Times New Roman" w:cs="Times New Roman"/>
-        </w:rPr>
-        <w:t xml:space="preserve"> or TLV5618</w:t>
-      </w:r>
-      <w:r>
-        <w:rPr>
-          <w:rFonts w:ascii="Times New Roman" w:hAnsi="Times New Roman" w:cs="Times New Roman"/>
-        </w:rPr>
-        <w:t xml:space="preserve"> 12-bit DAC to an SSI po</w:t>
+        <w:t xml:space="preserve"> will interface a </w:t>
+      </w:r>
+      <w:r>
+        <w:rPr>
+          <w:rFonts w:ascii="Times New Roman" w:hAnsi="Times New Roman" w:cs="Times New Roman"/>
+        </w:rPr>
+        <w:t>Microchip MCP4921</w:t>
+      </w:r>
+      <w:r>
+        <w:rPr>
+          <w:rFonts w:ascii="Times New Roman" w:hAnsi="Times New Roman" w:cs="Times New Roman"/>
+        </w:rPr>
+        <w:t xml:space="preserve"> 12-bit DAC to an S</w:t>
+      </w:r>
+      <w:r>
+        <w:rPr>
+          <w:rFonts w:ascii="Times New Roman" w:hAnsi="Times New Roman" w:cs="Times New Roman"/>
+        </w:rPr>
+        <w:t>P</w:t>
+      </w:r>
+      <w:r>
+        <w:rPr>
+          <w:rFonts w:ascii="Times New Roman" w:hAnsi="Times New Roman" w:cs="Times New Roman"/>
+        </w:rPr>
+        <w:t>I po</w:t>
       </w:r>
       <w:r>
         <w:rPr>
@@ -3474,7 +3360,19 @@
         <w:rPr>
           <w:rFonts w:ascii="Times New Roman" w:hAnsi="Times New Roman" w:cs="Times New Roman"/>
         </w:rPr>
-        <w:t xml:space="preserve"> it runs on a single +3.3V supply and has an SSI interface.</w:t>
+        <w:t xml:space="preserve"> it runs on a single +3.3V supply and has an S</w:t>
+      </w:r>
+      <w:r>
+        <w:rPr>
+          <w:rFonts w:ascii="Times New Roman" w:hAnsi="Times New Roman" w:cs="Times New Roman"/>
+        </w:rPr>
+        <w:t>P</w:t>
+      </w:r>
+      <w:r>
+        <w:rPr>
+          <w:rFonts w:ascii="Times New Roman" w:hAnsi="Times New Roman" w:cs="Times New Roman"/>
+        </w:rPr>
+        <w:t>I interface.</w:t>
       </w:r>
       <w:r>
         <w:rPr>
@@ -3492,7 +3390,19 @@
         <w:rPr>
           <w:rFonts w:ascii="Times New Roman" w:hAnsi="Times New Roman" w:cs="Times New Roman"/>
         </w:rPr>
-        <w:t xml:space="preserve"> produce an analog signal based on commands from the TM4C it will be time to interface an </w:t>
+        <w:t xml:space="preserve"> produce an analog signal based on commands from the </w:t>
+      </w:r>
+      <w:r>
+        <w:rPr>
+          <w:rFonts w:ascii="Times New Roman" w:hAnsi="Times New Roman" w:cs="Times New Roman"/>
+        </w:rPr>
+        <w:t>MSPM0</w:t>
+      </w:r>
+      <w:r>
+        <w:rPr>
+          <w:rFonts w:ascii="Times New Roman" w:hAnsi="Times New Roman" w:cs="Times New Roman"/>
+        </w:rPr>
+        <w:t xml:space="preserve"> it will be time to interface an </w:t>
       </w:r>
       <w:r>
         <w:rPr>
@@ -3873,7 +3783,19 @@
         <w:rPr>
           <w:rFonts w:ascii="Times New Roman" w:hAnsi="Times New Roman" w:cs="Times New Roman"/>
         </w:rPr>
-        <w:t>Understand that in this lab you will create an SSI module and drivers for the DAC. These drivers</w:t>
+        <w:t>Understand that in this lab you will create an S</w:t>
+      </w:r>
+      <w:r>
+        <w:rPr>
+          <w:rFonts w:ascii="Times New Roman" w:hAnsi="Times New Roman" w:cs="Times New Roman"/>
+        </w:rPr>
+        <w:t>P</w:t>
+      </w:r>
+      <w:r>
+        <w:rPr>
+          <w:rFonts w:ascii="Times New Roman" w:hAnsi="Times New Roman" w:cs="Times New Roman"/>
+        </w:rPr>
+        <w:t>I module and drivers for the DAC. These drivers</w:t>
       </w:r>
       <w:r>
         <w:rPr>
@@ -3958,7 +3880,21 @@
           <w:rFonts w:ascii="Times New Roman" w:eastAsia="Calibri" w:hAnsi="Times New Roman" w:cs="Times New Roman"/>
           <w:color w:val="000000" w:themeColor="text1"/>
         </w:rPr>
-        <w:t>. Define at least two functions for the SSI/DAC interface and two functions for the switch interface.</w:t>
+        <w:t>. Define at least two functions for the S</w:t>
+      </w:r>
+      <w:r>
+        <w:rPr>
+          <w:rFonts w:ascii="Times New Roman" w:eastAsia="Calibri" w:hAnsi="Times New Roman" w:cs="Times New Roman"/>
+          <w:color w:val="000000" w:themeColor="text1"/>
+        </w:rPr>
+        <w:t>P</w:t>
+      </w:r>
+      <w:r>
+        <w:rPr>
+          <w:rFonts w:ascii="Times New Roman" w:eastAsia="Calibri" w:hAnsi="Times New Roman" w:cs="Times New Roman"/>
+          <w:color w:val="000000" w:themeColor="text1"/>
+        </w:rPr>
+        <w:t>I/DAC interface and two functions for the switch interface.</w:t>
       </w:r>
     </w:p>
     <w:p>
@@ -4204,7 +4140,7 @@
                     <pic:cNvPicPr/>
                   </pic:nvPicPr>
                   <pic:blipFill>
-                    <a:blip r:embed="rId21">
+                    <a:blip r:embed="rId16">
                       <a:extLst>
                         <a:ext uri="{28A0092B-C50C-407E-A947-70E740481C1C}">
                           <a14:useLocalDpi xmlns:a14="http://schemas.microsoft.com/office/drawing/2010/main" val="0"/>
@@ -4321,7 +4257,7 @@
                     </pic:cNvPicPr>
                   </pic:nvPicPr>
                   <pic:blipFill>
-                    <a:blip r:embed="rId22">
+                    <a:blip r:embed="rId17">
                       <a:extLst>
                         <a:ext uri="{28A0092B-C50C-407E-A947-70E740481C1C}">
                           <a14:useLocalDpi xmlns:a14="http://schemas.microsoft.com/office/drawing/2010/main" val="0"/>
@@ -4391,14 +4327,6 @@
     </w:p>
     <w:p>
       <w:pPr>
-        <w:rPr>
-          <w:rFonts w:ascii="Times New Roman" w:eastAsia="Calibri" w:hAnsi="Times New Roman" w:cs="Times New Roman"/>
-          <w:color w:val="000000" w:themeColor="text1"/>
-        </w:rPr>
-      </w:pPr>
-    </w:p>
-    <w:p>
-      <w:pPr>
         <w:pStyle w:val="ListParagraph"/>
         <w:numPr>
           <w:ilvl w:val="0"/>
@@ -4434,614 +4362,155 @@
           <w:rFonts w:ascii="Times New Roman" w:eastAsia="Calibri" w:hAnsi="Times New Roman" w:cs="Times New Roman"/>
           <w:color w:val="000000" w:themeColor="text1"/>
         </w:rPr>
-        <w:t xml:space="preserve">You must draw a rough draft of the circuit for this lab in KiCad. </w:t>
-      </w:r>
-      <w:r>
-        <w:rPr>
-          <w:rFonts w:ascii="Times New Roman" w:eastAsia="Calibri" w:hAnsi="Times New Roman" w:cs="Times New Roman"/>
-          <w:color w:val="000000" w:themeColor="text1"/>
-        </w:rPr>
-        <w:t>You will find the TLV5616CP</w:t>
-      </w:r>
-      <w:r>
-        <w:rPr>
-          <w:rFonts w:ascii="Times New Roman" w:eastAsia="Calibri" w:hAnsi="Times New Roman" w:cs="Times New Roman"/>
-          <w:color w:val="000000" w:themeColor="text1"/>
-        </w:rPr>
-        <w:t>/TLV5618ACP</w:t>
-      </w:r>
-      <w:r>
-        <w:rPr>
-          <w:rFonts w:ascii="Times New Roman" w:eastAsia="Calibri" w:hAnsi="Times New Roman" w:cs="Times New Roman"/>
-          <w:color w:val="000000" w:themeColor="text1"/>
-        </w:rPr>
-        <w:t xml:space="preserve">, </w:t>
-      </w:r>
-      <w:r>
-        <w:rPr>
-          <w:rFonts w:ascii="Times New Roman" w:eastAsia="Calibri" w:hAnsi="Times New Roman" w:cs="Times New Roman"/>
-          <w:color w:val="000000" w:themeColor="text1"/>
-        </w:rPr>
-        <w:t>LM4890</w:t>
-      </w:r>
-      <w:r>
-        <w:rPr>
-          <w:rFonts w:ascii="Times New Roman" w:eastAsia="Calibri" w:hAnsi="Times New Roman" w:cs="Times New Roman"/>
-          <w:color w:val="000000" w:themeColor="text1"/>
-        </w:rPr>
-        <w:t xml:space="preserve">, and LM4041C symbol, footprint, and model files in the hardware folder, or on websites such as </w:t>
-      </w:r>
-      <w:r>
-        <w:rPr>
-          <w:rFonts w:ascii="Times New Roman" w:eastAsia="Calibri" w:hAnsi="Times New Roman" w:cs="Times New Roman"/>
-          <w:color w:val="000000" w:themeColor="text1"/>
-        </w:rPr>
-        <w:t>M</w:t>
-      </w:r>
-      <w:r>
-        <w:rPr>
-          <w:rFonts w:ascii="Times New Roman" w:eastAsia="Calibri" w:hAnsi="Times New Roman" w:cs="Times New Roman"/>
-          <w:color w:val="000000" w:themeColor="text1"/>
-        </w:rPr>
-        <w:t xml:space="preserve">ouser and </w:t>
-      </w:r>
-      <w:proofErr w:type="spellStart"/>
-      <w:r>
-        <w:rPr>
-          <w:rFonts w:ascii="Times New Roman" w:eastAsia="Calibri" w:hAnsi="Times New Roman" w:cs="Times New Roman"/>
-          <w:color w:val="000000" w:themeColor="text1"/>
-        </w:rPr>
-        <w:t>SnapEDA</w:t>
-      </w:r>
-      <w:proofErr w:type="spellEnd"/>
-      <w:r>
-        <w:rPr>
-          <w:rFonts w:ascii="Times New Roman" w:eastAsia="Calibri" w:hAnsi="Times New Roman" w:cs="Times New Roman"/>
-          <w:color w:val="000000" w:themeColor="text1"/>
-        </w:rPr>
-        <w:t xml:space="preserve">. To begin you should start by adding these parts to your schematic, then continue reading to see how to wire your circuit. </w:t>
-      </w:r>
-      <w:r>
-        <w:rPr>
-          <w:rFonts w:ascii="Times New Roman" w:eastAsia="Calibri" w:hAnsi="Times New Roman" w:cs="Times New Roman"/>
-          <w:color w:val="000000" w:themeColor="text1"/>
-        </w:rPr>
-        <w:t>Your schematic will Include:</w:t>
-      </w:r>
-    </w:p>
-    <w:p>
-      <w:pPr>
-        <w:pStyle w:val="ListParagraph"/>
-        <w:numPr>
-          <w:ilvl w:val="2"/>
-          <w:numId w:val="18"/>
-        </w:numPr>
-        <w:rPr>
-          <w:rFonts w:ascii="Times New Roman" w:eastAsia="Calibri" w:hAnsi="Times New Roman" w:cs="Times New Roman"/>
-          <w:color w:val="000000" w:themeColor="text1"/>
-        </w:rPr>
-      </w:pPr>
-      <w:r>
-        <w:rPr>
-          <w:rFonts w:ascii="Times New Roman" w:eastAsia="Calibri" w:hAnsi="Times New Roman" w:cs="Times New Roman"/>
-          <w:color w:val="000000" w:themeColor="text1"/>
+        <w:t>Obtain</w:t>
+      </w:r>
+      <w:r>
+        <w:rPr>
+          <w:rFonts w:ascii="Times New Roman" w:eastAsia="Calibri" w:hAnsi="Times New Roman" w:cs="Times New Roman"/>
+          <w:color w:val="000000" w:themeColor="text1"/>
+        </w:rPr>
+        <w:t xml:space="preserve"> the DAC </w:t>
+      </w:r>
+      <w:r>
+        <w:rPr>
+          <w:rFonts w:ascii="Times New Roman" w:eastAsia="Calibri" w:hAnsi="Times New Roman" w:cs="Times New Roman"/>
+          <w:color w:val="000000" w:themeColor="text1"/>
+        </w:rPr>
+        <w:t>chip for this lab</w:t>
+      </w:r>
+      <w:r>
+        <w:rPr>
+          <w:rFonts w:ascii="Times New Roman" w:eastAsia="Calibri" w:hAnsi="Times New Roman" w:cs="Times New Roman"/>
+          <w:color w:val="000000" w:themeColor="text1"/>
+        </w:rPr>
+        <w:t xml:space="preserve">. </w:t>
+      </w:r>
+      <w:r>
+        <w:rPr>
+          <w:rFonts w:ascii="Times New Roman" w:hAnsi="Times New Roman" w:cs="Times New Roman"/>
+        </w:rPr>
+        <w:t xml:space="preserve">The </w:t>
+      </w:r>
+      <w:r>
+        <w:rPr>
+          <w:rFonts w:ascii="Times New Roman" w:hAnsi="Times New Roman" w:cs="Times New Roman"/>
+        </w:rPr>
+        <w:t xml:space="preserve">MCP4921 </w:t>
+      </w:r>
+      <w:r>
+        <w:rPr>
+          <w:rFonts w:ascii="Times New Roman" w:hAnsi="Times New Roman" w:cs="Times New Roman"/>
+        </w:rPr>
+        <w:t xml:space="preserve">has no digital data output, and the data sheet shows which pins to use for an SPI interface. </w:t>
+      </w:r>
+      <w:r>
+        <w:rPr>
+          <w:rFonts w:ascii="Times New Roman" w:hAnsi="Times New Roman" w:cs="Times New Roman"/>
+        </w:rPr>
+        <w:t>Choose</w:t>
+      </w:r>
+      <w:r>
+        <w:rPr>
+          <w:rFonts w:ascii="Times New Roman" w:hAnsi="Times New Roman" w:cs="Times New Roman"/>
+        </w:rPr>
+        <w:t xml:space="preserve"> which </w:t>
+      </w:r>
+      <w:r>
+        <w:rPr>
+          <w:rFonts w:ascii="Times New Roman" w:hAnsi="Times New Roman" w:cs="Times New Roman"/>
+        </w:rPr>
+        <w:t>MSPM0</w:t>
+      </w:r>
+      <w:r>
+        <w:rPr>
+          <w:rFonts w:ascii="Times New Roman" w:hAnsi="Times New Roman" w:cs="Times New Roman"/>
+        </w:rPr>
+        <w:t xml:space="preserve"> pins you will </w:t>
+      </w:r>
+      <w:r>
+        <w:rPr>
+          <w:rFonts w:ascii="Times New Roman" w:hAnsi="Times New Roman" w:cs="Times New Roman"/>
+        </w:rPr>
+        <w:t>use for</w:t>
+      </w:r>
+      <w:r>
+        <w:rPr>
+          <w:rFonts w:ascii="Times New Roman" w:hAnsi="Times New Roman" w:cs="Times New Roman"/>
+        </w:rPr>
+        <w:t xml:space="preserve"> </w:t>
+      </w:r>
+      <w:r>
+        <w:rPr>
+          <w:rFonts w:ascii="Times New Roman" w:hAnsi="Times New Roman" w:cs="Times New Roman"/>
+        </w:rPr>
+        <w:t>SDI</w:t>
+      </w:r>
+      <w:r>
+        <w:rPr>
+          <w:rFonts w:ascii="Times New Roman" w:hAnsi="Times New Roman" w:cs="Times New Roman"/>
+        </w:rPr>
+        <w:t>, SCK, and CS bar (active low)</w:t>
+      </w:r>
+      <w:r>
+        <w:rPr>
+          <w:rFonts w:ascii="Times New Roman" w:hAnsi="Times New Roman" w:cs="Times New Roman"/>
+        </w:rPr>
+        <w:t xml:space="preserve">. Decide what you </w:t>
+      </w:r>
+      <w:proofErr w:type="gramStart"/>
+      <w:r>
+        <w:rPr>
+          <w:rFonts w:ascii="Times New Roman" w:hAnsi="Times New Roman" w:cs="Times New Roman"/>
+        </w:rPr>
+        <w:t>will you</w:t>
+      </w:r>
+      <w:proofErr w:type="gramEnd"/>
+      <w:r>
+        <w:rPr>
+          <w:rFonts w:ascii="Times New Roman" w:hAnsi="Times New Roman" w:cs="Times New Roman"/>
+        </w:rPr>
+        <w:t xml:space="preserve"> do with LDAC pin? See the PINCH tab of </w:t>
+      </w:r>
+      <w:r>
+        <w:rPr>
+          <w:rFonts w:ascii="Times New Roman" w:hAnsi="Times New Roman" w:cs="Times New Roman"/>
+          <w:b/>
+          <w:bCs/>
+        </w:rPr>
+        <w:t>MSPM0_Pins_AssignmentsLab5.xlsx</w:t>
+      </w:r>
+      <w:r>
+        <w:rPr>
+          <w:rFonts w:ascii="Times New Roman" w:hAnsi="Times New Roman" w:cs="Times New Roman"/>
+        </w:rPr>
+        <w:t xml:space="preserve">. </w:t>
+      </w:r>
+      <w:r>
+        <w:rPr>
+          <w:rFonts w:ascii="Times New Roman" w:hAnsi="Times New Roman" w:cs="Times New Roman"/>
+        </w:rPr>
+        <w:t>Figure 5.3 shows the block diagram of the DAC.</w:t>
+      </w:r>
+    </w:p>
+    <w:p>
+      <w:pPr>
+        <w:ind w:left="1080"/>
+        <w:jc w:val="center"/>
+        <w:rPr>
+          <w:rFonts w:ascii="Times New Roman" w:eastAsia="Calibri" w:hAnsi="Times New Roman" w:cs="Times New Roman"/>
+          <w:color w:val="000000" w:themeColor="text1"/>
+        </w:rPr>
+      </w:pPr>
+      <w:r>
+        <w:rPr>
+          <w:noProof/>
         </w:rPr>
         <w:lastRenderedPageBreak/>
-        <w:t>Bypass capacitors for ICs on their power pin(s) sized appropriately (i.e.</w:t>
-      </w:r>
-      <w:r>
-        <w:rPr>
-          <w:rFonts w:ascii="Times New Roman" w:eastAsia="Calibri" w:hAnsi="Times New Roman" w:cs="Times New Roman"/>
-          <w:color w:val="000000" w:themeColor="text1"/>
-        </w:rPr>
-        <w:t>,</w:t>
-      </w:r>
-      <w:r>
-        <w:rPr>
-          <w:rFonts w:ascii="Times New Roman" w:eastAsia="Calibri" w:hAnsi="Times New Roman" w:cs="Times New Roman"/>
-          <w:color w:val="000000" w:themeColor="text1"/>
-        </w:rPr>
-        <w:t xml:space="preserve"> 0.1uF)</w:t>
-      </w:r>
-    </w:p>
-    <w:p>
-      <w:pPr>
-        <w:pStyle w:val="ListParagraph"/>
-        <w:numPr>
-          <w:ilvl w:val="2"/>
-          <w:numId w:val="18"/>
-        </w:numPr>
-        <w:rPr>
-          <w:rFonts w:ascii="Times New Roman" w:eastAsia="Calibri" w:hAnsi="Times New Roman" w:cs="Times New Roman"/>
-          <w:color w:val="000000" w:themeColor="text1"/>
-        </w:rPr>
-      </w:pPr>
-      <w:r>
-        <w:rPr>
-          <w:rFonts w:ascii="Times New Roman" w:eastAsia="Calibri" w:hAnsi="Times New Roman" w:cs="Times New Roman"/>
-          <w:color w:val="000000" w:themeColor="text1"/>
-        </w:rPr>
-        <w:t>A DAC and its relevant SPI, reference, and output pins connected properly</w:t>
-      </w:r>
-    </w:p>
-    <w:p>
-      <w:pPr>
-        <w:pStyle w:val="ListParagraph"/>
-        <w:numPr>
-          <w:ilvl w:val="2"/>
-          <w:numId w:val="18"/>
-        </w:numPr>
-        <w:rPr>
-          <w:rFonts w:ascii="Times New Roman" w:eastAsia="Calibri" w:hAnsi="Times New Roman" w:cs="Times New Roman"/>
-          <w:color w:val="000000" w:themeColor="text1"/>
-        </w:rPr>
-      </w:pPr>
-      <w:r>
-        <w:rPr>
-          <w:rFonts w:ascii="Times New Roman" w:eastAsia="Calibri" w:hAnsi="Times New Roman" w:cs="Times New Roman"/>
-          <w:color w:val="000000" w:themeColor="text1"/>
-        </w:rPr>
-        <w:t>A voltage reference circuit and its configuration resistors</w:t>
-      </w:r>
-    </w:p>
-    <w:p>
-      <w:pPr>
-        <w:pStyle w:val="ListParagraph"/>
-        <w:numPr>
-          <w:ilvl w:val="2"/>
-          <w:numId w:val="18"/>
-        </w:numPr>
-        <w:rPr>
-          <w:rFonts w:ascii="Times New Roman" w:eastAsia="Calibri" w:hAnsi="Times New Roman" w:cs="Times New Roman"/>
-          <w:color w:val="000000" w:themeColor="text1"/>
-        </w:rPr>
-      </w:pPr>
-      <w:r>
-        <w:rPr>
-          <w:rFonts w:ascii="Times New Roman" w:eastAsia="Calibri" w:hAnsi="Times New Roman" w:cs="Times New Roman"/>
-          <w:color w:val="000000" w:themeColor="text1"/>
-        </w:rPr>
-        <w:t>An audio amplifier and its required passive components</w:t>
-      </w:r>
-      <w:r>
-        <w:rPr>
-          <w:rFonts w:ascii="Times New Roman" w:eastAsia="Calibri" w:hAnsi="Times New Roman" w:cs="Times New Roman"/>
-          <w:color w:val="000000" w:themeColor="text1"/>
-        </w:rPr>
-        <w:t xml:space="preserve"> powered by VBUS</w:t>
-      </w:r>
-    </w:p>
-    <w:p>
-      <w:pPr>
-        <w:pStyle w:val="ListParagraph"/>
-        <w:numPr>
-          <w:ilvl w:val="2"/>
-          <w:numId w:val="18"/>
-        </w:numPr>
-        <w:rPr>
-          <w:rFonts w:ascii="Times New Roman" w:eastAsia="Calibri" w:hAnsi="Times New Roman" w:cs="Times New Roman"/>
-          <w:color w:val="000000" w:themeColor="text1"/>
-        </w:rPr>
-      </w:pPr>
-      <w:r>
-        <w:rPr>
-          <w:rFonts w:ascii="Times New Roman" w:eastAsia="Calibri" w:hAnsi="Times New Roman" w:cs="Times New Roman"/>
-          <w:color w:val="000000" w:themeColor="text1"/>
-        </w:rPr>
-        <w:t>Two or more buttons as required.</w:t>
-      </w:r>
-    </w:p>
-    <w:p>
-      <w:pPr>
-        <w:pStyle w:val="ListParagraph"/>
-        <w:numPr>
-          <w:ilvl w:val="2"/>
-          <w:numId w:val="18"/>
-        </w:numPr>
-        <w:rPr>
-          <w:rFonts w:ascii="Times New Roman" w:eastAsia="Calibri" w:hAnsi="Times New Roman" w:cs="Times New Roman"/>
-          <w:color w:val="000000" w:themeColor="text1"/>
-        </w:rPr>
-      </w:pPr>
-      <w:r>
-        <w:rPr>
-          <w:rFonts w:ascii="Times New Roman" w:eastAsia="Calibri" w:hAnsi="Times New Roman" w:cs="Times New Roman"/>
-          <w:color w:val="000000" w:themeColor="text1"/>
-        </w:rPr>
-        <w:t xml:space="preserve">Relevant signal names and pin numbers. </w:t>
-      </w:r>
-    </w:p>
-    <w:p>
-      <w:pPr>
-        <w:pStyle w:val="ListParagraph"/>
-        <w:numPr>
-          <w:ilvl w:val="0"/>
-          <w:numId w:val="18"/>
-        </w:numPr>
-        <w:rPr>
-          <w:rFonts w:ascii="Times New Roman" w:eastAsia="Calibri" w:hAnsi="Times New Roman" w:cs="Times New Roman"/>
-          <w:color w:val="000000" w:themeColor="text1"/>
-        </w:rPr>
-      </w:pPr>
-      <w:r>
-        <w:rPr>
-          <w:rFonts w:ascii="Times New Roman" w:eastAsia="Calibri" w:hAnsi="Times New Roman" w:cs="Times New Roman"/>
-          <w:color w:val="000000" w:themeColor="text1"/>
-        </w:rPr>
-        <w:t>Hardware Setup</w:t>
-      </w:r>
-    </w:p>
-    <w:p>
-      <w:pPr>
-        <w:pStyle w:val="ListParagraph"/>
-        <w:numPr>
-          <w:ilvl w:val="1"/>
-          <w:numId w:val="18"/>
-        </w:numPr>
-        <w:rPr>
-          <w:rFonts w:ascii="Times New Roman" w:eastAsia="Calibri" w:hAnsi="Times New Roman" w:cs="Times New Roman"/>
-          <w:color w:val="000000" w:themeColor="text1"/>
-        </w:rPr>
-      </w:pPr>
-      <w:r>
-        <w:rPr>
-          <w:rFonts w:ascii="Times New Roman" w:hAnsi="Times New Roman" w:cs="Times New Roman"/>
-          <w:color w:val="000000"/>
-        </w:rPr>
-        <w:t>Be prepared to show your TA that you can assemble the hardware for this lab; Before leaving prep, you must collect all hardware needed to perform this lab as listed below:</w:t>
-      </w:r>
-    </w:p>
-    <w:p>
-      <w:pPr>
-        <w:pStyle w:val="ListParagraph"/>
-        <w:numPr>
-          <w:ilvl w:val="2"/>
-          <w:numId w:val="18"/>
-        </w:numPr>
-        <w:rPr>
-          <w:rFonts w:ascii="Times New Roman" w:eastAsia="Calibri" w:hAnsi="Times New Roman" w:cs="Times New Roman"/>
-          <w:color w:val="000000" w:themeColor="text1"/>
-        </w:rPr>
-      </w:pPr>
-      <w:r>
-        <w:rPr>
-          <w:rFonts w:ascii="Times New Roman" w:eastAsia="Calibri" w:hAnsi="Times New Roman" w:cs="Times New Roman"/>
-          <w:color w:val="000000" w:themeColor="text1"/>
-        </w:rPr>
-        <w:t>A DAC, such as the TLV5616</w:t>
-      </w:r>
-      <w:r>
-        <w:rPr>
-          <w:rFonts w:ascii="Times New Roman" w:eastAsia="Calibri" w:hAnsi="Times New Roman" w:cs="Times New Roman"/>
-          <w:color w:val="000000" w:themeColor="text1"/>
-        </w:rPr>
-        <w:t>/TLV5618</w:t>
-      </w:r>
-      <w:r>
-        <w:rPr>
-          <w:rFonts w:ascii="Times New Roman" w:eastAsia="Calibri" w:hAnsi="Times New Roman" w:cs="Times New Roman"/>
-          <w:color w:val="000000" w:themeColor="text1"/>
-        </w:rPr>
-        <w:t xml:space="preserve"> </w:t>
-      </w:r>
-    </w:p>
-    <w:p>
-      <w:pPr>
-        <w:pStyle w:val="ListParagraph"/>
-        <w:numPr>
-          <w:ilvl w:val="2"/>
-          <w:numId w:val="18"/>
-        </w:numPr>
-        <w:rPr>
-          <w:rFonts w:ascii="Times New Roman" w:eastAsia="Calibri" w:hAnsi="Times New Roman" w:cs="Times New Roman"/>
-          <w:color w:val="000000" w:themeColor="text1"/>
-        </w:rPr>
-      </w:pPr>
-      <w:r>
-        <w:rPr>
-          <w:rFonts w:ascii="Times New Roman" w:eastAsia="Calibri" w:hAnsi="Times New Roman" w:cs="Times New Roman"/>
-          <w:color w:val="000000" w:themeColor="text1"/>
-        </w:rPr>
-        <w:t xml:space="preserve">A </w:t>
-      </w:r>
-      <w:r>
-        <w:rPr>
-          <w:rFonts w:ascii="Times New Roman" w:eastAsia="Calibri" w:hAnsi="Times New Roman" w:cs="Times New Roman"/>
-          <w:color w:val="000000" w:themeColor="text1"/>
-        </w:rPr>
-        <w:t>v</w:t>
-      </w:r>
-      <w:r>
-        <w:rPr>
-          <w:rFonts w:ascii="Times New Roman" w:eastAsia="Calibri" w:hAnsi="Times New Roman" w:cs="Times New Roman"/>
-          <w:color w:val="000000" w:themeColor="text1"/>
-        </w:rPr>
-        <w:t xml:space="preserve">oltage </w:t>
-      </w:r>
-      <w:r>
-        <w:rPr>
-          <w:rFonts w:ascii="Times New Roman" w:eastAsia="Calibri" w:hAnsi="Times New Roman" w:cs="Times New Roman"/>
-          <w:color w:val="000000" w:themeColor="text1"/>
-        </w:rPr>
-        <w:t>r</w:t>
-      </w:r>
-      <w:r>
-        <w:rPr>
-          <w:rFonts w:ascii="Times New Roman" w:eastAsia="Calibri" w:hAnsi="Times New Roman" w:cs="Times New Roman"/>
-          <w:color w:val="000000" w:themeColor="text1"/>
-        </w:rPr>
-        <w:t>eference, such as the LM4041</w:t>
-      </w:r>
-    </w:p>
-    <w:p>
-      <w:pPr>
-        <w:pStyle w:val="ListParagraph"/>
-        <w:numPr>
-          <w:ilvl w:val="2"/>
-          <w:numId w:val="18"/>
-        </w:numPr>
-        <w:rPr>
-          <w:rFonts w:ascii="Times New Roman" w:eastAsia="Calibri" w:hAnsi="Times New Roman" w:cs="Times New Roman"/>
-          <w:color w:val="000000" w:themeColor="text1"/>
-        </w:rPr>
-      </w:pPr>
-      <w:r>
-        <w:rPr>
-          <w:rFonts w:ascii="Times New Roman" w:eastAsia="Calibri" w:hAnsi="Times New Roman" w:cs="Times New Roman"/>
-          <w:color w:val="000000" w:themeColor="text1"/>
-        </w:rPr>
-        <w:t xml:space="preserve">An </w:t>
-      </w:r>
-      <w:r>
-        <w:rPr>
-          <w:rFonts w:ascii="Times New Roman" w:eastAsia="Calibri" w:hAnsi="Times New Roman" w:cs="Times New Roman"/>
-          <w:color w:val="000000" w:themeColor="text1"/>
-        </w:rPr>
-        <w:t xml:space="preserve">LM4890 </w:t>
-      </w:r>
-      <w:r>
-        <w:rPr>
-          <w:rFonts w:ascii="Times New Roman" w:eastAsia="Calibri" w:hAnsi="Times New Roman" w:cs="Times New Roman"/>
-          <w:color w:val="000000" w:themeColor="text1"/>
-        </w:rPr>
-        <w:t>a</w:t>
-      </w:r>
-      <w:r>
-        <w:rPr>
-          <w:rFonts w:ascii="Times New Roman" w:eastAsia="Calibri" w:hAnsi="Times New Roman" w:cs="Times New Roman"/>
-          <w:color w:val="000000" w:themeColor="text1"/>
-        </w:rPr>
-        <w:t xml:space="preserve">udio </w:t>
-      </w:r>
-      <w:r>
-        <w:rPr>
-          <w:rFonts w:ascii="Times New Roman" w:eastAsia="Calibri" w:hAnsi="Times New Roman" w:cs="Times New Roman"/>
-          <w:color w:val="000000" w:themeColor="text1"/>
-        </w:rPr>
-        <w:t>a</w:t>
-      </w:r>
-      <w:r>
-        <w:rPr>
-          <w:rFonts w:ascii="Times New Roman" w:eastAsia="Calibri" w:hAnsi="Times New Roman" w:cs="Times New Roman"/>
-          <w:color w:val="000000" w:themeColor="text1"/>
-        </w:rPr>
-        <w:t>mplifier</w:t>
-      </w:r>
-      <w:r>
-        <w:rPr>
-          <w:rFonts w:ascii="Times New Roman" w:eastAsia="Calibri" w:hAnsi="Times New Roman" w:cs="Times New Roman"/>
-          <w:color w:val="000000" w:themeColor="text1"/>
-        </w:rPr>
-        <w:t>, SOIC to DIP breakout, 8 male-male pins</w:t>
-      </w:r>
-    </w:p>
-    <w:p>
-      <w:pPr>
-        <w:pStyle w:val="ListParagraph"/>
-        <w:numPr>
-          <w:ilvl w:val="2"/>
-          <w:numId w:val="18"/>
-        </w:numPr>
-        <w:rPr>
-          <w:rFonts w:ascii="Times New Roman" w:eastAsia="Calibri" w:hAnsi="Times New Roman" w:cs="Times New Roman"/>
-          <w:color w:val="000000" w:themeColor="text1"/>
-        </w:rPr>
-      </w:pPr>
-      <w:r>
-        <w:rPr>
-          <w:rFonts w:ascii="Times New Roman" w:eastAsia="Calibri" w:hAnsi="Times New Roman" w:cs="Times New Roman"/>
-          <w:color w:val="000000" w:themeColor="text1"/>
-        </w:rPr>
-        <w:t>A speaker, either 8 or 32 Ohms</w:t>
-      </w:r>
-    </w:p>
-    <w:p>
-      <w:pPr>
-        <w:pStyle w:val="ListParagraph"/>
-        <w:numPr>
-          <w:ilvl w:val="2"/>
-          <w:numId w:val="18"/>
-        </w:numPr>
-        <w:rPr>
-          <w:rFonts w:ascii="Times New Roman" w:eastAsia="Calibri" w:hAnsi="Times New Roman" w:cs="Times New Roman"/>
-          <w:color w:val="000000" w:themeColor="text1"/>
-        </w:rPr>
-      </w:pPr>
-      <w:r>
-        <w:rPr>
-          <w:rFonts w:ascii="Times New Roman" w:eastAsia="Calibri" w:hAnsi="Times New Roman" w:cs="Times New Roman"/>
-          <w:color w:val="000000" w:themeColor="text1"/>
-        </w:rPr>
-        <w:t>Additional resistors, capacitors, and jumpers</w:t>
-      </w:r>
-    </w:p>
-    <w:p>
-      <w:pPr>
-        <w:pStyle w:val="ListParagraph"/>
-        <w:numPr>
-          <w:ilvl w:val="2"/>
-          <w:numId w:val="18"/>
-        </w:numPr>
-        <w:rPr>
-          <w:rFonts w:ascii="Times New Roman" w:eastAsia="Calibri" w:hAnsi="Times New Roman" w:cs="Times New Roman"/>
-          <w:color w:val="000000" w:themeColor="text1"/>
-        </w:rPr>
-      </w:pPr>
-      <w:r>
-        <w:rPr>
-          <w:rFonts w:ascii="Times New Roman" w:eastAsia="Calibri" w:hAnsi="Times New Roman" w:cs="Times New Roman"/>
-          <w:color w:val="000000" w:themeColor="text1"/>
-        </w:rPr>
-        <w:t xml:space="preserve">(Optional) A </w:t>
-      </w:r>
-      <w:r>
-        <w:rPr>
-          <w:rFonts w:ascii="Times New Roman" w:eastAsia="Calibri" w:hAnsi="Times New Roman" w:cs="Times New Roman"/>
-          <w:color w:val="000000" w:themeColor="text1"/>
-        </w:rPr>
-        <w:t>P</w:t>
-      </w:r>
-      <w:r>
-        <w:rPr>
-          <w:rFonts w:ascii="Times New Roman" w:eastAsia="Calibri" w:hAnsi="Times New Roman" w:cs="Times New Roman"/>
-          <w:color w:val="000000" w:themeColor="text1"/>
-        </w:rPr>
-        <w:t>op-</w:t>
-      </w:r>
-      <w:r>
-        <w:rPr>
-          <w:rFonts w:ascii="Times New Roman" w:eastAsia="Calibri" w:hAnsi="Times New Roman" w:cs="Times New Roman"/>
-          <w:color w:val="000000" w:themeColor="text1"/>
-        </w:rPr>
-        <w:t>T</w:t>
-      </w:r>
-      <w:r>
-        <w:rPr>
-          <w:rFonts w:ascii="Times New Roman" w:eastAsia="Calibri" w:hAnsi="Times New Roman" w:cs="Times New Roman"/>
-          <w:color w:val="000000" w:themeColor="text1"/>
-        </w:rPr>
-        <w:t>art</w:t>
-      </w:r>
-      <w:r>
-        <w:rPr>
-          <w:rFonts w:ascii="Times New Roman" w:eastAsia="Calibri" w:hAnsi="Times New Roman" w:cs="Times New Roman"/>
-          <w:color w:val="000000" w:themeColor="text1"/>
-        </w:rPr>
-        <w:t>s</w:t>
-      </w:r>
-      <w:r>
-        <w:rPr>
-          <w:rFonts w:ascii="Times New Roman" w:eastAsia="Calibri" w:hAnsi="Times New Roman" w:cs="Times New Roman"/>
-          <w:color w:val="000000" w:themeColor="text1"/>
-        </w:rPr>
-        <w:t xml:space="preserve"> or small cereal box </w:t>
-      </w:r>
-      <w:r>
-        <w:rPr>
-          <w:rFonts w:ascii="Times New Roman" w:eastAsia="Calibri" w:hAnsi="Times New Roman" w:cs="Times New Roman"/>
-          <w:color w:val="000000" w:themeColor="text1"/>
-        </w:rPr>
-        <w:t xml:space="preserve">into which </w:t>
-      </w:r>
-      <w:r>
-        <w:rPr>
-          <w:rFonts w:ascii="Times New Roman" w:eastAsia="Calibri" w:hAnsi="Times New Roman" w:cs="Times New Roman"/>
-          <w:color w:val="000000" w:themeColor="text1"/>
-        </w:rPr>
-        <w:t xml:space="preserve">to mount the speaker </w:t>
-      </w:r>
-    </w:p>
-    <w:p>
-      <w:pPr>
-        <w:pStyle w:val="ListParagraph"/>
-        <w:numPr>
-          <w:ilvl w:val="1"/>
-          <w:numId w:val="18"/>
-        </w:numPr>
-        <w:rPr>
-          <w:rFonts w:ascii="Times New Roman" w:hAnsi="Times New Roman" w:cs="Times New Roman"/>
-        </w:rPr>
-      </w:pPr>
-      <w:r>
-        <w:rPr>
-          <w:rFonts w:ascii="Times New Roman" w:eastAsia="Calibri" w:hAnsi="Times New Roman" w:cs="Times New Roman"/>
-          <w:color w:val="000000" w:themeColor="text1"/>
-        </w:rPr>
-        <w:t>Consider the DAC</w:t>
-      </w:r>
-      <w:r>
-        <w:rPr>
-          <w:rFonts w:ascii="Times New Roman" w:eastAsia="Calibri" w:hAnsi="Times New Roman" w:cs="Times New Roman"/>
-          <w:color w:val="000000" w:themeColor="text1"/>
-        </w:rPr>
-        <w:t xml:space="preserve"> used in this lab and its wiring. </w:t>
-      </w:r>
-      <w:r>
-        <w:rPr>
-          <w:rFonts w:ascii="Times New Roman" w:hAnsi="Times New Roman" w:cs="Times New Roman"/>
-        </w:rPr>
-        <w:t xml:space="preserve">The TLV5616 has no digital data output, and the data sheet shows which pins to use for an SPI interface. </w:t>
-      </w:r>
-      <w:r>
-        <w:rPr>
-          <w:rFonts w:ascii="Times New Roman" w:hAnsi="Times New Roman" w:cs="Times New Roman"/>
-        </w:rPr>
-        <w:t xml:space="preserve">Consider </w:t>
-      </w:r>
-      <w:r>
-        <w:rPr>
-          <w:rFonts w:ascii="Times New Roman" w:hAnsi="Times New Roman" w:cs="Times New Roman"/>
-        </w:rPr>
-        <w:t>which TM4C123 pins you will connect to DIN, SCLK, and CS bar (active low) of the TLV5616</w:t>
-      </w:r>
-      <w:r>
-        <w:rPr>
-          <w:rFonts w:ascii="Times New Roman" w:hAnsi="Times New Roman" w:cs="Times New Roman"/>
-        </w:rPr>
-        <w:t xml:space="preserve"> to</w:t>
-      </w:r>
-      <w:r>
-        <w:rPr>
-          <w:rFonts w:ascii="Times New Roman" w:hAnsi="Times New Roman" w:cs="Times New Roman"/>
-        </w:rPr>
-        <w:t>.</w:t>
-      </w:r>
-      <w:r>
-        <w:rPr>
-          <w:rFonts w:ascii="Times New Roman" w:hAnsi="Times New Roman" w:cs="Times New Roman"/>
-        </w:rPr>
-        <w:t xml:space="preserve"> </w:t>
-      </w:r>
-      <w:r>
-        <w:rPr>
-          <w:rFonts w:ascii="Times New Roman" w:hAnsi="Times New Roman" w:cs="Times New Roman"/>
-        </w:rPr>
-        <w:t>Figure 5.3 shows the block diagram of the DAC</w:t>
-      </w:r>
-      <w:r>
-        <w:rPr>
-          <w:rFonts w:ascii="Times New Roman" w:hAnsi="Times New Roman" w:cs="Times New Roman"/>
-        </w:rPr>
-        <w:t xml:space="preserve">. </w:t>
-      </w:r>
-    </w:p>
-    <w:p>
-      <w:pPr>
-        <w:jc w:val="center"/>
-        <w:rPr>
-          <w:rFonts w:ascii="Times New Roman" w:hAnsi="Times New Roman" w:cs="Times New Roman"/>
-        </w:rPr>
-      </w:pPr>
-      <w:r>
-        <w:rPr>
-          <w:rFonts w:ascii="Times New Roman" w:hAnsi="Times New Roman" w:cs="Times New Roman"/>
-          <w:noProof/>
-        </w:rPr>
         <w:drawing>
-          <wp:inline distT="0" distB="0" distL="0" distR="0" wp14:anchorId="7901EB58" wp14:editId="59AE78B1">
-            <wp:extent cx="4572000" cy="2219325"/>
+          <wp:inline distT="0" distB="0" distL="0" distR="0" wp14:anchorId="0FBC762C" wp14:editId="4C0E2544">
+            <wp:extent cx="2904411" cy="3266531"/>
             <wp:effectExtent l="0" t="0" r="0" b="0"/>
-            <wp:docPr id="579686813" name="Picture 579686813" title="Inserting image..."/>
+            <wp:docPr id="189191101" name="Picture 1"/>
             <wp:cNvGraphicFramePr>
               <a:graphicFrameLocks xmlns:a="http://schemas.openxmlformats.org/drawingml/2006/main" noChangeAspect="1"/>
             </wp:cNvGraphicFramePr>
@@ -5049,17 +4518,11 @@
               <a:graphicData uri="http://schemas.openxmlformats.org/drawingml/2006/picture">
                 <pic:pic xmlns:pic="http://schemas.openxmlformats.org/drawingml/2006/picture">
                   <pic:nvPicPr>
-                    <pic:cNvPr id="0" name=""/>
+                    <pic:cNvPr id="189191101" name=""/>
                     <pic:cNvPicPr/>
                   </pic:nvPicPr>
                   <pic:blipFill>
-                    <a:blip r:embed="rId23">
-                      <a:extLst>
-                        <a:ext uri="{28A0092B-C50C-407E-A947-70E740481C1C}">
-                          <a14:useLocalDpi xmlns:a14="http://schemas.microsoft.com/office/drawing/2010/main" val="0"/>
-                        </a:ext>
-                      </a:extLst>
-                    </a:blip>
+                    <a:blip r:embed="rId18"/>
                     <a:stretch>
                       <a:fillRect/>
                     </a:stretch>
@@ -5067,7 +4530,7 @@
                   <pic:spPr>
                     <a:xfrm>
                       <a:off x="0" y="0"/>
-                      <a:ext cx="4572000" cy="2219325"/>
+                      <a:ext cx="2918866" cy="3282788"/>
                     </a:xfrm>
                     <a:prstGeom prst="rect">
                       <a:avLst/>
@@ -5097,31 +4560,25 @@
         <w:rPr>
           <w:rFonts w:ascii="Times New Roman" w:hAnsi="Times New Roman" w:cs="Times New Roman"/>
         </w:rPr>
-        <w:t>5.</w:t>
-      </w:r>
-      <w:r>
-        <w:rPr>
-          <w:rFonts w:ascii="Times New Roman" w:hAnsi="Times New Roman" w:cs="Times New Roman"/>
-        </w:rPr>
-        <w:t>3</w:t>
-      </w:r>
-      <w:r>
-        <w:rPr>
-          <w:rFonts w:ascii="Times New Roman" w:hAnsi="Times New Roman" w:cs="Times New Roman"/>
-        </w:rPr>
-        <w:t>. Block diagram of the DAC interface for the TLV5616. See the</w:t>
-      </w:r>
-      <w:r>
-        <w:rPr>
-          <w:rFonts w:ascii="Times New Roman" w:hAnsi="Times New Roman" w:cs="Times New Roman"/>
-        </w:rPr>
-        <w:t xml:space="preserve"> datasheet </w:t>
-      </w:r>
-      <w:r>
-        <w:rPr>
-          <w:rFonts w:ascii="Times New Roman" w:hAnsi="Times New Roman" w:cs="Times New Roman"/>
-        </w:rPr>
-        <w:t>to find which pins connect to DIN, SCLK, and CS bar.</w:t>
+        <w:t>5.3</w:t>
+      </w:r>
+      <w:r>
+        <w:rPr>
+          <w:rFonts w:ascii="Times New Roman" w:hAnsi="Times New Roman" w:cs="Times New Roman"/>
+        </w:rPr>
+        <w:t xml:space="preserve">. Block diagram of the DAC interface for the </w:t>
+      </w:r>
+      <w:r>
+        <w:rPr>
+          <w:rFonts w:ascii="Times New Roman" w:hAnsi="Times New Roman" w:cs="Times New Roman"/>
+        </w:rPr>
+        <w:t>MCP4921</w:t>
+      </w:r>
+      <w:r>
+        <w:rPr>
+          <w:rFonts w:ascii="Times New Roman" w:hAnsi="Times New Roman" w:cs="Times New Roman"/>
+        </w:rPr>
+        <w:t xml:space="preserve">. </w:t>
       </w:r>
     </w:p>
     <w:p>
@@ -5141,106 +4598,105 @@
           <w:rFonts w:ascii="Times New Roman" w:eastAsia="Calibri" w:hAnsi="Times New Roman" w:cs="Times New Roman"/>
           <w:color w:val="000000" w:themeColor="text1"/>
         </w:rPr>
-        <w:t xml:space="preserve">Consider the </w:t>
-      </w:r>
-      <w:r>
-        <w:rPr>
-          <w:rFonts w:ascii="Times New Roman" w:eastAsia="Calibri" w:hAnsi="Times New Roman" w:cs="Times New Roman"/>
-          <w:color w:val="000000" w:themeColor="text1"/>
-        </w:rPr>
-        <w:t>v</w:t>
-      </w:r>
-      <w:r>
-        <w:rPr>
-          <w:rFonts w:ascii="Times New Roman" w:eastAsia="Calibri" w:hAnsi="Times New Roman" w:cs="Times New Roman"/>
-          <w:color w:val="000000" w:themeColor="text1"/>
-        </w:rPr>
-        <w:t>oltage reference required for this lab. As m</w:t>
-      </w:r>
-      <w:r>
-        <w:rPr>
-          <w:rFonts w:ascii="Times New Roman" w:hAnsi="Times New Roman" w:cs="Times New Roman"/>
-        </w:rPr>
-        <w:t xml:space="preserve">any DACs need a reference voltage, we must create one. </w:t>
-      </w:r>
-      <w:r>
-        <w:rPr>
-          <w:rFonts w:ascii="Times New Roman" w:hAnsi="Times New Roman" w:cs="Times New Roman"/>
-        </w:rPr>
-        <w:t xml:space="preserve">The LM4041C12ILP is a fixed shunt reference. </w:t>
-      </w:r>
-      <w:r>
-        <w:rPr>
-          <w:rFonts w:ascii="Times New Roman" w:hAnsi="Times New Roman" w:cs="Times New Roman"/>
-        </w:rPr>
-        <w:t xml:space="preserve">The </w:t>
-      </w:r>
-      <w:r>
-        <w:rPr>
-          <w:rFonts w:ascii="Times New Roman" w:hAnsi="Times New Roman" w:cs="Times New Roman"/>
-        </w:rPr>
-        <w:t xml:space="preserve">LM4041CILPR </w:t>
-      </w:r>
-      <w:r>
-        <w:rPr>
-          <w:rFonts w:ascii="Times New Roman" w:hAnsi="Times New Roman" w:cs="Times New Roman"/>
-        </w:rPr>
-        <w:t xml:space="preserve">is an adjustable shunt reference that can be used to create a variety of precise reference voltages. </w:t>
-      </w:r>
-      <w:r>
-        <w:rPr>
-          <w:rFonts w:ascii="Times New Roman" w:eastAsia="Calibri" w:hAnsi="Times New Roman" w:cs="Times New Roman"/>
-          <w:color w:val="000000" w:themeColor="text1"/>
-        </w:rPr>
-        <w:t>The</w:t>
-      </w:r>
-      <w:r>
-        <w:rPr>
-          <w:rFonts w:ascii="Times New Roman" w:eastAsia="Calibri" w:hAnsi="Times New Roman" w:cs="Times New Roman"/>
-          <w:color w:val="000000" w:themeColor="text1"/>
-        </w:rPr>
-        <w:t xml:space="preserve"> </w:t>
-      </w:r>
-      <w:r>
-        <w:rPr>
-          <w:rFonts w:ascii="Times New Roman" w:eastAsia="Calibri" w:hAnsi="Times New Roman" w:cs="Times New Roman"/>
-          <w:color w:val="000000" w:themeColor="text1"/>
-        </w:rPr>
-        <w:t>LM4041design.xlsx</w:t>
-      </w:r>
-      <w:r>
-        <w:rPr>
-          <w:rFonts w:ascii="Times New Roman" w:eastAsia="Calibri" w:hAnsi="Times New Roman" w:cs="Times New Roman"/>
-          <w:color w:val="000000" w:themeColor="text1"/>
-        </w:rPr>
-        <w:t xml:space="preserve"> </w:t>
-      </w:r>
-      <w:r>
-        <w:rPr>
-          <w:rFonts w:ascii="Times New Roman" w:eastAsia="Calibri" w:hAnsi="Times New Roman" w:cs="Times New Roman"/>
-          <w:color w:val="000000" w:themeColor="text1"/>
-        </w:rPr>
-        <w:t xml:space="preserve">excel sheet </w:t>
-      </w:r>
-      <w:r>
-        <w:rPr>
-          <w:rFonts w:ascii="Times New Roman" w:eastAsia="Calibri" w:hAnsi="Times New Roman" w:cs="Times New Roman"/>
-          <w:color w:val="000000" w:themeColor="text1"/>
-        </w:rPr>
-        <w:t xml:space="preserve">will help </w:t>
-      </w:r>
-      <w:r>
-        <w:rPr>
-          <w:rFonts w:ascii="Times New Roman" w:eastAsia="Calibri" w:hAnsi="Times New Roman" w:cs="Times New Roman"/>
-          <w:color w:val="000000" w:themeColor="text1"/>
-        </w:rPr>
-        <w:t xml:space="preserve">the design process. </w:t>
-      </w:r>
-      <w:r>
-        <w:rPr>
-          <w:rFonts w:ascii="Times New Roman" w:hAnsi="Times New Roman" w:cs="Times New Roman"/>
-        </w:rPr>
-        <w:t>Consider the following for your voltage reference circuit:</w:t>
+        <w:t xml:space="preserve">You must draw a rough draft of the circuit for this lab in KiCad. </w:t>
+      </w:r>
+      <w:r>
+        <w:rPr>
+          <w:rFonts w:ascii="Times New Roman" w:eastAsia="Calibri" w:hAnsi="Times New Roman" w:cs="Times New Roman"/>
+          <w:color w:val="000000" w:themeColor="text1"/>
+        </w:rPr>
+        <w:t xml:space="preserve">You will find the </w:t>
+      </w:r>
+      <w:r>
+        <w:rPr>
+          <w:rFonts w:ascii="Times New Roman" w:hAnsi="Times New Roman" w:cs="Times New Roman"/>
+        </w:rPr>
+        <w:t>MCP4921</w:t>
+      </w:r>
+      <w:r>
+        <w:rPr>
+          <w:rFonts w:ascii="Times New Roman" w:eastAsia="Calibri" w:hAnsi="Times New Roman" w:cs="Times New Roman"/>
+          <w:color w:val="000000" w:themeColor="text1"/>
+        </w:rPr>
+        <w:t xml:space="preserve">, </w:t>
+      </w:r>
+      <w:r>
+        <w:rPr>
+          <w:rFonts w:ascii="Times New Roman" w:eastAsia="Calibri" w:hAnsi="Times New Roman" w:cs="Times New Roman"/>
+          <w:color w:val="000000" w:themeColor="text1"/>
+        </w:rPr>
+        <w:t>LM4890</w:t>
+      </w:r>
+      <w:r>
+        <w:rPr>
+          <w:rFonts w:ascii="Times New Roman" w:eastAsia="Calibri" w:hAnsi="Times New Roman" w:cs="Times New Roman"/>
+          <w:color w:val="000000" w:themeColor="text1"/>
+        </w:rPr>
+        <w:t xml:space="preserve">, and </w:t>
+      </w:r>
+      <w:r>
+        <w:rPr>
+          <w:rFonts w:ascii="Times New Roman" w:hAnsi="Times New Roman" w:cs="Times New Roman"/>
+        </w:rPr>
+        <w:t xml:space="preserve">LM4041C12ILP </w:t>
+      </w:r>
+      <w:r>
+        <w:rPr>
+          <w:rFonts w:ascii="Times New Roman" w:eastAsia="Calibri" w:hAnsi="Times New Roman" w:cs="Times New Roman"/>
+          <w:color w:val="000000" w:themeColor="text1"/>
+        </w:rPr>
+        <w:t xml:space="preserve">symbol, footprint, and model files in the hardware folder, or on websites such as </w:t>
+      </w:r>
+      <w:r>
+        <w:rPr>
+          <w:rFonts w:ascii="Times New Roman" w:eastAsia="Calibri" w:hAnsi="Times New Roman" w:cs="Times New Roman"/>
+          <w:color w:val="000000" w:themeColor="text1"/>
+        </w:rPr>
+        <w:t>M</w:t>
+      </w:r>
+      <w:r>
+        <w:rPr>
+          <w:rFonts w:ascii="Times New Roman" w:eastAsia="Calibri" w:hAnsi="Times New Roman" w:cs="Times New Roman"/>
+          <w:color w:val="000000" w:themeColor="text1"/>
+        </w:rPr>
+        <w:t xml:space="preserve">ouser and </w:t>
+      </w:r>
+      <w:proofErr w:type="spellStart"/>
+      <w:r>
+        <w:rPr>
+          <w:rFonts w:ascii="Times New Roman" w:eastAsia="Calibri" w:hAnsi="Times New Roman" w:cs="Times New Roman"/>
+          <w:color w:val="000000" w:themeColor="text1"/>
+        </w:rPr>
+        <w:t>SnapEDA</w:t>
+      </w:r>
+      <w:proofErr w:type="spellEnd"/>
+      <w:r>
+        <w:rPr>
+          <w:rFonts w:ascii="Times New Roman" w:eastAsia="Calibri" w:hAnsi="Times New Roman" w:cs="Times New Roman"/>
+          <w:color w:val="000000" w:themeColor="text1"/>
+        </w:rPr>
+        <w:t xml:space="preserve">. To begin you should start by adding these parts to your schematic, then continue reading to see how to wire your circuit. </w:t>
+      </w:r>
+      <w:r>
+        <w:rPr>
+          <w:rFonts w:ascii="Times New Roman" w:eastAsia="Calibri" w:hAnsi="Times New Roman" w:cs="Times New Roman"/>
+          <w:color w:val="000000" w:themeColor="text1"/>
+        </w:rPr>
+        <w:t xml:space="preserve">Your schematic will </w:t>
+      </w:r>
+      <w:r>
+        <w:rPr>
+          <w:rFonts w:ascii="Times New Roman" w:eastAsia="Calibri" w:hAnsi="Times New Roman" w:cs="Times New Roman"/>
+          <w:color w:val="000000" w:themeColor="text1"/>
+        </w:rPr>
+        <w:t>i</w:t>
+      </w:r>
+      <w:r>
+        <w:rPr>
+          <w:rFonts w:ascii="Times New Roman" w:eastAsia="Calibri" w:hAnsi="Times New Roman" w:cs="Times New Roman"/>
+          <w:color w:val="000000" w:themeColor="text1"/>
+        </w:rPr>
+        <w:t>nclude:</w:t>
       </w:r>
     </w:p>
     <w:p>
@@ -5260,42 +4716,21 @@
           <w:rFonts w:ascii="Times New Roman" w:eastAsia="Calibri" w:hAnsi="Times New Roman" w:cs="Times New Roman"/>
           <w:color w:val="000000" w:themeColor="text1"/>
         </w:rPr>
-        <w:t xml:space="preserve">The reference voltage needed. </w:t>
-      </w:r>
-      <w:r>
-        <w:rPr>
-          <w:rFonts w:ascii="Times New Roman" w:eastAsia="Calibri" w:hAnsi="Times New Roman" w:cs="Times New Roman"/>
-          <w:color w:val="000000" w:themeColor="text1"/>
-        </w:rPr>
-        <w:t>Any fixed voltage from</w:t>
-      </w:r>
-      <w:r>
-        <w:rPr>
-          <w:rFonts w:ascii="Times New Roman" w:eastAsia="Calibri" w:hAnsi="Times New Roman" w:cs="Times New Roman"/>
-          <w:color w:val="000000" w:themeColor="text1"/>
-        </w:rPr>
-        <w:t xml:space="preserve"> </w:t>
-      </w:r>
-      <w:r>
-        <w:rPr>
-          <w:rFonts w:ascii="Times New Roman" w:eastAsia="Calibri" w:hAnsi="Times New Roman" w:cs="Times New Roman"/>
-          <w:color w:val="000000" w:themeColor="text1"/>
-        </w:rPr>
-        <w:t xml:space="preserve">1.20 to </w:t>
-      </w:r>
-      <w:r>
-        <w:rPr>
-          <w:rFonts w:ascii="Times New Roman" w:eastAsia="Calibri" w:hAnsi="Times New Roman" w:cs="Times New Roman"/>
-          <w:color w:val="000000" w:themeColor="text1"/>
-        </w:rPr>
-        <w:t xml:space="preserve">1.50V is </w:t>
-      </w:r>
-      <w:r>
-        <w:rPr>
-          <w:rFonts w:ascii="Times New Roman" w:eastAsia="Calibri" w:hAnsi="Times New Roman" w:cs="Times New Roman"/>
-          <w:color w:val="000000" w:themeColor="text1"/>
-        </w:rPr>
-        <w:t>ok</w:t>
+        <w:t>Bypass capacitors for ICs on their power pin(s) sized appropriately (i.e.</w:t>
+      </w:r>
+      <w:r>
+        <w:rPr>
+          <w:rFonts w:ascii="Times New Roman" w:eastAsia="Calibri" w:hAnsi="Times New Roman" w:cs="Times New Roman"/>
+          <w:color w:val="000000" w:themeColor="text1"/>
+        </w:rPr>
+        <w:t>,</w:t>
+      </w:r>
+      <w:r>
+        <w:rPr>
+          <w:rFonts w:ascii="Times New Roman" w:eastAsia="Calibri" w:hAnsi="Times New Roman" w:cs="Times New Roman"/>
+          <w:color w:val="000000" w:themeColor="text1"/>
+        </w:rPr>
+        <w:t xml:space="preserve"> 0.1uF)</w:t>
       </w:r>
     </w:p>
     <w:p>
@@ -5315,6 +4750,611 @@
           <w:rFonts w:ascii="Times New Roman" w:eastAsia="Calibri" w:hAnsi="Times New Roman" w:cs="Times New Roman"/>
           <w:color w:val="000000" w:themeColor="text1"/>
         </w:rPr>
+        <w:t>A DAC and its relevant SPI, reference, and output pins connected properly</w:t>
+      </w:r>
+    </w:p>
+    <w:p>
+      <w:pPr>
+        <w:pStyle w:val="ListParagraph"/>
+        <w:numPr>
+          <w:ilvl w:val="2"/>
+          <w:numId w:val="18"/>
+        </w:numPr>
+        <w:rPr>
+          <w:rFonts w:ascii="Times New Roman" w:eastAsia="Calibri" w:hAnsi="Times New Roman" w:cs="Times New Roman"/>
+          <w:color w:val="000000" w:themeColor="text1"/>
+        </w:rPr>
+      </w:pPr>
+      <w:r>
+        <w:rPr>
+          <w:rFonts w:ascii="Times New Roman" w:eastAsia="Calibri" w:hAnsi="Times New Roman" w:cs="Times New Roman"/>
+          <w:color w:val="000000" w:themeColor="text1"/>
+        </w:rPr>
+        <w:t>A voltage reference circuit and its configuration resistors</w:t>
+      </w:r>
+    </w:p>
+    <w:p>
+      <w:pPr>
+        <w:pStyle w:val="ListParagraph"/>
+        <w:numPr>
+          <w:ilvl w:val="2"/>
+          <w:numId w:val="18"/>
+        </w:numPr>
+        <w:rPr>
+          <w:rFonts w:ascii="Times New Roman" w:eastAsia="Calibri" w:hAnsi="Times New Roman" w:cs="Times New Roman"/>
+          <w:color w:val="000000" w:themeColor="text1"/>
+        </w:rPr>
+      </w:pPr>
+      <w:r>
+        <w:rPr>
+          <w:rFonts w:ascii="Times New Roman" w:eastAsia="Calibri" w:hAnsi="Times New Roman" w:cs="Times New Roman"/>
+          <w:color w:val="000000" w:themeColor="text1"/>
+        </w:rPr>
+        <w:t>An audio amplifier and its required passive components</w:t>
+      </w:r>
+      <w:r>
+        <w:rPr>
+          <w:rFonts w:ascii="Times New Roman" w:eastAsia="Calibri" w:hAnsi="Times New Roman" w:cs="Times New Roman"/>
+          <w:color w:val="000000" w:themeColor="text1"/>
+        </w:rPr>
+        <w:t xml:space="preserve"> powered by VBUS</w:t>
+      </w:r>
+    </w:p>
+    <w:p>
+      <w:pPr>
+        <w:pStyle w:val="ListParagraph"/>
+        <w:numPr>
+          <w:ilvl w:val="2"/>
+          <w:numId w:val="18"/>
+        </w:numPr>
+        <w:rPr>
+          <w:rFonts w:ascii="Times New Roman" w:eastAsia="Calibri" w:hAnsi="Times New Roman" w:cs="Times New Roman"/>
+          <w:color w:val="000000" w:themeColor="text1"/>
+        </w:rPr>
+      </w:pPr>
+      <w:r>
+        <w:rPr>
+          <w:rFonts w:ascii="Times New Roman" w:eastAsia="Calibri" w:hAnsi="Times New Roman" w:cs="Times New Roman"/>
+          <w:color w:val="000000" w:themeColor="text1"/>
+        </w:rPr>
+        <w:t>Two or more buttons as required.</w:t>
+      </w:r>
+    </w:p>
+    <w:p>
+      <w:pPr>
+        <w:pStyle w:val="ListParagraph"/>
+        <w:numPr>
+          <w:ilvl w:val="2"/>
+          <w:numId w:val="18"/>
+        </w:numPr>
+        <w:rPr>
+          <w:rFonts w:ascii="Times New Roman" w:eastAsia="Calibri" w:hAnsi="Times New Roman" w:cs="Times New Roman"/>
+          <w:color w:val="000000" w:themeColor="text1"/>
+        </w:rPr>
+      </w:pPr>
+      <w:r>
+        <w:rPr>
+          <w:rFonts w:ascii="Times New Roman" w:eastAsia="Calibri" w:hAnsi="Times New Roman" w:cs="Times New Roman"/>
+          <w:color w:val="000000" w:themeColor="text1"/>
+        </w:rPr>
+        <w:t xml:space="preserve">Relevant signal names and pin numbers. </w:t>
+      </w:r>
+    </w:p>
+    <w:p>
+      <w:pPr>
+        <w:pStyle w:val="ListParagraph"/>
+        <w:numPr>
+          <w:ilvl w:val="0"/>
+          <w:numId w:val="18"/>
+        </w:numPr>
+        <w:rPr>
+          <w:rFonts w:ascii="Times New Roman" w:eastAsia="Calibri" w:hAnsi="Times New Roman" w:cs="Times New Roman"/>
+          <w:color w:val="000000" w:themeColor="text1"/>
+        </w:rPr>
+      </w:pPr>
+      <w:r>
+        <w:rPr>
+          <w:rFonts w:ascii="Times New Roman" w:eastAsia="Calibri" w:hAnsi="Times New Roman" w:cs="Times New Roman"/>
+          <w:color w:val="000000" w:themeColor="text1"/>
+        </w:rPr>
+        <w:t>Hardware Setup</w:t>
+      </w:r>
+    </w:p>
+    <w:p>
+      <w:pPr>
+        <w:pStyle w:val="ListParagraph"/>
+        <w:numPr>
+          <w:ilvl w:val="1"/>
+          <w:numId w:val="18"/>
+        </w:numPr>
+        <w:rPr>
+          <w:rFonts w:ascii="Times New Roman" w:eastAsia="Calibri" w:hAnsi="Times New Roman" w:cs="Times New Roman"/>
+          <w:color w:val="000000" w:themeColor="text1"/>
+        </w:rPr>
+      </w:pPr>
+      <w:r>
+        <w:rPr>
+          <w:rFonts w:ascii="Times New Roman" w:hAnsi="Times New Roman" w:cs="Times New Roman"/>
+          <w:color w:val="000000"/>
+        </w:rPr>
+        <w:t>Be prepared to show your TA that you can assemble the hardware for this lab; Before leaving prep, you must collect all hardware needed to perform this lab as listed below:</w:t>
+      </w:r>
+    </w:p>
+    <w:p>
+      <w:pPr>
+        <w:pStyle w:val="ListParagraph"/>
+        <w:numPr>
+          <w:ilvl w:val="2"/>
+          <w:numId w:val="18"/>
+        </w:numPr>
+        <w:rPr>
+          <w:rFonts w:ascii="Times New Roman" w:eastAsia="Calibri" w:hAnsi="Times New Roman" w:cs="Times New Roman"/>
+          <w:color w:val="000000" w:themeColor="text1"/>
+        </w:rPr>
+      </w:pPr>
+      <w:r>
+        <w:rPr>
+          <w:rFonts w:ascii="Times New Roman" w:eastAsia="Calibri" w:hAnsi="Times New Roman" w:cs="Times New Roman"/>
+          <w:color w:val="000000" w:themeColor="text1"/>
+        </w:rPr>
+        <w:t xml:space="preserve">A DAC, such as the </w:t>
+      </w:r>
+      <w:r>
+        <w:rPr>
+          <w:rFonts w:ascii="Times New Roman" w:hAnsi="Times New Roman" w:cs="Times New Roman"/>
+        </w:rPr>
+        <w:t>MCP4921</w:t>
+      </w:r>
+    </w:p>
+    <w:p>
+      <w:pPr>
+        <w:pStyle w:val="ListParagraph"/>
+        <w:numPr>
+          <w:ilvl w:val="2"/>
+          <w:numId w:val="18"/>
+        </w:numPr>
+        <w:rPr>
+          <w:rFonts w:ascii="Times New Roman" w:eastAsia="Calibri" w:hAnsi="Times New Roman" w:cs="Times New Roman"/>
+          <w:color w:val="000000" w:themeColor="text1"/>
+        </w:rPr>
+      </w:pPr>
+      <w:r>
+        <w:rPr>
+          <w:rFonts w:ascii="Times New Roman" w:eastAsia="Calibri" w:hAnsi="Times New Roman" w:cs="Times New Roman"/>
+          <w:color w:val="000000" w:themeColor="text1"/>
+        </w:rPr>
+        <w:t xml:space="preserve">A </w:t>
+      </w:r>
+      <w:r>
+        <w:rPr>
+          <w:rFonts w:ascii="Times New Roman" w:eastAsia="Calibri" w:hAnsi="Times New Roman" w:cs="Times New Roman"/>
+          <w:color w:val="000000" w:themeColor="text1"/>
+        </w:rPr>
+        <w:t>v</w:t>
+      </w:r>
+      <w:r>
+        <w:rPr>
+          <w:rFonts w:ascii="Times New Roman" w:eastAsia="Calibri" w:hAnsi="Times New Roman" w:cs="Times New Roman"/>
+          <w:color w:val="000000" w:themeColor="text1"/>
+        </w:rPr>
+        <w:t xml:space="preserve">oltage </w:t>
+      </w:r>
+      <w:r>
+        <w:rPr>
+          <w:rFonts w:ascii="Times New Roman" w:eastAsia="Calibri" w:hAnsi="Times New Roman" w:cs="Times New Roman"/>
+          <w:color w:val="000000" w:themeColor="text1"/>
+        </w:rPr>
+        <w:t>r</w:t>
+      </w:r>
+      <w:r>
+        <w:rPr>
+          <w:rFonts w:ascii="Times New Roman" w:eastAsia="Calibri" w:hAnsi="Times New Roman" w:cs="Times New Roman"/>
+          <w:color w:val="000000" w:themeColor="text1"/>
+        </w:rPr>
+        <w:t xml:space="preserve">eference, such as the </w:t>
+      </w:r>
+      <w:r>
+        <w:rPr>
+          <w:rFonts w:ascii="Times New Roman" w:hAnsi="Times New Roman" w:cs="Times New Roman"/>
+        </w:rPr>
+        <w:t>LM4041C12ILP</w:t>
+      </w:r>
+    </w:p>
+    <w:p>
+      <w:pPr>
+        <w:pStyle w:val="ListParagraph"/>
+        <w:numPr>
+          <w:ilvl w:val="2"/>
+          <w:numId w:val="18"/>
+        </w:numPr>
+        <w:rPr>
+          <w:rFonts w:ascii="Times New Roman" w:eastAsia="Calibri" w:hAnsi="Times New Roman" w:cs="Times New Roman"/>
+          <w:color w:val="000000" w:themeColor="text1"/>
+        </w:rPr>
+      </w:pPr>
+      <w:r>
+        <w:rPr>
+          <w:rFonts w:ascii="Times New Roman" w:eastAsia="Calibri" w:hAnsi="Times New Roman" w:cs="Times New Roman"/>
+          <w:color w:val="000000" w:themeColor="text1"/>
+        </w:rPr>
+        <w:t>A</w:t>
+      </w:r>
+      <w:r>
+        <w:rPr>
+          <w:rFonts w:ascii="Times New Roman" w:eastAsia="Calibri" w:hAnsi="Times New Roman" w:cs="Times New Roman"/>
+          <w:color w:val="000000" w:themeColor="text1"/>
+        </w:rPr>
+        <w:t xml:space="preserve"> class AB</w:t>
+      </w:r>
+      <w:r>
+        <w:rPr>
+          <w:rFonts w:ascii="Times New Roman" w:eastAsia="Calibri" w:hAnsi="Times New Roman" w:cs="Times New Roman"/>
+          <w:color w:val="000000" w:themeColor="text1"/>
+        </w:rPr>
+        <w:t xml:space="preserve"> </w:t>
+      </w:r>
+      <w:r>
+        <w:rPr>
+          <w:rFonts w:ascii="Times New Roman" w:eastAsia="Calibri" w:hAnsi="Times New Roman" w:cs="Times New Roman"/>
+          <w:color w:val="000000" w:themeColor="text1"/>
+        </w:rPr>
+        <w:t xml:space="preserve">LM4890 </w:t>
+      </w:r>
+      <w:r>
+        <w:rPr>
+          <w:rFonts w:ascii="Times New Roman" w:eastAsia="Calibri" w:hAnsi="Times New Roman" w:cs="Times New Roman"/>
+          <w:color w:val="000000" w:themeColor="text1"/>
+        </w:rPr>
+        <w:t>a</w:t>
+      </w:r>
+      <w:r>
+        <w:rPr>
+          <w:rFonts w:ascii="Times New Roman" w:eastAsia="Calibri" w:hAnsi="Times New Roman" w:cs="Times New Roman"/>
+          <w:color w:val="000000" w:themeColor="text1"/>
+        </w:rPr>
+        <w:t xml:space="preserve">udio </w:t>
+      </w:r>
+      <w:r>
+        <w:rPr>
+          <w:rFonts w:ascii="Times New Roman" w:eastAsia="Calibri" w:hAnsi="Times New Roman" w:cs="Times New Roman"/>
+          <w:color w:val="000000" w:themeColor="text1"/>
+        </w:rPr>
+        <w:t>a</w:t>
+      </w:r>
+      <w:r>
+        <w:rPr>
+          <w:rFonts w:ascii="Times New Roman" w:eastAsia="Calibri" w:hAnsi="Times New Roman" w:cs="Times New Roman"/>
+          <w:color w:val="000000" w:themeColor="text1"/>
+        </w:rPr>
+        <w:t>mplifier</w:t>
+      </w:r>
+      <w:r>
+        <w:rPr>
+          <w:rFonts w:ascii="Times New Roman" w:eastAsia="Calibri" w:hAnsi="Times New Roman" w:cs="Times New Roman"/>
+          <w:color w:val="000000" w:themeColor="text1"/>
+        </w:rPr>
+        <w:t>, SOIC to DIP breakout, 8 male-male pins</w:t>
+      </w:r>
+    </w:p>
+    <w:p>
+      <w:pPr>
+        <w:pStyle w:val="ListParagraph"/>
+        <w:numPr>
+          <w:ilvl w:val="2"/>
+          <w:numId w:val="18"/>
+        </w:numPr>
+        <w:rPr>
+          <w:rFonts w:ascii="Times New Roman" w:eastAsia="Calibri" w:hAnsi="Times New Roman" w:cs="Times New Roman"/>
+          <w:color w:val="000000" w:themeColor="text1"/>
+        </w:rPr>
+      </w:pPr>
+      <w:r>
+        <w:rPr>
+          <w:rFonts w:ascii="Times New Roman" w:eastAsia="Calibri" w:hAnsi="Times New Roman" w:cs="Times New Roman"/>
+          <w:color w:val="000000" w:themeColor="text1"/>
+        </w:rPr>
+        <w:t>A speaker, either 8 or 32 Ohms</w:t>
+      </w:r>
+    </w:p>
+    <w:p>
+      <w:pPr>
+        <w:pStyle w:val="ListParagraph"/>
+        <w:numPr>
+          <w:ilvl w:val="2"/>
+          <w:numId w:val="18"/>
+        </w:numPr>
+        <w:rPr>
+          <w:rFonts w:ascii="Times New Roman" w:eastAsia="Calibri" w:hAnsi="Times New Roman" w:cs="Times New Roman"/>
+          <w:color w:val="000000" w:themeColor="text1"/>
+        </w:rPr>
+      </w:pPr>
+      <w:r>
+        <w:rPr>
+          <w:rFonts w:ascii="Times New Roman" w:eastAsia="Calibri" w:hAnsi="Times New Roman" w:cs="Times New Roman"/>
+          <w:color w:val="000000" w:themeColor="text1"/>
+        </w:rPr>
+        <w:t>Additional resistors, capacitors, and jumpers</w:t>
+      </w:r>
+    </w:p>
+    <w:p>
+      <w:pPr>
+        <w:pStyle w:val="ListParagraph"/>
+        <w:numPr>
+          <w:ilvl w:val="2"/>
+          <w:numId w:val="18"/>
+        </w:numPr>
+        <w:rPr>
+          <w:rFonts w:ascii="Times New Roman" w:eastAsia="Calibri" w:hAnsi="Times New Roman" w:cs="Times New Roman"/>
+          <w:color w:val="000000" w:themeColor="text1"/>
+        </w:rPr>
+      </w:pPr>
+      <w:r>
+        <w:rPr>
+          <w:rFonts w:ascii="Times New Roman" w:eastAsia="Calibri" w:hAnsi="Times New Roman" w:cs="Times New Roman"/>
+          <w:color w:val="000000" w:themeColor="text1"/>
+        </w:rPr>
+        <w:t xml:space="preserve">(Optional) A </w:t>
+      </w:r>
+      <w:r>
+        <w:rPr>
+          <w:rFonts w:ascii="Times New Roman" w:eastAsia="Calibri" w:hAnsi="Times New Roman" w:cs="Times New Roman"/>
+          <w:color w:val="000000" w:themeColor="text1"/>
+        </w:rPr>
+        <w:t>P</w:t>
+      </w:r>
+      <w:r>
+        <w:rPr>
+          <w:rFonts w:ascii="Times New Roman" w:eastAsia="Calibri" w:hAnsi="Times New Roman" w:cs="Times New Roman"/>
+          <w:color w:val="000000" w:themeColor="text1"/>
+        </w:rPr>
+        <w:t>op-</w:t>
+      </w:r>
+      <w:r>
+        <w:rPr>
+          <w:rFonts w:ascii="Times New Roman" w:eastAsia="Calibri" w:hAnsi="Times New Roman" w:cs="Times New Roman"/>
+          <w:color w:val="000000" w:themeColor="text1"/>
+        </w:rPr>
+        <w:t>T</w:t>
+      </w:r>
+      <w:r>
+        <w:rPr>
+          <w:rFonts w:ascii="Times New Roman" w:eastAsia="Calibri" w:hAnsi="Times New Roman" w:cs="Times New Roman"/>
+          <w:color w:val="000000" w:themeColor="text1"/>
+        </w:rPr>
+        <w:t>art</w:t>
+      </w:r>
+      <w:r>
+        <w:rPr>
+          <w:rFonts w:ascii="Times New Roman" w:eastAsia="Calibri" w:hAnsi="Times New Roman" w:cs="Times New Roman"/>
+          <w:color w:val="000000" w:themeColor="text1"/>
+        </w:rPr>
+        <w:t>s</w:t>
+      </w:r>
+      <w:r>
+        <w:rPr>
+          <w:rFonts w:ascii="Times New Roman" w:eastAsia="Calibri" w:hAnsi="Times New Roman" w:cs="Times New Roman"/>
+          <w:color w:val="000000" w:themeColor="text1"/>
+        </w:rPr>
+        <w:t xml:space="preserve"> or small cereal box </w:t>
+      </w:r>
+      <w:r>
+        <w:rPr>
+          <w:rFonts w:ascii="Times New Roman" w:eastAsia="Calibri" w:hAnsi="Times New Roman" w:cs="Times New Roman"/>
+          <w:color w:val="000000" w:themeColor="text1"/>
+        </w:rPr>
+        <w:t xml:space="preserve">into which </w:t>
+      </w:r>
+      <w:r>
+        <w:rPr>
+          <w:rFonts w:ascii="Times New Roman" w:eastAsia="Calibri" w:hAnsi="Times New Roman" w:cs="Times New Roman"/>
+          <w:color w:val="000000" w:themeColor="text1"/>
+        </w:rPr>
+        <w:t xml:space="preserve">to mount the speaker </w:t>
+      </w:r>
+    </w:p>
+    <w:p>
+      <w:pPr>
+        <w:pStyle w:val="ListParagraph"/>
+        <w:numPr>
+          <w:ilvl w:val="1"/>
+          <w:numId w:val="18"/>
+        </w:numPr>
+        <w:rPr>
+          <w:rFonts w:ascii="Times New Roman" w:eastAsia="Calibri" w:hAnsi="Times New Roman" w:cs="Times New Roman"/>
+          <w:color w:val="000000" w:themeColor="text1"/>
+        </w:rPr>
+      </w:pPr>
+      <w:r>
+        <w:rPr>
+          <w:rFonts w:ascii="Times New Roman" w:eastAsia="Calibri" w:hAnsi="Times New Roman" w:cs="Times New Roman"/>
+          <w:color w:val="000000" w:themeColor="text1"/>
+        </w:rPr>
+        <w:t xml:space="preserve">Consider the </w:t>
+      </w:r>
+      <w:r>
+        <w:rPr>
+          <w:rFonts w:ascii="Times New Roman" w:eastAsia="Calibri" w:hAnsi="Times New Roman" w:cs="Times New Roman"/>
+          <w:color w:val="000000" w:themeColor="text1"/>
+        </w:rPr>
+        <w:t>v</w:t>
+      </w:r>
+      <w:r>
+        <w:rPr>
+          <w:rFonts w:ascii="Times New Roman" w:eastAsia="Calibri" w:hAnsi="Times New Roman" w:cs="Times New Roman"/>
+          <w:color w:val="000000" w:themeColor="text1"/>
+        </w:rPr>
+        <w:t>oltage reference required for this lab. As m</w:t>
+      </w:r>
+      <w:r>
+        <w:rPr>
+          <w:rFonts w:ascii="Times New Roman" w:hAnsi="Times New Roman" w:cs="Times New Roman"/>
+        </w:rPr>
+        <w:t xml:space="preserve">any DACs need a reference voltage, we must create one. </w:t>
+      </w:r>
+      <w:r>
+        <w:rPr>
+          <w:rFonts w:ascii="Times New Roman" w:hAnsi="Times New Roman" w:cs="Times New Roman"/>
+        </w:rPr>
+        <w:t xml:space="preserve">The LM4041C12ILP is a fixed shunt reference. </w:t>
+      </w:r>
+      <w:r>
+        <w:rPr>
+          <w:rFonts w:ascii="Times New Roman" w:hAnsi="Times New Roman" w:cs="Times New Roman"/>
+        </w:rPr>
+        <w:t xml:space="preserve">The </w:t>
+      </w:r>
+      <w:r>
+        <w:rPr>
+          <w:rFonts w:ascii="Times New Roman" w:hAnsi="Times New Roman" w:cs="Times New Roman"/>
+        </w:rPr>
+        <w:t xml:space="preserve">LM4041CILPR </w:t>
+      </w:r>
+      <w:r>
+        <w:rPr>
+          <w:rFonts w:ascii="Times New Roman" w:hAnsi="Times New Roman" w:cs="Times New Roman"/>
+        </w:rPr>
+        <w:t xml:space="preserve">is an adjustable shunt reference that can be used to create a variety of precise reference voltages. </w:t>
+      </w:r>
+      <w:r>
+        <w:rPr>
+          <w:rFonts w:ascii="Times New Roman" w:eastAsia="Calibri" w:hAnsi="Times New Roman" w:cs="Times New Roman"/>
+          <w:color w:val="000000" w:themeColor="text1"/>
+        </w:rPr>
+        <w:t>The</w:t>
+      </w:r>
+      <w:r>
+        <w:rPr>
+          <w:rFonts w:ascii="Times New Roman" w:eastAsia="Calibri" w:hAnsi="Times New Roman" w:cs="Times New Roman"/>
+          <w:color w:val="000000" w:themeColor="text1"/>
+        </w:rPr>
+        <w:t xml:space="preserve"> </w:t>
+      </w:r>
+      <w:r>
+        <w:rPr>
+          <w:rFonts w:ascii="Times New Roman" w:eastAsia="Calibri" w:hAnsi="Times New Roman" w:cs="Times New Roman"/>
+          <w:color w:val="000000" w:themeColor="text1"/>
+        </w:rPr>
+        <w:t>LM4041design.xlsx</w:t>
+      </w:r>
+      <w:r>
+        <w:rPr>
+          <w:rFonts w:ascii="Times New Roman" w:eastAsia="Calibri" w:hAnsi="Times New Roman" w:cs="Times New Roman"/>
+          <w:color w:val="000000" w:themeColor="text1"/>
+        </w:rPr>
+        <w:t xml:space="preserve"> </w:t>
+      </w:r>
+      <w:r>
+        <w:rPr>
+          <w:rFonts w:ascii="Times New Roman" w:eastAsia="Calibri" w:hAnsi="Times New Roman" w:cs="Times New Roman"/>
+          <w:color w:val="000000" w:themeColor="text1"/>
+        </w:rPr>
+        <w:t xml:space="preserve">excel sheet </w:t>
+      </w:r>
+      <w:r>
+        <w:rPr>
+          <w:rFonts w:ascii="Times New Roman" w:eastAsia="Calibri" w:hAnsi="Times New Roman" w:cs="Times New Roman"/>
+          <w:color w:val="000000" w:themeColor="text1"/>
+        </w:rPr>
+        <w:t xml:space="preserve">will help </w:t>
+      </w:r>
+      <w:r>
+        <w:rPr>
+          <w:rFonts w:ascii="Times New Roman" w:eastAsia="Calibri" w:hAnsi="Times New Roman" w:cs="Times New Roman"/>
+          <w:color w:val="000000" w:themeColor="text1"/>
+        </w:rPr>
+        <w:t xml:space="preserve">the design process. </w:t>
+      </w:r>
+      <w:r>
+        <w:rPr>
+          <w:rFonts w:ascii="Times New Roman" w:hAnsi="Times New Roman" w:cs="Times New Roman"/>
+        </w:rPr>
+        <w:t>Consider the following for your voltage reference circuit:</w:t>
+      </w:r>
+    </w:p>
+    <w:p>
+      <w:pPr>
+        <w:pStyle w:val="ListParagraph"/>
+        <w:numPr>
+          <w:ilvl w:val="2"/>
+          <w:numId w:val="18"/>
+        </w:numPr>
+        <w:rPr>
+          <w:rFonts w:ascii="Times New Roman" w:eastAsia="Calibri" w:hAnsi="Times New Roman" w:cs="Times New Roman"/>
+          <w:color w:val="000000" w:themeColor="text1"/>
+        </w:rPr>
+      </w:pPr>
+      <w:r>
+        <w:rPr>
+          <w:rFonts w:ascii="Times New Roman" w:eastAsia="Calibri" w:hAnsi="Times New Roman" w:cs="Times New Roman"/>
+          <w:color w:val="000000" w:themeColor="text1"/>
+        </w:rPr>
+        <w:lastRenderedPageBreak/>
+        <w:t xml:space="preserve">The reference voltage needed. </w:t>
+      </w:r>
+      <w:r>
+        <w:rPr>
+          <w:rFonts w:ascii="Times New Roman" w:eastAsia="Calibri" w:hAnsi="Times New Roman" w:cs="Times New Roman"/>
+          <w:color w:val="000000" w:themeColor="text1"/>
+        </w:rPr>
+        <w:t xml:space="preserve">The </w:t>
+      </w:r>
+      <w:r>
+        <w:rPr>
+          <w:rFonts w:ascii="Times New Roman" w:hAnsi="Times New Roman" w:cs="Times New Roman"/>
+        </w:rPr>
+        <w:t>1.</w:t>
+      </w:r>
+      <w:r>
+        <w:rPr>
+          <w:rFonts w:ascii="Times New Roman" w:hAnsi="Times New Roman" w:cs="Times New Roman"/>
+        </w:rPr>
+        <w:t>255</w:t>
+      </w:r>
+      <w:r>
+        <w:rPr>
+          <w:rFonts w:ascii="Times New Roman" w:hAnsi="Times New Roman" w:cs="Times New Roman"/>
+        </w:rPr>
+        <w:t>V</w:t>
+      </w:r>
+      <w:r>
+        <w:rPr>
+          <w:rFonts w:ascii="Times New Roman" w:eastAsia="Calibri" w:hAnsi="Times New Roman" w:cs="Times New Roman"/>
+          <w:color w:val="000000" w:themeColor="text1"/>
+        </w:rPr>
+        <w:t xml:space="preserve"> fixed voltage </w:t>
+      </w:r>
+      <w:r>
+        <w:rPr>
+          <w:rFonts w:ascii="Times New Roman" w:eastAsia="Calibri" w:hAnsi="Times New Roman" w:cs="Times New Roman"/>
+          <w:color w:val="000000" w:themeColor="text1"/>
+        </w:rPr>
+        <w:t xml:space="preserve">is </w:t>
+      </w:r>
+      <w:r>
+        <w:rPr>
+          <w:rFonts w:ascii="Times New Roman" w:eastAsia="Calibri" w:hAnsi="Times New Roman" w:cs="Times New Roman"/>
+          <w:color w:val="000000" w:themeColor="text1"/>
+        </w:rPr>
+        <w:t>ok</w:t>
+      </w:r>
+    </w:p>
+    <w:p>
+      <w:pPr>
+        <w:pStyle w:val="ListParagraph"/>
+        <w:numPr>
+          <w:ilvl w:val="2"/>
+          <w:numId w:val="18"/>
+        </w:numPr>
+        <w:rPr>
+          <w:rFonts w:ascii="Times New Roman" w:eastAsia="Calibri" w:hAnsi="Times New Roman" w:cs="Times New Roman"/>
+          <w:color w:val="000000" w:themeColor="text1"/>
+        </w:rPr>
+      </w:pPr>
+      <w:r>
+        <w:rPr>
+          <w:rFonts w:ascii="Times New Roman" w:eastAsia="Calibri" w:hAnsi="Times New Roman" w:cs="Times New Roman"/>
+          <w:color w:val="000000" w:themeColor="text1"/>
+        </w:rPr>
         <w:t>The maximum current draw of devices requiring the reference voltage</w:t>
       </w:r>
     </w:p>
@@ -5341,7 +5381,102 @@
         <w:rPr>
           <w:rFonts w:ascii="Times New Roman" w:hAnsi="Times New Roman" w:cs="Times New Roman"/>
         </w:rPr>
-        <w:t>Look up in the TLV5616 data sheet to find how much current the DAC needs on its REF input. In the data sheet you will find the input impedance Rin of the REF pin. This Rin can be used to calculate the load current IL = 1.5V / Rin.</w:t>
+        <w:t xml:space="preserve">Look up in the </w:t>
+      </w:r>
+      <w:r>
+        <w:rPr>
+          <w:rFonts w:ascii="Times New Roman" w:hAnsi="Times New Roman" w:cs="Times New Roman"/>
+        </w:rPr>
+        <w:t xml:space="preserve">MCP4921 </w:t>
+      </w:r>
+      <w:r>
+        <w:rPr>
+          <w:rFonts w:ascii="Times New Roman" w:hAnsi="Times New Roman" w:cs="Times New Roman"/>
+        </w:rPr>
+        <w:t>data sheet to find how much current the DAC needs on its REF input. In the data sheet you will find the input impedance R</w:t>
+      </w:r>
+      <w:r>
+        <w:rPr>
+          <w:rFonts w:ascii="Times New Roman" w:hAnsi="Times New Roman" w:cs="Times New Roman"/>
+          <w:vertAlign w:val="subscript"/>
+        </w:rPr>
+        <w:t>VREF</w:t>
+      </w:r>
+      <w:r>
+        <w:rPr>
+          <w:rFonts w:ascii="Times New Roman" w:hAnsi="Times New Roman" w:cs="Times New Roman"/>
+        </w:rPr>
+        <w:t xml:space="preserve"> of the REF pin. This </w:t>
+      </w:r>
+      <w:r>
+        <w:rPr>
+          <w:rFonts w:ascii="Times New Roman" w:hAnsi="Times New Roman" w:cs="Times New Roman"/>
+        </w:rPr>
+        <w:t>R</w:t>
+      </w:r>
+      <w:r>
+        <w:rPr>
+          <w:rFonts w:ascii="Times New Roman" w:hAnsi="Times New Roman" w:cs="Times New Roman"/>
+          <w:vertAlign w:val="subscript"/>
+        </w:rPr>
+        <w:t>VREF</w:t>
+      </w:r>
+      <w:r>
+        <w:rPr>
+          <w:rFonts w:ascii="Times New Roman" w:hAnsi="Times New Roman" w:cs="Times New Roman"/>
+        </w:rPr>
+        <w:t xml:space="preserve"> </w:t>
+      </w:r>
+      <w:r>
+        <w:rPr>
+          <w:rFonts w:ascii="Times New Roman" w:hAnsi="Times New Roman" w:cs="Times New Roman"/>
+        </w:rPr>
+        <w:t xml:space="preserve">can be used to calculate the </w:t>
+      </w:r>
+      <w:proofErr w:type="gramStart"/>
+      <w:r>
+        <w:rPr>
+          <w:rFonts w:ascii="Times New Roman" w:hAnsi="Times New Roman" w:cs="Times New Roman"/>
+        </w:rPr>
+        <w:t>load current</w:t>
+      </w:r>
+      <w:proofErr w:type="gramEnd"/>
+      <w:r>
+        <w:rPr>
+          <w:rFonts w:ascii="Times New Roman" w:hAnsi="Times New Roman" w:cs="Times New Roman"/>
+        </w:rPr>
+        <w:t xml:space="preserve"> IL = 1.</w:t>
+      </w:r>
+      <w:r>
+        <w:rPr>
+          <w:rFonts w:ascii="Times New Roman" w:hAnsi="Times New Roman" w:cs="Times New Roman"/>
+        </w:rPr>
+        <w:t>255</w:t>
+      </w:r>
+      <w:r>
+        <w:rPr>
+          <w:rFonts w:ascii="Times New Roman" w:hAnsi="Times New Roman" w:cs="Times New Roman"/>
+        </w:rPr>
+        <w:t xml:space="preserve">V / </w:t>
+      </w:r>
+      <w:r>
+        <w:rPr>
+          <w:rFonts w:ascii="Times New Roman" w:hAnsi="Times New Roman" w:cs="Times New Roman"/>
+        </w:rPr>
+        <w:t>R</w:t>
+      </w:r>
+      <w:r>
+        <w:rPr>
+          <w:rFonts w:ascii="Times New Roman" w:hAnsi="Times New Roman" w:cs="Times New Roman"/>
+          <w:vertAlign w:val="subscript"/>
+        </w:rPr>
+        <w:t>VREF</w:t>
+      </w:r>
+      <w:r>
+        <w:rPr>
+          <w:rFonts w:ascii="Times New Roman" w:hAnsi="Times New Roman" w:cs="Times New Roman"/>
+        </w:rPr>
+        <w:t>.</w:t>
       </w:r>
     </w:p>
     <w:p>
@@ -5361,7 +5496,6 @@
           <w:rFonts w:ascii="Times New Roman" w:eastAsia="Calibri" w:hAnsi="Times New Roman" w:cs="Times New Roman"/>
           <w:color w:val="000000" w:themeColor="text1"/>
         </w:rPr>
-        <w:lastRenderedPageBreak/>
         <w:t>The power source for the LM4041C</w:t>
       </w:r>
       <w:r>
@@ -5590,7 +5724,7 @@
                     </pic:cNvPicPr>
                   </pic:nvPicPr>
                   <pic:blipFill>
-                    <a:blip r:embed="rId24">
+                    <a:blip r:embed="rId19">
                       <a:extLst>
                         <a:ext uri="{28A0092B-C50C-407E-A947-70E740481C1C}">
                           <a14:useLocalDpi xmlns:a14="http://schemas.microsoft.com/office/drawing/2010/main" val="0"/>
@@ -6138,6 +6272,7 @@
         <w:rPr>
           <w:rFonts w:ascii="Times New Roman" w:hAnsi="Times New Roman" w:cs="Times New Roman"/>
         </w:rPr>
+        <w:lastRenderedPageBreak/>
         <w:t xml:space="preserve">The </w:t>
       </w:r>
       <w:r>
@@ -6229,7 +6364,6 @@
           <w:rFonts w:ascii="Times New Roman" w:hAnsi="Times New Roman" w:cs="Times New Roman"/>
           <w:noProof/>
         </w:rPr>
-        <w:lastRenderedPageBreak/>
         <w:drawing>
           <wp:inline distT="0" distB="0" distL="0" distR="0" wp14:anchorId="4468588E" wp14:editId="6468C0C6">
             <wp:extent cx="5176520" cy="4150360"/>
@@ -6248,7 +6382,7 @@
                     </pic:cNvPicPr>
                   </pic:nvPicPr>
                   <pic:blipFill>
-                    <a:blip r:embed="rId25">
+                    <a:blip r:embed="rId20">
                       <a:extLst>
                         <a:ext uri="{28A0092B-C50C-407E-A947-70E740481C1C}">
                           <a14:useLocalDpi xmlns:a14="http://schemas.microsoft.com/office/drawing/2010/main" val="0"/>
@@ -6342,7 +6476,7 @@
         <w:rPr>
           <w:rFonts w:ascii="Times New Roman" w:hAnsi="Times New Roman" w:cs="Times New Roman"/>
         </w:rPr>
-        <w:t xml:space="preserve"> is +5V VBUS.</w:t>
+        <w:t xml:space="preserve"> is +5V.</w:t>
       </w:r>
       <w:r>
         <w:rPr>
@@ -6442,13 +6576,55 @@
         <w:rPr>
           <w:rFonts w:ascii="Times New Roman" w:hAnsi="Times New Roman" w:cs="Times New Roman"/>
         </w:rPr>
-        <w:t>Write the C file for the DAC interface. Look very carefully at the four Freescale SPI modes possible. Only one of these four modes matches exactly the shape and polarity of the clock needed by the TLV5616</w:t>
-      </w:r>
-      <w:r>
-        <w:rPr>
-          <w:rFonts w:ascii="Times New Roman" w:hAnsi="Times New Roman" w:cs="Times New Roman"/>
-        </w:rPr>
-        <w:t>/TLV5618</w:t>
+        <w:t xml:space="preserve">Write the C file for the DAC interface. </w:t>
+      </w:r>
+      <w:r>
+        <w:rPr>
+          <w:rFonts w:ascii="Times New Roman" w:hAnsi="Times New Roman" w:cs="Times New Roman"/>
+        </w:rPr>
+        <w:t>Place the low-level driver code in</w:t>
+      </w:r>
+      <w:r>
+        <w:rPr>
+          <w:rFonts w:ascii="Times New Roman" w:hAnsi="Times New Roman" w:cs="Times New Roman"/>
+        </w:rPr>
+        <w:t xml:space="preserve"> </w:t>
+      </w:r>
+      <w:r>
+        <w:rPr>
+          <w:rFonts w:ascii="Times New Roman" w:hAnsi="Times New Roman" w:cs="Times New Roman"/>
+        </w:rPr>
+        <w:t>MCP4921</w:t>
+      </w:r>
+      <w:r>
+        <w:rPr>
+          <w:rFonts w:ascii="Times New Roman" w:hAnsi="Times New Roman" w:cs="Times New Roman"/>
+        </w:rPr>
+        <w:t xml:space="preserve">.h and </w:t>
+      </w:r>
+      <w:r>
+        <w:rPr>
+          <w:rFonts w:ascii="Times New Roman" w:hAnsi="Times New Roman" w:cs="Times New Roman"/>
+        </w:rPr>
+        <w:t>MCP4921</w:t>
+      </w:r>
+      <w:r>
+        <w:rPr>
+          <w:rFonts w:ascii="Times New Roman" w:hAnsi="Times New Roman" w:cs="Times New Roman"/>
+        </w:rPr>
+        <w:t xml:space="preserve">.c files. </w:t>
+      </w:r>
+      <w:r>
+        <w:rPr>
+          <w:rFonts w:ascii="Times New Roman" w:hAnsi="Times New Roman" w:cs="Times New Roman"/>
+        </w:rPr>
+        <w:t xml:space="preserve">Look very carefully at the four Freescale SPI modes possible. Only one of these four modes matches exactly the shape and polarity of the clock needed by the </w:t>
+      </w:r>
+      <w:r>
+        <w:rPr>
+          <w:rFonts w:ascii="Times New Roman" w:hAnsi="Times New Roman" w:cs="Times New Roman"/>
+        </w:rPr>
+        <w:t>MCP4921</w:t>
       </w:r>
       <w:r>
         <w:rPr>
@@ -6456,91 +6632,438 @@
         </w:rPr>
         <w:t xml:space="preserve">. The function </w:t>
       </w:r>
-      <w:proofErr w:type="spellStart"/>
-      <w:r>
-        <w:rPr>
-          <w:rFonts w:ascii="Times New Roman" w:hAnsi="Times New Roman" w:cs="Times New Roman"/>
-        </w:rPr>
-        <w:t>DAC_Init</w:t>
-      </w:r>
-      <w:proofErr w:type="spellEnd"/>
-      <w:r>
-        <w:rPr>
-          <w:rFonts w:ascii="Times New Roman" w:hAnsi="Times New Roman" w:cs="Times New Roman"/>
-        </w:rPr>
-        <w:t xml:space="preserve">() initializes the SSI protocol, and the function </w:t>
-      </w:r>
-      <w:proofErr w:type="spellStart"/>
-      <w:r>
-        <w:rPr>
-          <w:rFonts w:ascii="Times New Roman" w:hAnsi="Times New Roman" w:cs="Times New Roman"/>
-        </w:rPr>
-        <w:t>DAC_Out</w:t>
-      </w:r>
-      <w:proofErr w:type="spellEnd"/>
-      <w:r>
-        <w:rPr>
-          <w:rFonts w:ascii="Times New Roman" w:hAnsi="Times New Roman" w:cs="Times New Roman"/>
-        </w:rPr>
-        <w:t xml:space="preserve">() sends a new data value to the DAC. Create separate </w:t>
-      </w:r>
-      <w:proofErr w:type="spellStart"/>
-      <w:r>
-        <w:rPr>
-          <w:rFonts w:ascii="Times New Roman" w:hAnsi="Times New Roman" w:cs="Times New Roman"/>
-        </w:rPr>
-        <w:t>DAC.h</w:t>
-      </w:r>
-      <w:proofErr w:type="spellEnd"/>
-      <w:r>
-        <w:rPr>
-          <w:rFonts w:ascii="Times New Roman" w:hAnsi="Times New Roman" w:cs="Times New Roman"/>
-        </w:rPr>
-        <w:t xml:space="preserve"> and </w:t>
-      </w:r>
-      <w:proofErr w:type="spellStart"/>
-      <w:r>
-        <w:rPr>
-          <w:rFonts w:ascii="Times New Roman" w:hAnsi="Times New Roman" w:cs="Times New Roman"/>
-        </w:rPr>
-        <w:t>DAC.c</w:t>
-      </w:r>
-      <w:proofErr w:type="spellEnd"/>
-      <w:r>
-        <w:rPr>
-          <w:rFonts w:ascii="Times New Roman" w:hAnsi="Times New Roman" w:cs="Times New Roman"/>
-        </w:rPr>
-        <w:t xml:space="preserve"> files. Write a second low-level device driver for the two or three switches, creating separate </w:t>
-      </w:r>
-      <w:proofErr w:type="spellStart"/>
-      <w:r>
-        <w:rPr>
-          <w:rFonts w:ascii="Times New Roman" w:hAnsi="Times New Roman" w:cs="Times New Roman"/>
-        </w:rPr>
-        <w:t>Switch.h</w:t>
-      </w:r>
-      <w:proofErr w:type="spellEnd"/>
-      <w:r>
-        <w:rPr>
-          <w:rFonts w:ascii="Times New Roman" w:hAnsi="Times New Roman" w:cs="Times New Roman"/>
-        </w:rPr>
-        <w:t xml:space="preserve"> and </w:t>
-      </w:r>
-      <w:proofErr w:type="spellStart"/>
-      <w:r>
-        <w:rPr>
-          <w:rFonts w:ascii="Times New Roman" w:hAnsi="Times New Roman" w:cs="Times New Roman"/>
-        </w:rPr>
-        <w:t>Switch.c</w:t>
-      </w:r>
-      <w:proofErr w:type="spellEnd"/>
-      <w:r>
-        <w:rPr>
-          <w:rFonts w:ascii="Times New Roman" w:hAnsi="Times New Roman" w:cs="Times New Roman"/>
-        </w:rPr>
-        <w:t xml:space="preserve"> files.</w:t>
-      </w:r>
-    </w:p>
+      <w:r>
+        <w:rPr>
+          <w:rFonts w:ascii="Times New Roman" w:hAnsi="Times New Roman" w:cs="Times New Roman"/>
+          <w:b/>
+          <w:bCs/>
+        </w:rPr>
+        <w:t>MCP4921</w:t>
+      </w:r>
+      <w:r>
+        <w:rPr>
+          <w:rFonts w:ascii="Times New Roman" w:hAnsi="Times New Roman" w:cs="Times New Roman"/>
+          <w:b/>
+          <w:bCs/>
+        </w:rPr>
+        <w:t>_</w:t>
+      </w:r>
+      <w:proofErr w:type="gramStart"/>
+      <w:r>
+        <w:rPr>
+          <w:rFonts w:ascii="Times New Roman" w:hAnsi="Times New Roman" w:cs="Times New Roman"/>
+          <w:b/>
+          <w:bCs/>
+        </w:rPr>
+        <w:t>Init(</w:t>
+      </w:r>
+      <w:proofErr w:type="gramEnd"/>
+      <w:r>
+        <w:rPr>
+          <w:rFonts w:ascii="Times New Roman" w:hAnsi="Times New Roman" w:cs="Times New Roman"/>
+          <w:b/>
+          <w:bCs/>
+        </w:rPr>
+        <w:t>)</w:t>
+      </w:r>
+      <w:r>
+        <w:rPr>
+          <w:rFonts w:ascii="Times New Roman" w:hAnsi="Times New Roman" w:cs="Times New Roman"/>
+        </w:rPr>
+        <w:t xml:space="preserve"> initializes the </w:t>
+      </w:r>
+      <w:r>
+        <w:rPr>
+          <w:rFonts w:ascii="Times New Roman" w:hAnsi="Times New Roman" w:cs="Times New Roman"/>
+        </w:rPr>
+        <w:t>SPI</w:t>
+      </w:r>
+      <w:r>
+        <w:rPr>
+          <w:rFonts w:ascii="Times New Roman" w:hAnsi="Times New Roman" w:cs="Times New Roman"/>
+        </w:rPr>
+        <w:t xml:space="preserve"> protocol, and the function </w:t>
+      </w:r>
+      <w:r>
+        <w:rPr>
+          <w:rFonts w:ascii="Times New Roman" w:hAnsi="Times New Roman" w:cs="Times New Roman"/>
+          <w:b/>
+          <w:bCs/>
+        </w:rPr>
+        <w:t>MCP4921</w:t>
+      </w:r>
+      <w:r>
+        <w:rPr>
+          <w:rFonts w:ascii="Times New Roman" w:hAnsi="Times New Roman" w:cs="Times New Roman"/>
+          <w:b/>
+          <w:bCs/>
+        </w:rPr>
+        <w:t>_</w:t>
+      </w:r>
+      <w:proofErr w:type="gramStart"/>
+      <w:r>
+        <w:rPr>
+          <w:rFonts w:ascii="Times New Roman" w:hAnsi="Times New Roman" w:cs="Times New Roman"/>
+          <w:b/>
+          <w:bCs/>
+        </w:rPr>
+        <w:t>Out(</w:t>
+      </w:r>
+      <w:proofErr w:type="gramEnd"/>
+      <w:r>
+        <w:rPr>
+          <w:rFonts w:ascii="Times New Roman" w:hAnsi="Times New Roman" w:cs="Times New Roman"/>
+          <w:b/>
+          <w:bCs/>
+        </w:rPr>
+        <w:t>)</w:t>
+      </w:r>
+      <w:r>
+        <w:rPr>
+          <w:rFonts w:ascii="Times New Roman" w:hAnsi="Times New Roman" w:cs="Times New Roman"/>
+        </w:rPr>
+        <w:t xml:space="preserve"> sends a new data value to the DAC. </w:t>
+      </w:r>
+      <w:r>
+        <w:rPr>
+          <w:rFonts w:ascii="Times New Roman" w:hAnsi="Times New Roman" w:cs="Times New Roman"/>
+        </w:rPr>
+        <w:t xml:space="preserve">Test the DAC using a program like </w:t>
+      </w:r>
+      <w:r>
+        <w:rPr>
+          <w:rFonts w:ascii="Times New Roman" w:hAnsi="Times New Roman" w:cs="Times New Roman"/>
+          <w:b/>
+          <w:bCs/>
+        </w:rPr>
+        <w:t>main0</w:t>
+      </w:r>
+      <w:r>
+        <w:rPr>
+          <w:rFonts w:ascii="Times New Roman" w:hAnsi="Times New Roman" w:cs="Times New Roman"/>
+        </w:rPr>
+        <w:t>. Connect the three SPI pins to a logic analyzer and verify the SPI timing, like Figure 5.6.</w:t>
+      </w:r>
+      <w:r>
+        <w:rPr>
+          <w:rFonts w:ascii="Times New Roman" w:hAnsi="Times New Roman" w:cs="Times New Roman"/>
+        </w:rPr>
+        <w:t xml:space="preserve"> Notice the MSPM0 changes the data on the falling edge and the MCP4921 latches the data on the rising edge.</w:t>
+      </w:r>
+      <w:r>
+        <w:rPr>
+          <w:rFonts w:ascii="Times New Roman" w:hAnsi="Times New Roman" w:cs="Times New Roman"/>
+        </w:rPr>
+        <w:t xml:space="preserve"> </w:t>
+      </w:r>
+      <w:r>
+        <w:rPr>
+          <w:rFonts w:ascii="Times New Roman" w:hAnsi="Times New Roman" w:cs="Times New Roman"/>
+        </w:rPr>
+        <w:t>Notice bit 12 should always be high to turn on the DAC.</w:t>
+      </w:r>
+      <w:r>
+        <w:rPr>
+          <w:rFonts w:ascii="Times New Roman" w:hAnsi="Times New Roman" w:cs="Times New Roman"/>
+        </w:rPr>
+        <w:t xml:space="preserve"> </w:t>
+      </w:r>
+      <w:r>
+        <w:rPr>
+          <w:rFonts w:ascii="Times New Roman" w:hAnsi="Times New Roman" w:cs="Times New Roman"/>
+        </w:rPr>
+        <w:t>Run main0 and see the ramp on the scope like Figure 5.7.</w:t>
+      </w:r>
+      <w:r>
+        <w:rPr>
+          <w:rFonts w:ascii="Times New Roman" w:hAnsi="Times New Roman" w:cs="Times New Roman"/>
+        </w:rPr>
+        <w:t xml:space="preserve"> </w:t>
+      </w:r>
+      <w:r>
+        <w:rPr>
+          <w:rFonts w:ascii="Times New Roman" w:hAnsi="Times New Roman" w:cs="Times New Roman"/>
+        </w:rPr>
+        <w:t>Run main1 and see the sine wave on the scope like Figure 5.8.</w:t>
+      </w:r>
+      <w:r>
+        <w:rPr>
+          <w:rFonts w:ascii="Times New Roman" w:hAnsi="Times New Roman" w:cs="Times New Roman"/>
+        </w:rPr>
+        <w:t xml:space="preserve"> Considering the harmonics as noise, using a spectrum analyzer we see the SNR is 60 dB, which is precision of about 10 bits.</w:t>
+      </w:r>
+    </w:p>
+    <w:p>
+      <w:pPr>
+        <w:jc w:val="center"/>
+      </w:pPr>
+      <w:r>
+        <w:rPr>
+          <w:noProof/>
+        </w:rPr>
+        <w:lastRenderedPageBreak/>
+        <w:drawing>
+          <wp:inline distT="0" distB="0" distL="0" distR="0" wp14:anchorId="2C933783" wp14:editId="433B2DDE">
+            <wp:extent cx="5736369" cy="1324510"/>
+            <wp:effectExtent l="0" t="0" r="0" b="9525"/>
+            <wp:docPr id="580063078" name="Picture 10"/>
+            <wp:cNvGraphicFramePr>
+              <a:graphicFrameLocks xmlns:a="http://schemas.openxmlformats.org/drawingml/2006/main" noChangeAspect="1"/>
+            </wp:cNvGraphicFramePr>
+            <a:graphic xmlns:a="http://schemas.openxmlformats.org/drawingml/2006/main">
+              <a:graphicData uri="http://schemas.openxmlformats.org/drawingml/2006/picture">
+                <pic:pic xmlns:pic="http://schemas.openxmlformats.org/drawingml/2006/picture">
+                  <pic:nvPicPr>
+                    <pic:cNvPr id="580063078" name="Picture 580063078"/>
+                    <pic:cNvPicPr/>
+                  </pic:nvPicPr>
+                  <pic:blipFill>
+                    <a:blip r:embed="rId21">
+                      <a:extLst>
+                        <a:ext uri="{28A0092B-C50C-407E-A947-70E740481C1C}">
+                          <a14:useLocalDpi xmlns:a14="http://schemas.microsoft.com/office/drawing/2010/main" val="0"/>
+                        </a:ext>
+                      </a:extLst>
+                    </a:blip>
+                    <a:stretch>
+                      <a:fillRect/>
+                    </a:stretch>
+                  </pic:blipFill>
+                  <pic:spPr>
+                    <a:xfrm>
+                      <a:off x="0" y="0"/>
+                      <a:ext cx="5736369" cy="1324510"/>
+                    </a:xfrm>
+                    <a:prstGeom prst="rect">
+                      <a:avLst/>
+                    </a:prstGeom>
+                  </pic:spPr>
+                </pic:pic>
+              </a:graphicData>
+            </a:graphic>
+          </wp:inline>
+        </w:drawing>
+      </w:r>
+    </w:p>
+    <w:p>
+      <w:pPr>
+        <w:pStyle w:val="FigureCaption"/>
+        <w:ind w:left="720"/>
+        <w:jc w:val="left"/>
+        <w:rPr>
+          <w:rFonts w:ascii="Times New Roman" w:hAnsi="Times New Roman" w:cs="Times New Roman"/>
+        </w:rPr>
+      </w:pPr>
+      <w:r>
+        <w:rPr>
+          <w:rFonts w:ascii="Times New Roman" w:hAnsi="Times New Roman" w:cs="Times New Roman"/>
+        </w:rPr>
+        <w:t xml:space="preserve">Figure </w:t>
+      </w:r>
+      <w:r>
+        <w:rPr>
+          <w:rFonts w:ascii="Times New Roman" w:hAnsi="Times New Roman" w:cs="Times New Roman"/>
+        </w:rPr>
+        <w:t>5.6</w:t>
+      </w:r>
+      <w:r>
+        <w:rPr>
+          <w:rFonts w:ascii="Times New Roman" w:hAnsi="Times New Roman" w:cs="Times New Roman"/>
+        </w:rPr>
+        <w:t xml:space="preserve">. </w:t>
+      </w:r>
+      <w:r>
+        <w:rPr>
+          <w:rFonts w:ascii="Times New Roman" w:hAnsi="Times New Roman" w:cs="Times New Roman"/>
+        </w:rPr>
+        <w:t>Logic analyzer trace showing the 8MHz clock and the 16-bit data.</w:t>
+      </w:r>
+      <w:r>
+        <w:rPr>
+          <w:rFonts w:ascii="Times New Roman" w:hAnsi="Times New Roman" w:cs="Times New Roman"/>
+        </w:rPr>
+        <w:t xml:space="preserve"> </w:t>
+      </w:r>
+    </w:p>
+    <w:p>
+      <w:r>
+        <w:rPr>
+          <w:noProof/>
+        </w:rPr>
+        <w:drawing>
+          <wp:inline distT="0" distB="0" distL="0" distR="0" wp14:anchorId="79A8C6D1" wp14:editId="2E7E6C9F">
+            <wp:extent cx="5934075" cy="1743075"/>
+            <wp:effectExtent l="0" t="0" r="9525" b="9525"/>
+            <wp:docPr id="633695671" name="Picture 10"/>
+            <wp:cNvGraphicFramePr>
+              <a:graphicFrameLocks xmlns:a="http://schemas.openxmlformats.org/drawingml/2006/main" noChangeAspect="1"/>
+            </wp:cNvGraphicFramePr>
+            <a:graphic xmlns:a="http://schemas.openxmlformats.org/drawingml/2006/main">
+              <a:graphicData uri="http://schemas.openxmlformats.org/drawingml/2006/picture">
+                <pic:pic xmlns:pic="http://schemas.openxmlformats.org/drawingml/2006/picture">
+                  <pic:nvPicPr>
+                    <pic:cNvPr id="0" name="Picture 2"/>
+                    <pic:cNvPicPr>
+                      <a:picLocks noChangeAspect="1" noChangeArrowheads="1"/>
+                    </pic:cNvPicPr>
+                  </pic:nvPicPr>
+                  <pic:blipFill>
+                    <a:blip r:embed="rId22">
+                      <a:extLst>
+                        <a:ext uri="{28A0092B-C50C-407E-A947-70E740481C1C}">
+                          <a14:useLocalDpi xmlns:a14="http://schemas.microsoft.com/office/drawing/2010/main" val="0"/>
+                        </a:ext>
+                      </a:extLst>
+                    </a:blip>
+                    <a:srcRect/>
+                    <a:stretch>
+                      <a:fillRect/>
+                    </a:stretch>
+                  </pic:blipFill>
+                  <pic:spPr bwMode="auto">
+                    <a:xfrm>
+                      <a:off x="0" y="0"/>
+                      <a:ext cx="5934075" cy="1743075"/>
+                    </a:xfrm>
+                    <a:prstGeom prst="rect">
+                      <a:avLst/>
+                    </a:prstGeom>
+                    <a:noFill/>
+                    <a:ln>
+                      <a:noFill/>
+                    </a:ln>
+                  </pic:spPr>
+                </pic:pic>
+              </a:graphicData>
+            </a:graphic>
+          </wp:inline>
+        </w:drawing>
+      </w:r>
+    </w:p>
+    <w:p>
+      <w:pPr>
+        <w:pStyle w:val="FigureCaption"/>
+        <w:ind w:left="720"/>
+        <w:jc w:val="left"/>
+        <w:rPr>
+          <w:rFonts w:ascii="Times New Roman" w:hAnsi="Times New Roman" w:cs="Times New Roman"/>
+        </w:rPr>
+      </w:pPr>
+      <w:r>
+        <w:rPr>
+          <w:rFonts w:ascii="Times New Roman" w:hAnsi="Times New Roman" w:cs="Times New Roman"/>
+        </w:rPr>
+        <w:t xml:space="preserve">Figure </w:t>
+      </w:r>
+      <w:r>
+        <w:rPr>
+          <w:rFonts w:ascii="Times New Roman" w:hAnsi="Times New Roman" w:cs="Times New Roman"/>
+        </w:rPr>
+        <w:t>5.7</w:t>
+      </w:r>
+      <w:r>
+        <w:rPr>
+          <w:rFonts w:ascii="Times New Roman" w:hAnsi="Times New Roman" w:cs="Times New Roman"/>
+        </w:rPr>
+        <w:t xml:space="preserve"> </w:t>
+      </w:r>
+      <w:r>
+        <w:rPr>
+          <w:rFonts w:ascii="Times New Roman" w:hAnsi="Times New Roman" w:cs="Times New Roman"/>
+        </w:rPr>
+        <w:t>Scope trace running main0. C1 is MCP4921 OUT and C2 is reference in.</w:t>
+      </w:r>
+    </w:p>
+    <w:p>
+      <w:r>
+        <w:rPr>
+          <w:noProof/>
+        </w:rPr>
+        <w:drawing>
+          <wp:inline distT="0" distB="0" distL="0" distR="0" wp14:anchorId="1949A5A9" wp14:editId="0E7B6B8E">
+            <wp:extent cx="5934075" cy="3952875"/>
+            <wp:effectExtent l="0" t="0" r="9525" b="9525"/>
+            <wp:docPr id="169833603" name="Picture 12"/>
+            <wp:cNvGraphicFramePr>
+              <a:graphicFrameLocks xmlns:a="http://schemas.openxmlformats.org/drawingml/2006/main" noChangeAspect="1"/>
+            </wp:cNvGraphicFramePr>
+            <a:graphic xmlns:a="http://schemas.openxmlformats.org/drawingml/2006/main">
+              <a:graphicData uri="http://schemas.openxmlformats.org/drawingml/2006/picture">
+                <pic:pic xmlns:pic="http://schemas.openxmlformats.org/drawingml/2006/picture">
+                  <pic:nvPicPr>
+                    <pic:cNvPr id="0" name="Picture 4"/>
+                    <pic:cNvPicPr>
+                      <a:picLocks noChangeAspect="1" noChangeArrowheads="1"/>
+                    </pic:cNvPicPr>
+                  </pic:nvPicPr>
+                  <pic:blipFill>
+                    <a:blip r:embed="rId23">
+                      <a:extLst>
+                        <a:ext uri="{28A0092B-C50C-407E-A947-70E740481C1C}">
+                          <a14:useLocalDpi xmlns:a14="http://schemas.microsoft.com/office/drawing/2010/main" val="0"/>
+                        </a:ext>
+                      </a:extLst>
+                    </a:blip>
+                    <a:srcRect/>
+                    <a:stretch>
+                      <a:fillRect/>
+                    </a:stretch>
+                  </pic:blipFill>
+                  <pic:spPr bwMode="auto">
+                    <a:xfrm>
+                      <a:off x="0" y="0"/>
+                      <a:ext cx="5934075" cy="3952875"/>
+                    </a:xfrm>
+                    <a:prstGeom prst="rect">
+                      <a:avLst/>
+                    </a:prstGeom>
+                    <a:noFill/>
+                    <a:ln>
+                      <a:noFill/>
+                    </a:ln>
+                  </pic:spPr>
+                </pic:pic>
+              </a:graphicData>
+            </a:graphic>
+          </wp:inline>
+        </w:drawing>
+      </w:r>
+    </w:p>
+    <w:p>
+      <w:pPr>
+        <w:pStyle w:val="FigureCaption"/>
+        <w:ind w:left="720"/>
+        <w:jc w:val="left"/>
+        <w:rPr>
+          <w:rFonts w:ascii="Times New Roman" w:hAnsi="Times New Roman" w:cs="Times New Roman"/>
+        </w:rPr>
+      </w:pPr>
+      <w:r>
+        <w:rPr>
+          <w:rFonts w:ascii="Times New Roman" w:hAnsi="Times New Roman" w:cs="Times New Roman"/>
+        </w:rPr>
+        <w:t xml:space="preserve">Figure </w:t>
+      </w:r>
+      <w:r>
+        <w:rPr>
+          <w:rFonts w:ascii="Times New Roman" w:hAnsi="Times New Roman" w:cs="Times New Roman"/>
+        </w:rPr>
+        <w:t>5.8</w:t>
+      </w:r>
+      <w:r>
+        <w:rPr>
+          <w:rFonts w:ascii="Times New Roman" w:hAnsi="Times New Roman" w:cs="Times New Roman"/>
+        </w:rPr>
+        <w:t xml:space="preserve"> </w:t>
+      </w:r>
+      <w:r>
+        <w:rPr>
+          <w:rFonts w:ascii="Times New Roman" w:hAnsi="Times New Roman" w:cs="Times New Roman"/>
+        </w:rPr>
+        <w:t>Scope trace running main1. C1 is MCP4921 OUT and C2 is reference in.</w:t>
+      </w:r>
+    </w:p>
+    <w:p/>
     <w:p>
       <w:pPr>
         <w:pStyle w:val="ListParagraph"/>
@@ -6556,14 +7079,26 @@
         <w:rPr>
           <w:rFonts w:ascii="Times New Roman" w:hAnsi="Times New Roman" w:cs="Times New Roman"/>
         </w:rPr>
-        <w:t xml:space="preserve">Design and write the music device driver software. Create separate </w:t>
+        <w:t xml:space="preserve">Write a second low-level device driver for the two or three switches, </w:t>
+      </w:r>
+      <w:r>
+        <w:rPr>
+          <w:rFonts w:ascii="Times New Roman" w:hAnsi="Times New Roman" w:cs="Times New Roman"/>
+        </w:rPr>
+        <w:t>placing the implementations in the</w:t>
+      </w:r>
+      <w:r>
+        <w:rPr>
+          <w:rFonts w:ascii="Times New Roman" w:hAnsi="Times New Roman" w:cs="Times New Roman"/>
+        </w:rPr>
+        <w:t xml:space="preserve"> </w:t>
       </w:r>
       <w:proofErr w:type="spellStart"/>
       <w:r>
         <w:rPr>
           <w:rFonts w:ascii="Times New Roman" w:hAnsi="Times New Roman" w:cs="Times New Roman"/>
         </w:rPr>
-        <w:t>Music.h</w:t>
+        <w:t>Switch.h</w:t>
       </w:r>
       <w:proofErr w:type="spellEnd"/>
       <w:r>
@@ -6577,28 +7112,14 @@
         <w:rPr>
           <w:rFonts w:ascii="Times New Roman" w:hAnsi="Times New Roman" w:cs="Times New Roman"/>
         </w:rPr>
-        <w:t>Music.c</w:t>
+        <w:t>Switch.c</w:t>
       </w:r>
       <w:proofErr w:type="spellEnd"/>
       <w:r>
         <w:rPr>
           <w:rFonts w:ascii="Times New Roman" w:hAnsi="Times New Roman" w:cs="Times New Roman"/>
         </w:rPr>
-        <w:t xml:space="preserve"> files. Place the data structure format definition in the header file. For example, you could implement a </w:t>
-      </w:r>
-      <w:proofErr w:type="spellStart"/>
-      <w:r>
-        <w:rPr>
-          <w:rFonts w:ascii="Times New Roman" w:hAnsi="Times New Roman" w:cs="Times New Roman"/>
-        </w:rPr>
-        <w:t>Music_Play</w:t>
-      </w:r>
-      <w:proofErr w:type="spellEnd"/>
-      <w:r>
-        <w:rPr>
-          <w:rFonts w:ascii="Times New Roman" w:hAnsi="Times New Roman" w:cs="Times New Roman"/>
-        </w:rPr>
-        <w:t>() function that takes as an input parameter a pointer to a song data structure. Add minimally intrusive debugging instruments to allow you to visualize when interrupts are being processed.</w:t>
+        <w:t xml:space="preserve"> files.</w:t>
       </w:r>
     </w:p>
     <w:p>
@@ -6616,19 +7137,61 @@
         <w:rPr>
           <w:rFonts w:ascii="Times New Roman" w:hAnsi="Times New Roman" w:cs="Times New Roman"/>
         </w:rPr>
-        <w:t>Build the SSI/DAC hardware including voltage reference. Use simple main programs to debug the SSI/DAC interface. Experimentally measure the DAC output versus digital input for 8 different digital inputs. Compare the measured data with the expected values. Calculate resolution, range, precision</w:t>
-      </w:r>
-      <w:r>
-        <w:rPr>
-          <w:rFonts w:ascii="Times New Roman" w:hAnsi="Times New Roman" w:cs="Times New Roman"/>
-        </w:rPr>
-        <w:t>,</w:t>
-      </w:r>
-      <w:r>
-        <w:rPr>
-          <w:rFonts w:ascii="Times New Roman" w:hAnsi="Times New Roman" w:cs="Times New Roman"/>
-        </w:rPr>
-        <w:t xml:space="preserve"> and accuracy of the DAC.</w:t>
+        <w:t>Design and write the music device driver software</w:t>
+      </w:r>
+      <w:r>
+        <w:rPr>
+          <w:rFonts w:ascii="Times New Roman" w:hAnsi="Times New Roman" w:cs="Times New Roman"/>
+        </w:rPr>
+        <w:t xml:space="preserve">, </w:t>
+      </w:r>
+      <w:r>
+        <w:rPr>
+          <w:rFonts w:ascii="Times New Roman" w:hAnsi="Times New Roman" w:cs="Times New Roman"/>
+        </w:rPr>
+        <w:t xml:space="preserve">placing the implementations in the </w:t>
+      </w:r>
+      <w:proofErr w:type="spellStart"/>
+      <w:r>
+        <w:rPr>
+          <w:rFonts w:ascii="Times New Roman" w:hAnsi="Times New Roman" w:cs="Times New Roman"/>
+        </w:rPr>
+        <w:t>Music.h</w:t>
+      </w:r>
+      <w:proofErr w:type="spellEnd"/>
+      <w:r>
+        <w:rPr>
+          <w:rFonts w:ascii="Times New Roman" w:hAnsi="Times New Roman" w:cs="Times New Roman"/>
+        </w:rPr>
+        <w:t xml:space="preserve"> and </w:t>
+      </w:r>
+      <w:proofErr w:type="spellStart"/>
+      <w:r>
+        <w:rPr>
+          <w:rFonts w:ascii="Times New Roman" w:hAnsi="Times New Roman" w:cs="Times New Roman"/>
+        </w:rPr>
+        <w:t>Music.c</w:t>
+      </w:r>
+      <w:proofErr w:type="spellEnd"/>
+      <w:r>
+        <w:rPr>
+          <w:rFonts w:ascii="Times New Roman" w:hAnsi="Times New Roman" w:cs="Times New Roman"/>
+        </w:rPr>
+        <w:t xml:space="preserve"> files. Place the data structure format definition in the header file. For example, you could implement a </w:t>
+      </w:r>
+      <w:proofErr w:type="spellStart"/>
+      <w:r>
+        <w:rPr>
+          <w:rFonts w:ascii="Times New Roman" w:hAnsi="Times New Roman" w:cs="Times New Roman"/>
+        </w:rPr>
+        <w:t>Music_Play</w:t>
+      </w:r>
+      <w:proofErr w:type="spellEnd"/>
+      <w:r>
+        <w:rPr>
+          <w:rFonts w:ascii="Times New Roman" w:hAnsi="Times New Roman" w:cs="Times New Roman"/>
+        </w:rPr>
+        <w:t>() function that takes as an input parameter a pointer to a song data structure. Add minimally intrusive debugging instruments to allow you to visualize when interrupts are being processed.</w:t>
       </w:r>
     </w:p>
     <w:p>
@@ -6646,8 +7209,91 @@
         <w:rPr>
           <w:rFonts w:ascii="Times New Roman" w:hAnsi="Times New Roman" w:cs="Times New Roman"/>
         </w:rPr>
-        <w:lastRenderedPageBreak/>
-        <w:t>Solder the LM4890 amp to a breakout board, Figure 5.6, so it can be inserted into a standard solderless breadboard</w:t>
+        <w:t>Build the S</w:t>
+      </w:r>
+      <w:r>
+        <w:rPr>
+          <w:rFonts w:ascii="Times New Roman" w:hAnsi="Times New Roman" w:cs="Times New Roman"/>
+        </w:rPr>
+        <w:t>P</w:t>
+      </w:r>
+      <w:r>
+        <w:rPr>
+          <w:rFonts w:ascii="Times New Roman" w:hAnsi="Times New Roman" w:cs="Times New Roman"/>
+        </w:rPr>
+        <w:t>I/DAC hardware including voltage reference. Use simple main programs to debug the S</w:t>
+      </w:r>
+      <w:r>
+        <w:rPr>
+          <w:rFonts w:ascii="Times New Roman" w:hAnsi="Times New Roman" w:cs="Times New Roman"/>
+        </w:rPr>
+        <w:t>P</w:t>
+      </w:r>
+      <w:r>
+        <w:rPr>
+          <w:rFonts w:ascii="Times New Roman" w:hAnsi="Times New Roman" w:cs="Times New Roman"/>
+        </w:rPr>
+        <w:t>I/DAC interface. Experimentally measure the DAC output versus digital input for 8 different digital inputs. Compare the measured data with the expected values. Calculate resolution, range, precision</w:t>
+      </w:r>
+      <w:r>
+        <w:rPr>
+          <w:rFonts w:ascii="Times New Roman" w:hAnsi="Times New Roman" w:cs="Times New Roman"/>
+        </w:rPr>
+        <w:t>,</w:t>
+      </w:r>
+      <w:r>
+        <w:rPr>
+          <w:rFonts w:ascii="Times New Roman" w:hAnsi="Times New Roman" w:cs="Times New Roman"/>
+        </w:rPr>
+        <w:t xml:space="preserve"> and accuracy of the DAC.</w:t>
+      </w:r>
+    </w:p>
+    <w:p>
+      <w:pPr>
+        <w:pStyle w:val="ListParagraph"/>
+        <w:numPr>
+          <w:ilvl w:val="0"/>
+          <w:numId w:val="17"/>
+        </w:numPr>
+        <w:rPr>
+          <w:rFonts w:ascii="Times New Roman" w:hAnsi="Times New Roman" w:cs="Times New Roman"/>
+        </w:rPr>
+      </w:pPr>
+      <w:r>
+        <w:rPr>
+          <w:rFonts w:ascii="Times New Roman" w:hAnsi="Times New Roman" w:cs="Times New Roman"/>
+        </w:rPr>
+        <w:t>Solder the LM4890 amp to a breakout board, Figure 5.</w:t>
+      </w:r>
+      <w:r>
+        <w:rPr>
+          <w:rFonts w:ascii="Times New Roman" w:hAnsi="Times New Roman" w:cs="Times New Roman"/>
+        </w:rPr>
+        <w:t>9</w:t>
+      </w:r>
+      <w:r>
+        <w:rPr>
+          <w:rFonts w:ascii="Times New Roman" w:hAnsi="Times New Roman" w:cs="Times New Roman"/>
+        </w:rPr>
+        <w:t>, so it can be inserted into a standard solderless breadboard</w:t>
+      </w:r>
+      <w:r>
+        <w:rPr>
+          <w:rFonts w:ascii="Times New Roman" w:hAnsi="Times New Roman" w:cs="Times New Roman"/>
+        </w:rPr>
+        <w:t xml:space="preserve">. There are two versions of the breakout board. </w:t>
+      </w:r>
+      <w:r>
+        <w:rPr>
+          <w:rFonts w:ascii="Times New Roman" w:hAnsi="Times New Roman" w:cs="Times New Roman"/>
+        </w:rPr>
+        <w:t>Using an ohmmeter, c</w:t>
+      </w:r>
+      <w:r>
+        <w:rPr>
+          <w:rFonts w:ascii="Times New Roman" w:hAnsi="Times New Roman" w:cs="Times New Roman"/>
+        </w:rPr>
+        <w:t>onfirm which one you have and identify the pinout:</w:t>
       </w:r>
     </w:p>
     <w:p>
@@ -6658,6 +7304,793 @@
           <w:rFonts w:ascii="Times New Roman" w:hAnsi="Times New Roman" w:cs="Times New Roman"/>
         </w:rPr>
       </w:pPr>
+      <w:r>
+        <w:rPr>
+          <w:rFonts w:ascii="Times New Roman" w:hAnsi="Times New Roman" w:cs="Times New Roman"/>
+          <w:noProof/>
+        </w:rPr>
+        <mc:AlternateContent>
+          <mc:Choice Requires="wps">
+            <w:drawing>
+              <wp:anchor distT="0" distB="0" distL="114300" distR="114300" simplePos="0" relativeHeight="251670528" behindDoc="0" locked="0" layoutInCell="1" allowOverlap="1" wp14:anchorId="015A2A9A" wp14:editId="3A71DB7D">
+                <wp:simplePos x="0" y="0"/>
+                <wp:positionH relativeFrom="column">
+                  <wp:posOffset>381094</wp:posOffset>
+                </wp:positionH>
+                <wp:positionV relativeFrom="paragraph">
+                  <wp:posOffset>137937</wp:posOffset>
+                </wp:positionV>
+                <wp:extent cx="797748" cy="481659"/>
+                <wp:effectExtent l="0" t="0" r="0" b="0"/>
+                <wp:wrapNone/>
+                <wp:docPr id="1979430617" name="Text Box 4"/>
+                <wp:cNvGraphicFramePr/>
+                <a:graphic xmlns:a="http://schemas.openxmlformats.org/drawingml/2006/main">
+                  <a:graphicData uri="http://schemas.microsoft.com/office/word/2010/wordprocessingShape">
+                    <wps:wsp>
+                      <wps:cNvSpPr txBox="1"/>
+                      <wps:spPr>
+                        <a:xfrm>
+                          <a:off x="0" y="0"/>
+                          <a:ext cx="797748" cy="481659"/>
+                        </a:xfrm>
+                        <a:prstGeom prst="rect">
+                          <a:avLst/>
+                        </a:prstGeom>
+                        <a:noFill/>
+                        <a:ln w="6350">
+                          <a:noFill/>
+                        </a:ln>
+                      </wps:spPr>
+                      <wps:txbx>
+                        <w:txbxContent>
+                          <w:p>
+                            <w:pPr>
+                              <w:rPr>
+                                <w:b/>
+                                <w:bCs/>
+                                <w:color w:val="EE0000"/>
+                                <w:sz w:val="16"/>
+                                <w:szCs w:val="16"/>
+                              </w:rPr>
+                            </w:pPr>
+                            <w:r>
+                              <w:rPr>
+                                <w:b/>
+                                <w:bCs/>
+                                <w:color w:val="EE0000"/>
+                                <w:sz w:val="16"/>
+                                <w:szCs w:val="16"/>
+                              </w:rPr>
+                              <w:t>BREADBOARD PIN 1</w:t>
+                            </w:r>
+                          </w:p>
+                        </w:txbxContent>
+                      </wps:txbx>
+                      <wps:bodyPr rot="0" spcFirstLastPara="0" vertOverflow="overflow" horzOverflow="overflow" vert="horz" wrap="square" lIns="91440" tIns="45720" rIns="91440" bIns="45720" numCol="1" spcCol="0" rtlCol="0" fromWordArt="0" anchor="t" anchorCtr="0" forceAA="0" compatLnSpc="1">
+                        <a:prstTxWarp prst="textNoShape">
+                          <a:avLst/>
+                        </a:prstTxWarp>
+                        <a:noAutofit/>
+                      </wps:bodyPr>
+                    </wps:wsp>
+                  </a:graphicData>
+                </a:graphic>
+                <wp14:sizeRelH relativeFrom="margin">
+                  <wp14:pctWidth>0</wp14:pctWidth>
+                </wp14:sizeRelH>
+                <wp14:sizeRelV relativeFrom="margin">
+                  <wp14:pctHeight>0</wp14:pctHeight>
+                </wp14:sizeRelV>
+              </wp:anchor>
+            </w:drawing>
+          </mc:Choice>
+          <mc:Fallback>
+            <w:pict>
+              <v:shapetype w14:anchorId="015A2A9A" id="_x0000_t202" coordsize="21600,21600" o:spt="202" path="m,l,21600r21600,l21600,xe">
+                <v:stroke joinstyle="miter"/>
+                <v:path gradientshapeok="t" o:connecttype="rect"/>
+              </v:shapetype>
+              <v:shape id="Text Box 4" o:spid="_x0000_s1026" type="#_x0000_t202" style="position:absolute;left:0;text-align:left;margin-left:30pt;margin-top:10.85pt;width:62.8pt;height:37.95pt;z-index:251670528;visibility:visible;mso-wrap-style:square;mso-width-percent:0;mso-height-percent:0;mso-wrap-distance-left:9pt;mso-wrap-distance-top:0;mso-wrap-distance-right:9pt;mso-wrap-distance-bottom:0;mso-position-horizontal:absolute;mso-position-horizontal-relative:text;mso-position-vertical:absolute;mso-position-vertical-relative:text;mso-width-percent:0;mso-height-percent:0;mso-width-relative:margin;mso-height-relative:margin;v-text-anchor:top" o:gfxdata="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" filled="f" stroked="f" strokeweight=".5pt">
+                <v:textbox>
+                  <w:txbxContent>
+                    <w:p>
+                      <w:pPr>
+                        <w:rPr>
+                          <w:b/>
+                          <w:bCs/>
+                          <w:color w:val="EE0000"/>
+                          <w:sz w:val="16"/>
+                          <w:szCs w:val="16"/>
+                        </w:rPr>
+                      </w:pPr>
+                      <w:r>
+                        <w:rPr>
+                          <w:b/>
+                          <w:bCs/>
+                          <w:color w:val="EE0000"/>
+                          <w:sz w:val="16"/>
+                          <w:szCs w:val="16"/>
+                        </w:rPr>
+                        <w:t>BREADBOARD PIN 1</w:t>
+                      </w:r>
+                    </w:p>
+                  </w:txbxContent>
+                </v:textbox>
+              </v:shape>
+            </w:pict>
+          </mc:Fallback>
+        </mc:AlternateContent>
+      </w:r>
+      <w:r>
+        <w:rPr>
+          <w:rFonts w:ascii="Times New Roman" w:hAnsi="Times New Roman" w:cs="Times New Roman"/>
+          <w:noProof/>
+        </w:rPr>
+        <mc:AlternateContent>
+          <mc:Choice Requires="wps">
+            <w:drawing>
+              <wp:anchor distT="0" distB="0" distL="114300" distR="114300" simplePos="0" relativeHeight="251672576" behindDoc="0" locked="0" layoutInCell="1" allowOverlap="1" wp14:anchorId="260FEDAD" wp14:editId="4C37A659">
+                <wp:simplePos x="0" y="0"/>
+                <wp:positionH relativeFrom="column">
+                  <wp:posOffset>1792817</wp:posOffset>
+                </wp:positionH>
+                <wp:positionV relativeFrom="paragraph">
+                  <wp:posOffset>139818</wp:posOffset>
+                </wp:positionV>
+                <wp:extent cx="797748" cy="481659"/>
+                <wp:effectExtent l="0" t="0" r="0" b="0"/>
+                <wp:wrapNone/>
+                <wp:docPr id="1241484827" name="Text Box 4"/>
+                <wp:cNvGraphicFramePr/>
+                <a:graphic xmlns:a="http://schemas.openxmlformats.org/drawingml/2006/main">
+                  <a:graphicData uri="http://schemas.microsoft.com/office/word/2010/wordprocessingShape">
+                    <wps:wsp>
+                      <wps:cNvSpPr txBox="1"/>
+                      <wps:spPr>
+                        <a:xfrm>
+                          <a:off x="0" y="0"/>
+                          <a:ext cx="797748" cy="481659"/>
+                        </a:xfrm>
+                        <a:prstGeom prst="rect">
+                          <a:avLst/>
+                        </a:prstGeom>
+                        <a:noFill/>
+                        <a:ln w="6350">
+                          <a:noFill/>
+                        </a:ln>
+                      </wps:spPr>
+                      <wps:txbx>
+                        <w:txbxContent>
+                          <w:p>
+                            <w:pPr>
+                              <w:rPr>
+                                <w:b/>
+                                <w:bCs/>
+                                <w:color w:val="EE0000"/>
+                                <w:sz w:val="16"/>
+                                <w:szCs w:val="16"/>
+                              </w:rPr>
+                            </w:pPr>
+                            <w:r>
+                              <w:rPr>
+                                <w:b/>
+                                <w:bCs/>
+                                <w:color w:val="EE0000"/>
+                                <w:sz w:val="16"/>
+                                <w:szCs w:val="16"/>
+                              </w:rPr>
+                              <w:t>BREADBOARD PIN 1</w:t>
+                            </w:r>
+                          </w:p>
+                        </w:txbxContent>
+                      </wps:txbx>
+                      <wps:bodyPr rot="0" spcFirstLastPara="0" vertOverflow="overflow" horzOverflow="overflow" vert="horz" wrap="square" lIns="91440" tIns="45720" rIns="91440" bIns="45720" numCol="1" spcCol="0" rtlCol="0" fromWordArt="0" anchor="t" anchorCtr="0" forceAA="0" compatLnSpc="1">
+                        <a:prstTxWarp prst="textNoShape">
+                          <a:avLst/>
+                        </a:prstTxWarp>
+                        <a:noAutofit/>
+                      </wps:bodyPr>
+                    </wps:wsp>
+                  </a:graphicData>
+                </a:graphic>
+                <wp14:sizeRelH relativeFrom="margin">
+                  <wp14:pctWidth>0</wp14:pctWidth>
+                </wp14:sizeRelH>
+                <wp14:sizeRelV relativeFrom="margin">
+                  <wp14:pctHeight>0</wp14:pctHeight>
+                </wp14:sizeRelV>
+              </wp:anchor>
+            </w:drawing>
+          </mc:Choice>
+          <mc:Fallback>
+            <w:pict>
+              <v:shape w14:anchorId="260FEDAD" id="_x0000_s1027" type="#_x0000_t202" style="position:absolute;left:0;text-align:left;margin-left:141.15pt;margin-top:11pt;width:62.8pt;height:37.95pt;z-index:251672576;visibility:visible;mso-wrap-style:square;mso-width-percent:0;mso-height-percent:0;mso-wrap-distance-left:9pt;mso-wrap-distance-top:0;mso-wrap-distance-right:9pt;mso-wrap-distance-bottom:0;mso-position-horizontal:absolute;mso-position-horizontal-relative:text;mso-position-vertical:absolute;mso-position-vertical-relative:text;mso-width-percent:0;mso-height-percent:0;mso-width-relative:margin;mso-height-relative:margin;v-text-anchor:top" o:gfxdata="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" filled="f" stroked="f" strokeweight=".5pt">
+                <v:textbox>
+                  <w:txbxContent>
+                    <w:p>
+                      <w:pPr>
+                        <w:rPr>
+                          <w:b/>
+                          <w:bCs/>
+                          <w:color w:val="EE0000"/>
+                          <w:sz w:val="16"/>
+                          <w:szCs w:val="16"/>
+                        </w:rPr>
+                      </w:pPr>
+                      <w:r>
+                        <w:rPr>
+                          <w:b/>
+                          <w:bCs/>
+                          <w:color w:val="EE0000"/>
+                          <w:sz w:val="16"/>
+                          <w:szCs w:val="16"/>
+                        </w:rPr>
+                        <w:t>BREADBOARD PIN 1</w:t>
+                      </w:r>
+                    </w:p>
+                  </w:txbxContent>
+                </v:textbox>
+              </v:shape>
+            </w:pict>
+          </mc:Fallback>
+        </mc:AlternateContent>
+      </w:r>
+      <w:r>
+        <w:rPr>
+          <w:rFonts w:ascii="Times New Roman" w:hAnsi="Times New Roman" w:cs="Times New Roman"/>
+          <w:noProof/>
+        </w:rPr>
+        <mc:AlternateContent>
+          <mc:Choice Requires="wps">
+            <w:drawing>
+              <wp:anchor distT="0" distB="0" distL="114300" distR="114300" simplePos="0" relativeHeight="251668480" behindDoc="0" locked="0" layoutInCell="1" allowOverlap="1" wp14:anchorId="076B7C13" wp14:editId="71ED7B3D">
+                <wp:simplePos x="0" y="0"/>
+                <wp:positionH relativeFrom="column">
+                  <wp:posOffset>2029813</wp:posOffset>
+                </wp:positionH>
+                <wp:positionV relativeFrom="paragraph">
+                  <wp:posOffset>1571860</wp:posOffset>
+                </wp:positionV>
+                <wp:extent cx="797748" cy="243205"/>
+                <wp:effectExtent l="0" t="0" r="0" b="0"/>
+                <wp:wrapNone/>
+                <wp:docPr id="1232254355" name="Text Box 4"/>
+                <wp:cNvGraphicFramePr/>
+                <a:graphic xmlns:a="http://schemas.openxmlformats.org/drawingml/2006/main">
+                  <a:graphicData uri="http://schemas.microsoft.com/office/word/2010/wordprocessingShape">
+                    <wps:wsp>
+                      <wps:cNvSpPr txBox="1"/>
+                      <wps:spPr>
+                        <a:xfrm>
+                          <a:off x="0" y="0"/>
+                          <a:ext cx="797748" cy="243205"/>
+                        </a:xfrm>
+                        <a:prstGeom prst="rect">
+                          <a:avLst/>
+                        </a:prstGeom>
+                        <a:noFill/>
+                        <a:ln w="6350">
+                          <a:noFill/>
+                        </a:ln>
+                      </wps:spPr>
+                      <wps:txbx>
+                        <w:txbxContent>
+                          <w:p>
+                            <w:pPr>
+                              <w:rPr>
+                                <w:b/>
+                                <w:bCs/>
+                                <w:color w:val="EE0000"/>
+                              </w:rPr>
+                            </w:pPr>
+                            <w:r>
+                              <w:rPr>
+                                <w:b/>
+                                <w:bCs/>
+                                <w:color w:val="EE0000"/>
+                              </w:rPr>
+                              <w:t>IC PIN 1</w:t>
+                            </w:r>
+                          </w:p>
+                        </w:txbxContent>
+                      </wps:txbx>
+                      <wps:bodyPr rot="0" spcFirstLastPara="0" vertOverflow="overflow" horzOverflow="overflow" vert="horz" wrap="square" lIns="91440" tIns="45720" rIns="91440" bIns="45720" numCol="1" spcCol="0" rtlCol="0" fromWordArt="0" anchor="t" anchorCtr="0" forceAA="0" compatLnSpc="1">
+                        <a:prstTxWarp prst="textNoShape">
+                          <a:avLst/>
+                        </a:prstTxWarp>
+                        <a:noAutofit/>
+                      </wps:bodyPr>
+                    </wps:wsp>
+                  </a:graphicData>
+                </a:graphic>
+                <wp14:sizeRelH relativeFrom="margin">
+                  <wp14:pctWidth>0</wp14:pctWidth>
+                </wp14:sizeRelH>
+                <wp14:sizeRelV relativeFrom="margin">
+                  <wp14:pctHeight>0</wp14:pctHeight>
+                </wp14:sizeRelV>
+              </wp:anchor>
+            </w:drawing>
+          </mc:Choice>
+          <mc:Fallback>
+            <w:pict>
+              <v:shape w14:anchorId="076B7C13" id="_x0000_s1028" type="#_x0000_t202" style="position:absolute;left:0;text-align:left;margin-left:159.85pt;margin-top:123.75pt;width:62.8pt;height:19.15pt;z-index:251668480;visibility:visible;mso-wrap-style:square;mso-width-percent:0;mso-height-percent:0;mso-wrap-distance-left:9pt;mso-wrap-distance-top:0;mso-wrap-distance-right:9pt;mso-wrap-distance-bottom:0;mso-position-horizontal:absolute;mso-position-horizontal-relative:text;mso-position-vertical:absolute;mso-position-vertical-relative:text;mso-width-percent:0;mso-height-percent:0;mso-width-relative:margin;mso-height-relative:margin;v-text-anchor:top" o:gfxdata="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" filled="f" stroked="f" strokeweight=".5pt">
+                <v:textbox>
+                  <w:txbxContent>
+                    <w:p>
+                      <w:pPr>
+                        <w:rPr>
+                          <w:b/>
+                          <w:bCs/>
+                          <w:color w:val="EE0000"/>
+                        </w:rPr>
+                      </w:pPr>
+                      <w:r>
+                        <w:rPr>
+                          <w:b/>
+                          <w:bCs/>
+                          <w:color w:val="EE0000"/>
+                        </w:rPr>
+                        <w:t>IC PIN 1</w:t>
+                      </w:r>
+                    </w:p>
+                  </w:txbxContent>
+                </v:textbox>
+              </v:shape>
+            </w:pict>
+          </mc:Fallback>
+        </mc:AlternateContent>
+      </w:r>
+      <w:r>
+        <w:rPr>
+          <w:rFonts w:ascii="Times New Roman" w:hAnsi="Times New Roman" w:cs="Times New Roman"/>
+          <w:noProof/>
+        </w:rPr>
+        <mc:AlternateContent>
+          <mc:Choice Requires="wps">
+            <w:drawing>
+              <wp:anchor distT="0" distB="0" distL="114300" distR="114300" simplePos="0" relativeHeight="251666432" behindDoc="0" locked="0" layoutInCell="1" allowOverlap="1" wp14:anchorId="5C70865E" wp14:editId="1FD892F0">
+                <wp:simplePos x="0" y="0"/>
+                <wp:positionH relativeFrom="column">
+                  <wp:posOffset>635517</wp:posOffset>
+                </wp:positionH>
+                <wp:positionV relativeFrom="paragraph">
+                  <wp:posOffset>1570096</wp:posOffset>
+                </wp:positionV>
+                <wp:extent cx="797748" cy="243205"/>
+                <wp:effectExtent l="0" t="0" r="0" b="0"/>
+                <wp:wrapNone/>
+                <wp:docPr id="2007512842" name="Text Box 4"/>
+                <wp:cNvGraphicFramePr/>
+                <a:graphic xmlns:a="http://schemas.openxmlformats.org/drawingml/2006/main">
+                  <a:graphicData uri="http://schemas.microsoft.com/office/word/2010/wordprocessingShape">
+                    <wps:wsp>
+                      <wps:cNvSpPr txBox="1"/>
+                      <wps:spPr>
+                        <a:xfrm>
+                          <a:off x="0" y="0"/>
+                          <a:ext cx="797748" cy="243205"/>
+                        </a:xfrm>
+                        <a:prstGeom prst="rect">
+                          <a:avLst/>
+                        </a:prstGeom>
+                        <a:noFill/>
+                        <a:ln w="6350">
+                          <a:noFill/>
+                        </a:ln>
+                      </wps:spPr>
+                      <wps:txbx>
+                        <w:txbxContent>
+                          <w:p>
+                            <w:pPr>
+                              <w:rPr>
+                                <w:b/>
+                                <w:bCs/>
+                                <w:color w:val="EE0000"/>
+                              </w:rPr>
+                            </w:pPr>
+                            <w:r>
+                              <w:rPr>
+                                <w:b/>
+                                <w:bCs/>
+                                <w:color w:val="EE0000"/>
+                              </w:rPr>
+                              <w:t>IC PIN 1</w:t>
+                            </w:r>
+                          </w:p>
+                        </w:txbxContent>
+                      </wps:txbx>
+                      <wps:bodyPr rot="0" spcFirstLastPara="0" vertOverflow="overflow" horzOverflow="overflow" vert="horz" wrap="square" lIns="91440" tIns="45720" rIns="91440" bIns="45720" numCol="1" spcCol="0" rtlCol="0" fromWordArt="0" anchor="t" anchorCtr="0" forceAA="0" compatLnSpc="1">
+                        <a:prstTxWarp prst="textNoShape">
+                          <a:avLst/>
+                        </a:prstTxWarp>
+                        <a:noAutofit/>
+                      </wps:bodyPr>
+                    </wps:wsp>
+                  </a:graphicData>
+                </a:graphic>
+                <wp14:sizeRelH relativeFrom="margin">
+                  <wp14:pctWidth>0</wp14:pctWidth>
+                </wp14:sizeRelH>
+                <wp14:sizeRelV relativeFrom="margin">
+                  <wp14:pctHeight>0</wp14:pctHeight>
+                </wp14:sizeRelV>
+              </wp:anchor>
+            </w:drawing>
+          </mc:Choice>
+          <mc:Fallback>
+            <w:pict>
+              <v:shape w14:anchorId="5C70865E" id="_x0000_s1029" type="#_x0000_t202" style="position:absolute;left:0;text-align:left;margin-left:50.05pt;margin-top:123.65pt;width:62.8pt;height:19.15pt;z-index:251666432;visibility:visible;mso-wrap-style:square;mso-width-percent:0;mso-height-percent:0;mso-wrap-distance-left:9pt;mso-wrap-distance-top:0;mso-wrap-distance-right:9pt;mso-wrap-distance-bottom:0;mso-position-horizontal:absolute;mso-position-horizontal-relative:text;mso-position-vertical:absolute;mso-position-vertical-relative:text;mso-width-percent:0;mso-height-percent:0;mso-width-relative:margin;mso-height-relative:margin;v-text-anchor:top" o:gfxdata="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" filled="f" stroked="f" strokeweight=".5pt">
+                <v:textbox>
+                  <w:txbxContent>
+                    <w:p>
+                      <w:pPr>
+                        <w:rPr>
+                          <w:b/>
+                          <w:bCs/>
+                          <w:color w:val="EE0000"/>
+                        </w:rPr>
+                      </w:pPr>
+                      <w:r>
+                        <w:rPr>
+                          <w:b/>
+                          <w:bCs/>
+                          <w:color w:val="EE0000"/>
+                        </w:rPr>
+                        <w:t>IC PIN 1</w:t>
+                      </w:r>
+                    </w:p>
+                  </w:txbxContent>
+                </v:textbox>
+              </v:shape>
+            </w:pict>
+          </mc:Fallback>
+        </mc:AlternateContent>
+      </w:r>
+      <w:r>
+        <w:rPr>
+          <w:rFonts w:ascii="Times New Roman" w:hAnsi="Times New Roman" w:cs="Times New Roman"/>
+          <w:noProof/>
+        </w:rPr>
+        <mc:AlternateContent>
+          <mc:Choice Requires="wps">
+            <w:drawing>
+              <wp:anchor distT="0" distB="0" distL="114300" distR="114300" simplePos="0" relativeHeight="251665408" behindDoc="0" locked="0" layoutInCell="1" allowOverlap="1" wp14:anchorId="293B0F34" wp14:editId="604BDFE6">
+                <wp:simplePos x="0" y="0"/>
+                <wp:positionH relativeFrom="column">
+                  <wp:posOffset>962730</wp:posOffset>
+                </wp:positionH>
+                <wp:positionV relativeFrom="paragraph">
+                  <wp:posOffset>1307912</wp:posOffset>
+                </wp:positionV>
+                <wp:extent cx="45719" cy="264348"/>
+                <wp:effectExtent l="50800" t="12700" r="43815" b="15240"/>
+                <wp:wrapNone/>
+                <wp:docPr id="355891038" name="Straight Arrow Connector 3"/>
+                <wp:cNvGraphicFramePr/>
+                <a:graphic xmlns:a="http://schemas.openxmlformats.org/drawingml/2006/main">
+                  <a:graphicData uri="http://schemas.microsoft.com/office/word/2010/wordprocessingShape">
+                    <wps:wsp>
+                      <wps:cNvCnPr/>
+                      <wps:spPr>
+                        <a:xfrm flipV="1">
+                          <a:off x="0" y="0"/>
+                          <a:ext cx="45719" cy="264348"/>
+                        </a:xfrm>
+                        <a:prstGeom prst="straightConnector1">
+                          <a:avLst/>
+                        </a:prstGeom>
+                        <a:ln w="38100">
+                          <a:solidFill>
+                            <a:srgbClr val="EE0000"/>
+                          </a:solidFill>
+                          <a:tailEnd type="triangle"/>
+                        </a:ln>
+                      </wps:spPr>
+                      <wps:style>
+                        <a:lnRef idx="1">
+                          <a:schemeClr val="accent1"/>
+                        </a:lnRef>
+                        <a:fillRef idx="0">
+                          <a:schemeClr val="accent1"/>
+                        </a:fillRef>
+                        <a:effectRef idx="0">
+                          <a:schemeClr val="accent1"/>
+                        </a:effectRef>
+                        <a:fontRef idx="minor">
+                          <a:schemeClr val="tx1"/>
+                        </a:fontRef>
+                      </wps:style>
+                      <wps:bodyPr/>
+                    </wps:wsp>
+                  </a:graphicData>
+                </a:graphic>
+                <wp14:sizeRelH relativeFrom="margin">
+                  <wp14:pctWidth>0</wp14:pctWidth>
+                </wp14:sizeRelH>
+                <wp14:sizeRelV relativeFrom="margin">
+                  <wp14:pctHeight>0</wp14:pctHeight>
+                </wp14:sizeRelV>
+              </wp:anchor>
+            </w:drawing>
+          </mc:Choice>
+          <mc:Fallback>
+            <w:pict>
+              <v:shapetype w14:anchorId="356F13C4" id="_x0000_t32" coordsize="21600,21600" o:spt="32" o:oned="t" path="m,l21600,21600e" filled="f">
+                <v:path arrowok="t" fillok="f" o:connecttype="none"/>
+                <o:lock v:ext="edit" shapetype="t"/>
+              </v:shapetype>
+              <v:shape id="Straight Arrow Connector 3" o:spid="_x0000_s1026" type="#_x0000_t32" style="position:absolute;margin-left:75.8pt;margin-top:103pt;width:3.6pt;height:20.8pt;flip:y;z-index:251665408;visibility:visible;mso-wrap-style:square;mso-width-percent:0;mso-height-percent:0;mso-wrap-distance-left:9pt;mso-wrap-distance-top:0;mso-wrap-distance-right:9pt;mso-wrap-distance-bottom:0;mso-position-horizontal:absolute;mso-position-horizontal-relative:text;mso-position-vertical:absolute;mso-position-vertical-relative:text;mso-width-percent:0;mso-height-percent:0;mso-width-relative:margin;mso-height-relative:margin" o:gfxdata="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" strokecolor="#e00" strokeweight="3pt">
+                <v:stroke endarrow="block" joinstyle="miter"/>
+              </v:shape>
+            </w:pict>
+          </mc:Fallback>
+        </mc:AlternateContent>
+      </w:r>
+      <w:r>
+        <w:rPr>
+          <w:rFonts w:ascii="Times New Roman" w:hAnsi="Times New Roman" w:cs="Times New Roman"/>
+          <w:noProof/>
+        </w:rPr>
+        <mc:AlternateContent>
+          <mc:Choice Requires="wps">
+            <w:drawing>
+              <wp:anchor distT="0" distB="0" distL="114300" distR="114300" simplePos="0" relativeHeight="251663360" behindDoc="0" locked="0" layoutInCell="1" allowOverlap="1" wp14:anchorId="34917CA2" wp14:editId="2F442809">
+                <wp:simplePos x="0" y="0"/>
+                <wp:positionH relativeFrom="column">
+                  <wp:posOffset>2392210</wp:posOffset>
+                </wp:positionH>
+                <wp:positionV relativeFrom="paragraph">
+                  <wp:posOffset>1345423</wp:posOffset>
+                </wp:positionV>
+                <wp:extent cx="45719" cy="264348"/>
+                <wp:effectExtent l="50800" t="12700" r="43815" b="15240"/>
+                <wp:wrapNone/>
+                <wp:docPr id="245942063" name="Straight Arrow Connector 3"/>
+                <wp:cNvGraphicFramePr/>
+                <a:graphic xmlns:a="http://schemas.openxmlformats.org/drawingml/2006/main">
+                  <a:graphicData uri="http://schemas.microsoft.com/office/word/2010/wordprocessingShape">
+                    <wps:wsp>
+                      <wps:cNvCnPr/>
+                      <wps:spPr>
+                        <a:xfrm flipV="1">
+                          <a:off x="0" y="0"/>
+                          <a:ext cx="45719" cy="264348"/>
+                        </a:xfrm>
+                        <a:prstGeom prst="straightConnector1">
+                          <a:avLst/>
+                        </a:prstGeom>
+                        <a:ln w="38100">
+                          <a:solidFill>
+                            <a:srgbClr val="EE0000"/>
+                          </a:solidFill>
+                          <a:tailEnd type="triangle"/>
+                        </a:ln>
+                      </wps:spPr>
+                      <wps:style>
+                        <a:lnRef idx="1">
+                          <a:schemeClr val="accent1"/>
+                        </a:lnRef>
+                        <a:fillRef idx="0">
+                          <a:schemeClr val="accent1"/>
+                        </a:fillRef>
+                        <a:effectRef idx="0">
+                          <a:schemeClr val="accent1"/>
+                        </a:effectRef>
+                        <a:fontRef idx="minor">
+                          <a:schemeClr val="tx1"/>
+                        </a:fontRef>
+                      </wps:style>
+                      <wps:bodyPr/>
+                    </wps:wsp>
+                  </a:graphicData>
+                </a:graphic>
+                <wp14:sizeRelH relativeFrom="margin">
+                  <wp14:pctWidth>0</wp14:pctWidth>
+                </wp14:sizeRelH>
+                <wp14:sizeRelV relativeFrom="margin">
+                  <wp14:pctHeight>0</wp14:pctHeight>
+                </wp14:sizeRelV>
+              </wp:anchor>
+            </w:drawing>
+          </mc:Choice>
+          <mc:Fallback>
+            <w:pict>
+              <v:shape w14:anchorId="693ABB62" id="Straight Arrow Connector 3" o:spid="_x0000_s1026" type="#_x0000_t32" style="position:absolute;margin-left:188.35pt;margin-top:105.95pt;width:3.6pt;height:20.8pt;flip:y;z-index:251663360;visibility:visible;mso-wrap-style:square;mso-width-percent:0;mso-height-percent:0;mso-wrap-distance-left:9pt;mso-wrap-distance-top:0;mso-wrap-distance-right:9pt;mso-wrap-distance-bottom:0;mso-position-horizontal:absolute;mso-position-horizontal-relative:text;mso-position-vertical:absolute;mso-position-vertical-relative:text;mso-width-percent:0;mso-height-percent:0;mso-width-relative:margin;mso-height-relative:margin" o:gfxdata="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" strokecolor="#e00" strokeweight="3pt">
+                <v:stroke endarrow="block" joinstyle="miter"/>
+              </v:shape>
+            </w:pict>
+          </mc:Fallback>
+        </mc:AlternateContent>
+      </w:r>
+      <w:r>
+        <w:rPr>
+          <w:rFonts w:ascii="Times New Roman" w:hAnsi="Times New Roman" w:cs="Times New Roman"/>
+          <w:noProof/>
+        </w:rPr>
+        <mc:AlternateContent>
+          <mc:Choice Requires="wps">
+            <w:drawing>
+              <wp:anchor distT="0" distB="0" distL="114300" distR="114300" simplePos="0" relativeHeight="251661312" behindDoc="0" locked="0" layoutInCell="1" allowOverlap="1" wp14:anchorId="7BA3AE86" wp14:editId="5ACA6935">
+                <wp:simplePos x="0" y="0"/>
+                <wp:positionH relativeFrom="column">
+                  <wp:posOffset>434152</wp:posOffset>
+                </wp:positionH>
+                <wp:positionV relativeFrom="paragraph">
+                  <wp:posOffset>521312</wp:posOffset>
+                </wp:positionV>
+                <wp:extent cx="282223" cy="0"/>
+                <wp:effectExtent l="0" t="76200" r="0" b="88900"/>
+                <wp:wrapNone/>
+                <wp:docPr id="1034303529" name="Straight Arrow Connector 3"/>
+                <wp:cNvGraphicFramePr/>
+                <a:graphic xmlns:a="http://schemas.openxmlformats.org/drawingml/2006/main">
+                  <a:graphicData uri="http://schemas.microsoft.com/office/word/2010/wordprocessingShape">
+                    <wps:wsp>
+                      <wps:cNvCnPr/>
+                      <wps:spPr>
+                        <a:xfrm>
+                          <a:off x="0" y="0"/>
+                          <a:ext cx="282223" cy="0"/>
+                        </a:xfrm>
+                        <a:prstGeom prst="straightConnector1">
+                          <a:avLst/>
+                        </a:prstGeom>
+                        <a:ln w="38100">
+                          <a:solidFill>
+                            <a:srgbClr val="EE0000"/>
+                          </a:solidFill>
+                          <a:tailEnd type="triangle"/>
+                        </a:ln>
+                      </wps:spPr>
+                      <wps:style>
+                        <a:lnRef idx="1">
+                          <a:schemeClr val="accent1"/>
+                        </a:lnRef>
+                        <a:fillRef idx="0">
+                          <a:schemeClr val="accent1"/>
+                        </a:fillRef>
+                        <a:effectRef idx="0">
+                          <a:schemeClr val="accent1"/>
+                        </a:effectRef>
+                        <a:fontRef idx="minor">
+                          <a:schemeClr val="tx1"/>
+                        </a:fontRef>
+                      </wps:style>
+                      <wps:bodyPr/>
+                    </wps:wsp>
+                  </a:graphicData>
+                </a:graphic>
+              </wp:anchor>
+            </w:drawing>
+          </mc:Choice>
+          <mc:Fallback>
+            <w:pict>
+              <v:shape w14:anchorId="7BA7D751" id="Straight Arrow Connector 3" o:spid="_x0000_s1026" type="#_x0000_t32" style="position:absolute;margin-left:34.2pt;margin-top:41.05pt;width:22.2pt;height:0;z-index:251661312;visibility:visible;mso-wrap-style:square;mso-wrap-distance-left:9pt;mso-wrap-distance-top:0;mso-wrap-distance-right:9pt;mso-wrap-distance-bottom:0;mso-position-horizontal:absolute;mso-position-horizontal-relative:text;mso-position-vertical:absolute;mso-position-vertical-relative:text" o:gfxdata="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" strokecolor="#e00" strokeweight="3pt">
+                <v:stroke endarrow="block" joinstyle="miter"/>
+              </v:shape>
+            </w:pict>
+          </mc:Fallback>
+        </mc:AlternateContent>
+      </w:r>
+      <w:r>
+        <w:rPr>
+          <w:rFonts w:ascii="Times New Roman" w:hAnsi="Times New Roman" w:cs="Times New Roman"/>
+          <w:noProof/>
+        </w:rPr>
+        <mc:AlternateContent>
+          <mc:Choice Requires="wps">
+            <w:drawing>
+              <wp:anchor distT="0" distB="0" distL="114300" distR="114300" simplePos="0" relativeHeight="251659264" behindDoc="0" locked="0" layoutInCell="1" allowOverlap="1" wp14:anchorId="6FF33E7A" wp14:editId="750284DB">
+                <wp:simplePos x="0" y="0"/>
+                <wp:positionH relativeFrom="column">
+                  <wp:posOffset>1892770</wp:posOffset>
+                </wp:positionH>
+                <wp:positionV relativeFrom="paragraph">
+                  <wp:posOffset>518513</wp:posOffset>
+                </wp:positionV>
+                <wp:extent cx="282223" cy="0"/>
+                <wp:effectExtent l="0" t="76200" r="0" b="88900"/>
+                <wp:wrapNone/>
+                <wp:docPr id="718162274" name="Straight Arrow Connector 3"/>
+                <wp:cNvGraphicFramePr/>
+                <a:graphic xmlns:a="http://schemas.openxmlformats.org/drawingml/2006/main">
+                  <a:graphicData uri="http://schemas.microsoft.com/office/word/2010/wordprocessingShape">
+                    <wps:wsp>
+                      <wps:cNvCnPr/>
+                      <wps:spPr>
+                        <a:xfrm>
+                          <a:off x="0" y="0"/>
+                          <a:ext cx="282223" cy="0"/>
+                        </a:xfrm>
+                        <a:prstGeom prst="straightConnector1">
+                          <a:avLst/>
+                        </a:prstGeom>
+                        <a:ln w="38100">
+                          <a:solidFill>
+                            <a:srgbClr val="EE0000"/>
+                          </a:solidFill>
+                          <a:tailEnd type="triangle"/>
+                        </a:ln>
+                      </wps:spPr>
+                      <wps:style>
+                        <a:lnRef idx="1">
+                          <a:schemeClr val="accent1"/>
+                        </a:lnRef>
+                        <a:fillRef idx="0">
+                          <a:schemeClr val="accent1"/>
+                        </a:fillRef>
+                        <a:effectRef idx="0">
+                          <a:schemeClr val="accent1"/>
+                        </a:effectRef>
+                        <a:fontRef idx="minor">
+                          <a:schemeClr val="tx1"/>
+                        </a:fontRef>
+                      </wps:style>
+                      <wps:bodyPr/>
+                    </wps:wsp>
+                  </a:graphicData>
+                </a:graphic>
+              </wp:anchor>
+            </w:drawing>
+          </mc:Choice>
+          <mc:Fallback>
+            <w:pict>
+              <v:shape w14:anchorId="425ECCBC" id="Straight Arrow Connector 3" o:spid="_x0000_s1026" type="#_x0000_t32" style="position:absolute;margin-left:149.05pt;margin-top:40.85pt;width:22.2pt;height:0;z-index:251659264;visibility:visible;mso-wrap-style:square;mso-wrap-distance-left:9pt;mso-wrap-distance-top:0;mso-wrap-distance-right:9pt;mso-wrap-distance-bottom:0;mso-position-horizontal:absolute;mso-position-horizontal-relative:text;mso-position-vertical:absolute;mso-position-vertical-relative:text" o:gfxdata="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" strokecolor="#e00" strokeweight="3pt">
+                <v:stroke endarrow="block" joinstyle="miter"/>
+              </v:shape>
+            </w:pict>
+          </mc:Fallback>
+        </mc:AlternateContent>
+      </w:r>
+      <w:r>
+        <w:rPr>
+          <w:rFonts w:ascii="Times New Roman" w:hAnsi="Times New Roman" w:cs="Times New Roman"/>
+          <w:noProof/>
+        </w:rPr>
+        <w:drawing>
+          <wp:inline distT="0" distB="0" distL="0" distR="0" wp14:anchorId="1D7BBDFE" wp14:editId="453BCBF1">
+            <wp:extent cx="3031958" cy="1869384"/>
+            <wp:effectExtent l="0" t="0" r="3810" b="0"/>
+            <wp:docPr id="1693894639" name="Picture 1" descr="A close-up of a circuit board&#10;&#10;AI-generated content may be incorrect."/>
+            <wp:cNvGraphicFramePr>
+              <a:graphicFrameLocks xmlns:a="http://schemas.openxmlformats.org/drawingml/2006/main" noChangeAspect="1"/>
+            </wp:cNvGraphicFramePr>
+            <a:graphic xmlns:a="http://schemas.openxmlformats.org/drawingml/2006/main">
+              <a:graphicData uri="http://schemas.openxmlformats.org/drawingml/2006/picture">
+                <pic:pic xmlns:pic="http://schemas.openxmlformats.org/drawingml/2006/picture">
+                  <pic:nvPicPr>
+                    <pic:cNvPr id="1693894639" name="Picture 1" descr="A close-up of a circuit board&#10;&#10;AI-generated content may be incorrect."/>
+                    <pic:cNvPicPr/>
+                  </pic:nvPicPr>
+                  <pic:blipFill>
+                    <a:blip r:embed="rId24" cstate="print">
+                      <a:extLst>
+                        <a:ext uri="{28A0092B-C50C-407E-A947-70E740481C1C}">
+                          <a14:useLocalDpi xmlns:a14="http://schemas.microsoft.com/office/drawing/2010/main" val="0"/>
+                        </a:ext>
+                      </a:extLst>
+                    </a:blip>
+                    <a:stretch>
+                      <a:fillRect/>
+                    </a:stretch>
+                  </pic:blipFill>
+                  <pic:spPr>
+                    <a:xfrm>
+                      <a:off x="0" y="0"/>
+                      <a:ext cx="3116798" cy="1921693"/>
+                    </a:xfrm>
+                    <a:prstGeom prst="rect">
+                      <a:avLst/>
+                    </a:prstGeom>
+                  </pic:spPr>
+                </pic:pic>
+              </a:graphicData>
+            </a:graphic>
+          </wp:inline>
+        </w:drawing>
+      </w:r>
       <w:r>
         <w:rPr>
           <w:rFonts w:ascii="Times New Roman" w:hAnsi="Times New Roman" w:cs="Times New Roman"/>
@@ -6681,7 +8114,7 @@
                     </pic:cNvPicPr>
                   </pic:nvPicPr>
                   <pic:blipFill>
-                    <a:blip r:embed="rId26">
+                    <a:blip r:embed="rId25">
                       <a:extLst>
                         <a:ext uri="{28A0092B-C50C-407E-A947-70E740481C1C}">
                           <a14:useLocalDpi xmlns:a14="http://schemas.microsoft.com/office/drawing/2010/main" val="0"/>
@@ -6718,60 +8151,6 @@
         </w:rPr>
         <w:t xml:space="preserve">            </w:t>
       </w:r>
-      <w:r>
-        <w:rPr>
-          <w:rFonts w:ascii="Times New Roman" w:hAnsi="Times New Roman" w:cs="Times New Roman"/>
-          <w:noProof/>
-        </w:rPr>
-        <w:drawing>
-          <wp:inline distT="0" distB="0" distL="0" distR="0" wp14:anchorId="5DFE340B" wp14:editId="1EE93931">
-            <wp:extent cx="2044460" cy="1892084"/>
-            <wp:effectExtent l="0" t="0" r="0" b="0"/>
-            <wp:docPr id="1774422346" name="Picture 2"/>
-            <wp:cNvGraphicFramePr>
-              <a:graphicFrameLocks xmlns:a="http://schemas.openxmlformats.org/drawingml/2006/main" noChangeAspect="1"/>
-            </wp:cNvGraphicFramePr>
-            <a:graphic xmlns:a="http://schemas.openxmlformats.org/drawingml/2006/main">
-              <a:graphicData uri="http://schemas.openxmlformats.org/drawingml/2006/picture">
-                <pic:pic xmlns:pic="http://schemas.openxmlformats.org/drawingml/2006/picture">
-                  <pic:nvPicPr>
-                    <pic:cNvPr id="0" name="Picture 2"/>
-                    <pic:cNvPicPr>
-                      <a:picLocks noChangeAspect="1" noChangeArrowheads="1"/>
-                    </pic:cNvPicPr>
-                  </pic:nvPicPr>
-                  <pic:blipFill>
-                    <a:blip r:embed="rId27">
-                      <a:extLst>
-                        <a:ext uri="{28A0092B-C50C-407E-A947-70E740481C1C}">
-                          <a14:useLocalDpi xmlns:a14="http://schemas.microsoft.com/office/drawing/2010/main" val="0"/>
-                        </a:ext>
-                      </a:extLst>
-                    </a:blip>
-                    <a:srcRect/>
-                    <a:stretch>
-                      <a:fillRect/>
-                    </a:stretch>
-                  </pic:blipFill>
-                  <pic:spPr bwMode="auto">
-                    <a:xfrm>
-                      <a:off x="0" y="0"/>
-                      <a:ext cx="2047730" cy="1895111"/>
-                    </a:xfrm>
-                    <a:prstGeom prst="rect">
-                      <a:avLst/>
-                    </a:prstGeom>
-                    <a:noFill/>
-                    <a:ln>
-                      <a:noFill/>
-                    </a:ln>
-                  </pic:spPr>
-                </pic:pic>
-              </a:graphicData>
-            </a:graphic>
-          </wp:inline>
-        </w:drawing>
-      </w:r>
     </w:p>
     <w:p>
       <w:pPr>
@@ -6792,7 +8171,13 @@
         <w:rPr>
           <w:rFonts w:ascii="Times New Roman" w:hAnsi="Times New Roman" w:cs="Times New Roman"/>
         </w:rPr>
-        <w:t>5.6</w:t>
+        <w:t>5.</w:t>
+      </w:r>
+      <w:r>
+        <w:rPr>
+          <w:rFonts w:ascii="Times New Roman" w:hAnsi="Times New Roman" w:cs="Times New Roman"/>
+        </w:rPr>
+        <w:t>9</w:t>
       </w:r>
       <w:r>
         <w:rPr>
@@ -6855,21 +8240,51 @@
           <w:rFonts w:ascii="Times New Roman" w:eastAsia="Calibri" w:hAnsi="Times New Roman" w:cs="Times New Roman"/>
           <w:color w:val="000000" w:themeColor="text1"/>
         </w:rPr>
-        <w:t>5.7</w:t>
-      </w:r>
-      <w:r>
-        <w:rPr>
-          <w:rFonts w:ascii="Times New Roman" w:eastAsia="Calibri" w:hAnsi="Times New Roman" w:cs="Times New Roman"/>
-          <w:color w:val="000000" w:themeColor="text1"/>
-        </w:rPr>
-        <w:t xml:space="preserve">. Using a dual channel scope measure the outputs on pins 5 and 8 (like Figure </w:t>
-      </w:r>
-      <w:r>
-        <w:rPr>
-          <w:rFonts w:ascii="Times New Roman" w:eastAsia="Calibri" w:hAnsi="Times New Roman" w:cs="Times New Roman"/>
-          <w:color w:val="000000" w:themeColor="text1"/>
-        </w:rPr>
-        <w:t>5.7</w:t>
+        <w:t>5.</w:t>
+      </w:r>
+      <w:r>
+        <w:rPr>
+          <w:rFonts w:ascii="Times New Roman" w:eastAsia="Calibri" w:hAnsi="Times New Roman" w:cs="Times New Roman"/>
+          <w:color w:val="000000" w:themeColor="text1"/>
+        </w:rPr>
+        <w:t>10</w:t>
+      </w:r>
+      <w:r>
+        <w:rPr>
+          <w:rFonts w:ascii="Times New Roman" w:eastAsia="Calibri" w:hAnsi="Times New Roman" w:cs="Times New Roman"/>
+          <w:color w:val="000000" w:themeColor="text1"/>
+        </w:rPr>
+        <w:t xml:space="preserve">. Using a dual channel scope </w:t>
+      </w:r>
+      <w:proofErr w:type="gramStart"/>
+      <w:r>
+        <w:rPr>
+          <w:rFonts w:ascii="Times New Roman" w:eastAsia="Calibri" w:hAnsi="Times New Roman" w:cs="Times New Roman"/>
+          <w:color w:val="000000" w:themeColor="text1"/>
+        </w:rPr>
+        <w:t>measure</w:t>
+      </w:r>
+      <w:proofErr w:type="gramEnd"/>
+      <w:r>
+        <w:rPr>
+          <w:rFonts w:ascii="Times New Roman" w:eastAsia="Calibri" w:hAnsi="Times New Roman" w:cs="Times New Roman"/>
+          <w:color w:val="000000" w:themeColor="text1"/>
+        </w:rPr>
+        <w:t xml:space="preserve"> the outputs on pins 5 and 8 (like Figure </w:t>
+      </w:r>
+      <w:r>
+        <w:rPr>
+          <w:rFonts w:ascii="Times New Roman" w:eastAsia="Calibri" w:hAnsi="Times New Roman" w:cs="Times New Roman"/>
+          <w:color w:val="000000" w:themeColor="text1"/>
+        </w:rPr>
+        <w:t>5.</w:t>
+      </w:r>
+      <w:r>
+        <w:rPr>
+          <w:rFonts w:ascii="Times New Roman" w:eastAsia="Calibri" w:hAnsi="Times New Roman" w:cs="Times New Roman"/>
+          <w:color w:val="000000" w:themeColor="text1"/>
+        </w:rPr>
+        <w:t>10</w:t>
       </w:r>
       <w:r>
         <w:rPr>
@@ -6881,15 +8296,6 @@
     </w:p>
     <w:p>
       <w:pPr>
-        <w:ind w:left="360"/>
-        <w:rPr>
-          <w:rFonts w:ascii="Times New Roman" w:eastAsia="Calibri" w:hAnsi="Times New Roman" w:cs="Times New Roman"/>
-          <w:color w:val="000000" w:themeColor="text1"/>
-        </w:rPr>
-      </w:pPr>
-    </w:p>
-    <w:p>
-      <w:pPr>
         <w:jc w:val="center"/>
         <w:rPr>
           <w:rFonts w:ascii="Times New Roman" w:eastAsia="Calibri" w:hAnsi="Times New Roman" w:cs="Times New Roman"/>
@@ -6901,6 +8307,7 @@
           <w:rFonts w:ascii="Times New Roman" w:hAnsi="Times New Roman" w:cs="Times New Roman"/>
           <w:noProof/>
         </w:rPr>
+        <w:lastRenderedPageBreak/>
         <w:drawing>
           <wp:inline distT="0" distB="0" distL="0" distR="0" wp14:anchorId="542C57D6" wp14:editId="288166F5">
             <wp:extent cx="5715000" cy="2781300"/>
@@ -6917,7 +8324,7 @@
                     <pic:cNvPicPr/>
                   </pic:nvPicPr>
                   <pic:blipFill>
-                    <a:blip r:embed="rId28">
+                    <a:blip r:embed="rId26">
                       <a:extLst>
                         <a:ext uri="{28A0092B-C50C-407E-A947-70E740481C1C}">
                           <a14:useLocalDpi xmlns:a14="http://schemas.microsoft.com/office/drawing/2010/main" val="0"/>
@@ -6977,7 +8384,7 @@
           <w:i/>
           <w:iCs/>
         </w:rPr>
-        <w:t>7</w:t>
+        <w:t>10</w:t>
       </w:r>
       <w:r>
         <w:rPr>
@@ -7053,7 +8460,6 @@
           <w:sz w:val="25"/>
           <w:szCs w:val="25"/>
         </w:rPr>
-        <w:lastRenderedPageBreak/>
         <w:t>Deliverable 2</w:t>
       </w:r>
       <w:bookmarkEnd w:id="18"/>
@@ -7389,7 +8795,7 @@
         </w:rPr>
         <w:t xml:space="preserve"> For more information see </w:t>
       </w:r>
-      <w:hyperlink r:id="rId29" w:anchor="5_2" w:history="1">
+      <w:hyperlink r:id="rId27" w:anchor="5_2" w:history="1">
         <w:proofErr w:type="spellStart"/>
         <w:r>
           <w:rPr>
@@ -7629,6 +9035,7 @@
           <w:rFonts w:ascii="Times New Roman" w:eastAsia="Calibri" w:hAnsi="Times New Roman" w:cs="Times New Roman"/>
           <w:color w:val="000000" w:themeColor="text1"/>
         </w:rPr>
+        <w:lastRenderedPageBreak/>
         <w:t>If you have the SNR in d</w:t>
       </w:r>
       <w:r>
@@ -8031,17 +9438,7 @@
           <w:bCs/>
           <w:color w:val="000000" w:themeColor="text1"/>
         </w:rPr>
-        <w:t xml:space="preserve">Double check the positive and negative </w:t>
-      </w:r>
-      <w:r>
-        <w:rPr>
-          <w:rFonts w:ascii="Times New Roman" w:eastAsia="Calibri" w:hAnsi="Times New Roman" w:cs="Times New Roman"/>
-          <w:b/>
-          <w:bCs/>
-          <w:color w:val="000000" w:themeColor="text1"/>
-        </w:rPr>
-        <w:lastRenderedPageBreak/>
-        <w:t>connections before turning it on. If you are at all unsure about this measurement, ask your TA for help</w:t>
+        <w:t>Double check the positive and negative connections before turning it on. If you are at all unsure about this measurement, ask your TA for help</w:t>
       </w:r>
       <w:r>
         <w:rPr>
@@ -8306,13 +9703,27 @@
         <w:rPr>
           <w:rFonts w:ascii="Times New Roman" w:hAnsi="Times New Roman" w:cs="Times New Roman"/>
         </w:rPr>
-        <w:t xml:space="preserve"> for the harmony, and a third to interpret the music (updating the frequencies and envelopes for the other two.) You will have to add the two </w:t>
+        <w:t xml:space="preserve"> for </w:t>
       </w:r>
       <w:proofErr w:type="gramStart"/>
       <w:r>
         <w:rPr>
           <w:rFonts w:ascii="Times New Roman" w:hAnsi="Times New Roman" w:cs="Times New Roman"/>
         </w:rPr>
+        <w:t>the harmony</w:t>
+      </w:r>
+      <w:proofErr w:type="gramEnd"/>
+      <w:r>
+        <w:rPr>
+          <w:rFonts w:ascii="Times New Roman" w:hAnsi="Times New Roman" w:cs="Times New Roman"/>
+        </w:rPr>
+        <w:t xml:space="preserve">, and a third to interpret the music (updating the frequencies and envelopes for the other two.) You will have to add the two </w:t>
+      </w:r>
+      <w:proofErr w:type="gramStart"/>
+      <w:r>
+        <w:rPr>
+          <w:rFonts w:ascii="Times New Roman" w:hAnsi="Times New Roman" w:cs="Times New Roman"/>
+        </w:rPr>
         <w:t>sine-waves</w:t>
       </w:r>
       <w:proofErr w:type="gramEnd"/>
@@ -8320,7 +9731,19 @@
         <w:rPr>
           <w:rFonts w:ascii="Times New Roman" w:hAnsi="Times New Roman" w:cs="Times New Roman"/>
         </w:rPr>
-        <w:t xml:space="preserve"> together in software.</w:t>
+        <w:t xml:space="preserve"> together in software</w:t>
+      </w:r>
+      <w:r>
+        <w:rPr>
+          <w:rFonts w:ascii="Times New Roman" w:hAnsi="Times New Roman" w:cs="Times New Roman"/>
+        </w:rPr>
+        <w:t xml:space="preserve"> or in hardware</w:t>
+      </w:r>
+      <w:r>
+        <w:rPr>
+          <w:rFonts w:ascii="Times New Roman" w:hAnsi="Times New Roman" w:cs="Times New Roman"/>
+        </w:rPr>
+        <w:t>.</w:t>
       </w:r>
     </w:p>
     <w:p>
@@ -8335,7 +9758,7 @@
         </w:rPr>
         <w:t xml:space="preserve">You may (for another +5% bonus) create sine-waves with envelopes like </w:t>
       </w:r>
-      <w:hyperlink r:id="rId30" w:anchor="5_1" w:history="1">
+      <w:hyperlink r:id="rId28" w:anchor="5_1" w:history="1">
         <w:proofErr w:type="spellStart"/>
         <w:r>
           <w:rPr>
@@ -8519,6 +9942,7 @@
         <w:rPr>
           <w:rFonts w:ascii="Times New Roman" w:hAnsi="Times New Roman" w:cs="Times New Roman"/>
         </w:rPr>
+        <w:lastRenderedPageBreak/>
         <w:t xml:space="preserve">Lab </w:t>
       </w:r>
       <w:r>
@@ -8564,7 +9988,21 @@
           <w:rFonts w:ascii="Times New Roman" w:hAnsi="Times New Roman" w:cs="Times New Roman"/>
           <w:color w:val="FF0000"/>
         </w:rPr>
-        <w:t>M/T lab session</w:t>
+        <w:t>M/T lab se</w:t>
+      </w:r>
+      <w:r>
+        <w:rPr>
+          <w:rFonts w:ascii="Times New Roman" w:hAnsi="Times New Roman" w:cs="Times New Roman"/>
+          <w:color w:val="FF0000"/>
+        </w:rPr>
+        <w:t>ct</w:t>
+      </w:r>
+      <w:r>
+        <w:rPr>
+          <w:rFonts w:ascii="Times New Roman" w:hAnsi="Times New Roman" w:cs="Times New Roman"/>
+          <w:color w:val="FF0000"/>
+        </w:rPr>
+        <w:t>ion</w:t>
       </w:r>
       <w:r>
         <w:rPr>
@@ -8656,12 +10094,8 @@
       </w:pPr>
     </w:p>
     <w:sectPr>
-      <w:headerReference w:type="even" r:id="rId31"/>
-      <w:headerReference w:type="default" r:id="rId32"/>
-      <w:footerReference w:type="even" r:id="rId33"/>
-      <w:footerReference w:type="default" r:id="rId34"/>
-      <w:headerReference w:type="first" r:id="rId35"/>
-      <w:footerReference w:type="first" r:id="rId36"/>
+      <w:headerReference w:type="default" r:id="rId29"/>
+      <w:footerReference w:type="default" r:id="rId30"/>
       <w:pgSz w:w="12240" w:h="15840"/>
       <w:pgMar w:top="1440" w:right="1440" w:bottom="1440" w:left="1440" w:header="720" w:footer="720" w:gutter="0"/>
       <w:cols w:space="720"/>
@@ -8672,7 +10106,7 @@
 </file>
 
 <file path=word/endnotes.xml><?xml version="1.0" encoding="utf-8"?>
-<w:endnotes xmlns:wpc="http://schemas.microsoft.com/office/word/2010/wordprocessingCanvas" xmlns:cx="http://schemas.microsoft.com/office/drawing/2014/chartex" xmlns:cx1="http://schemas.microsoft.com/office/drawing/2015/9/8/chartex" xmlns:cx2="http://schemas.microsoft.com/office/drawing/2015/10/21/chartex" xmlns:cx3="http://schemas.microsoft.com/office/drawing/2016/5/9/chartex" xmlns:cx4="http://schemas.microsoft.com/office/drawing/2016/5/10/chartex" xmlns:cx5="http://schemas.microsoft.com/office/drawing/2016/5/11/chartex" xmlns:cx6="http://schemas.microsoft.com/office/drawing/2016/5/12/chartex" xmlns:cx7="http://schemas.microsoft.com/office/drawing/2016/5/13/chartex" xmlns:cx8="http://schemas.microsoft.com/office/drawing/2016/5/14/chartex" xmlns:mc="http://schemas.openxmlformats.org/markup-compatibility/2006" xmlns:aink="http://schemas.microsoft.com/office/drawing/2016/ink" xmlns:am3d="http://schemas.microsoft.com/office/drawing/2017/model3d" xmlns:o="urn:schemas-microsoft-com:office:office" xmlns:oel="http://schemas.microsoft.com/office/2019/extlst" xmlns:r="http://schemas.openxmlformats.org/officeDocument/2006/relationships" xmlns:m="http://schemas.openxmlformats.org/officeDocument/2006/math" xmlns:v="urn:schemas-microsoft-com:vml" xmlns:wp14="http://schemas.microsoft.com/office/word/2010/wordprocessingDrawing" xmlns:wp="http://schemas.openxmlformats.org/drawingml/2006/wordprocessingDrawing" xmlns:w10="urn:schemas-microsoft-com:office:word" xmlns:w="http://schemas.openxmlformats.org/wordprocessingml/2006/main" xmlns:w14="http://schemas.microsoft.com/office/word/2010/wordml" xmlns:w15="http://schemas.microsoft.com/office/word/2012/wordml" xmlns:w16cex="http://schemas.microsoft.com/office/word/2018/wordml/cex" xmlns:w16cid="http://schemas.microsoft.com/office/word/2016/wordml/cid" xmlns:w16="http://schemas.microsoft.com/office/word/2018/wordml" xmlns:w16du="http://schemas.microsoft.com/office/word/2023/wordml/word16du" xmlns:w16sdtdh="http://schemas.microsoft.com/office/word/2020/wordml/sdtdatahash" xmlns:w16sdtfl="http://schemas.microsoft.com/office/word/2024/wordml/sdtformatlock" xmlns:w16se="http://schemas.microsoft.com/office/word/2015/wordml/symex" xmlns:wpg="http://schemas.microsoft.com/office/word/2010/wordprocessingGroup" xmlns:wpi="http://schemas.microsoft.com/office/word/2010/wordprocessingInk" xmlns:wne="http://schemas.microsoft.com/office/word/2006/wordml" xmlns:wps="http://schemas.microsoft.com/office/word/2010/wordprocessingShape" mc:Ignorable="w14 w15 w16se w16cid w16 w16cex w16sdtdh w16sdtfl w16du wp14">
+<w:endnotes xmlns:wpc="http://schemas.microsoft.com/office/word/2010/wordprocessingCanvas" xmlns:cx="http://schemas.microsoft.com/office/drawing/2014/chartex" xmlns:cx1="http://schemas.microsoft.com/office/drawing/2015/9/8/chartex" xmlns:cx2="http://schemas.microsoft.com/office/drawing/2015/10/21/chartex" xmlns:cx3="http://schemas.microsoft.com/office/drawing/2016/5/9/chartex" xmlns:cx4="http://schemas.microsoft.com/office/drawing/2016/5/10/chartex" xmlns:cx5="http://schemas.microsoft.com/office/drawing/2016/5/11/chartex" xmlns:cx6="http://schemas.microsoft.com/office/drawing/2016/5/12/chartex" xmlns:cx7="http://schemas.microsoft.com/office/drawing/2016/5/13/chartex" xmlns:cx8="http://schemas.microsoft.com/office/drawing/2016/5/14/chartex" xmlns:mc="http://schemas.openxmlformats.org/markup-compatibility/2006" xmlns:aink="http://schemas.microsoft.com/office/drawing/2016/ink" xmlns:am3d="http://schemas.microsoft.com/office/drawing/2017/model3d" xmlns:o="urn:schemas-microsoft-com:office:office" xmlns:oel="http://schemas.microsoft.com/office/2019/extlst" xmlns:r="http://schemas.openxmlformats.org/officeDocument/2006/relationships" xmlns:m="http://schemas.openxmlformats.org/officeDocument/2006/math" xmlns:v="urn:schemas-microsoft-com:vml" xmlns:wp14="http://schemas.microsoft.com/office/word/2010/wordprocessingDrawing" xmlns:wp="http://schemas.openxmlformats.org/drawingml/2006/wordprocessingDrawing" xmlns:w10="urn:schemas-microsoft-com:office:word" xmlns:w="http://schemas.openxmlformats.org/wordprocessingml/2006/main" xmlns:w14="http://schemas.microsoft.com/office/word/2010/wordml" xmlns:w15="http://schemas.microsoft.com/office/word/2012/wordml" xmlns:w16cei="http://schemas.microsoft.com/office/word/2026/wordml/cei" xmlns:w16cex="http://schemas.microsoft.com/office/word/2018/wordml/cex" xmlns:w16cid="http://schemas.microsoft.com/office/word/2016/wordml/cid" xmlns:w16="http://schemas.microsoft.com/office/word/2018/wordml" xmlns:w16du="http://schemas.microsoft.com/office/word/2023/wordml/word16du" xmlns:w16sdtdh="http://schemas.microsoft.com/office/word/2020/wordml/sdtdatahash" xmlns:w16sdtfl="http://schemas.microsoft.com/office/word/2024/wordml/sdtformatlock" xmlns:w16se="http://schemas.microsoft.com/office/word/2015/wordml/symex" xmlns:wpg="http://schemas.microsoft.com/office/word/2010/wordprocessingGroup" xmlns:wpi="http://schemas.microsoft.com/office/word/2010/wordprocessingInk" xmlns:wne="http://schemas.microsoft.com/office/word/2006/wordml" xmlns:wps="http://schemas.microsoft.com/office/word/2010/wordprocessingShape" mc:Ignorable="w14 w15 w16se w16cid w16 w16cex w16sdtdh w16sdtfl w16du wp14">
   <w:endnote w:type="separator" w:id="-1">
     <w:p>
       <w:pPr>
@@ -8697,17 +10131,7 @@
 </file>
 
 <file path=word/footer1.xml><?xml version="1.0" encoding="utf-8"?>
-<w:ftr xmlns:wpc="http://schemas.microsoft.com/office/word/2010/wordprocessingCanvas" xmlns:cx="http://schemas.microsoft.com/office/drawing/2014/chartex" xmlns:cx1="http://schemas.microsoft.com/office/drawing/2015/9/8/chartex" xmlns:cx2="http://schemas.microsoft.com/office/drawing/2015/10/21/chartex" xmlns:cx3="http://schemas.microsoft.com/office/drawing/2016/5/9/chartex" xmlns:cx4="http://schemas.microsoft.com/office/drawing/2016/5/10/chartex" xmlns:cx5="http://schemas.microsoft.com/office/drawing/2016/5/11/chartex" xmlns:cx6="http://schemas.microsoft.com/office/drawing/2016/5/12/chartex" xmlns:cx7="http://schemas.microsoft.com/office/drawing/2016/5/13/chartex" xmlns:cx8="http://schemas.microsoft.com/office/drawing/2016/5/14/chartex" xmlns:mc="http://schemas.openxmlformats.org/markup-compatibility/2006" xmlns:aink="http://schemas.microsoft.com/office/drawing/2016/ink" xmlns:am3d="http://schemas.microsoft.com/office/drawing/2017/model3d" xmlns:o="urn:schemas-microsoft-com:office:office" xmlns:oel="http://schemas.microsoft.com/office/2019/extlst" xmlns:r="http://schemas.openxmlformats.org/officeDocument/2006/relationships" xmlns:m="http://schemas.openxmlformats.org/officeDocument/2006/math" xmlns:v="urn:schemas-microsoft-com:vml" xmlns:wp14="http://schemas.microsoft.com/office/word/2010/wordprocessingDrawing" xmlns:wp="http://schemas.openxmlformats.org/drawingml/2006/wordprocessingDrawing" xmlns:w10="urn:schemas-microsoft-com:office:word" xmlns:w="http://schemas.openxmlformats.org/wordprocessingml/2006/main" xmlns:w14="http://schemas.microsoft.com/office/word/2010/wordml" xmlns:w15="http://schemas.microsoft.com/office/word/2012/wordml" xmlns:w16cex="http://schemas.microsoft.com/office/word/2018/wordml/cex" xmlns:w16cid="http://schemas.microsoft.com/office/word/2016/wordml/cid" xmlns:w16="http://schemas.microsoft.com/office/word/2018/wordml" xmlns:w16du="http://schemas.microsoft.com/office/word/2023/wordml/word16du" xmlns:w16sdtdh="http://schemas.microsoft.com/office/word/2020/wordml/sdtdatahash" xmlns:w16sdtfl="http://schemas.microsoft.com/office/word/2024/wordml/sdtformatlock" xmlns:w16se="http://schemas.microsoft.com/office/word/2015/wordml/symex" xmlns:wpg="http://schemas.microsoft.com/office/word/2010/wordprocessingGroup" xmlns:wpi="http://schemas.microsoft.com/office/word/2010/wordprocessingInk" xmlns:wne="http://schemas.microsoft.com/office/word/2006/wordml" xmlns:wps="http://schemas.microsoft.com/office/word/2010/wordprocessingShape" mc:Ignorable="w14 w15 w16se w16cid w16 w16cex w16sdtdh w16sdtfl w16du wp14">
-  <w:p>
-    <w:pPr>
-      <w:pStyle w:val="Footer"/>
-    </w:pPr>
-  </w:p>
-</w:ftr>
-</file>
-
-<file path=word/footer2.xml><?xml version="1.0" encoding="utf-8"?>
-<w:ftr xmlns:wpc="http://schemas.microsoft.com/office/word/2010/wordprocessingCanvas" xmlns:cx="http://schemas.microsoft.com/office/drawing/2014/chartex" xmlns:cx1="http://schemas.microsoft.com/office/drawing/2015/9/8/chartex" xmlns:cx2="http://schemas.microsoft.com/office/drawing/2015/10/21/chartex" xmlns:cx3="http://schemas.microsoft.com/office/drawing/2016/5/9/chartex" xmlns:cx4="http://schemas.microsoft.com/office/drawing/2016/5/10/chartex" xmlns:cx5="http://schemas.microsoft.com/office/drawing/2016/5/11/chartex" xmlns:cx6="http://schemas.microsoft.com/office/drawing/2016/5/12/chartex" xmlns:cx7="http://schemas.microsoft.com/office/drawing/2016/5/13/chartex" xmlns:cx8="http://schemas.microsoft.com/office/drawing/2016/5/14/chartex" xmlns:mc="http://schemas.openxmlformats.org/markup-compatibility/2006" xmlns:aink="http://schemas.microsoft.com/office/drawing/2016/ink" xmlns:am3d="http://schemas.microsoft.com/office/drawing/2017/model3d" xmlns:o="urn:schemas-microsoft-com:office:office" xmlns:oel="http://schemas.microsoft.com/office/2019/extlst" xmlns:r="http://schemas.openxmlformats.org/officeDocument/2006/relationships" xmlns:m="http://schemas.openxmlformats.org/officeDocument/2006/math" xmlns:v="urn:schemas-microsoft-com:vml" xmlns:wp14="http://schemas.microsoft.com/office/word/2010/wordprocessingDrawing" xmlns:wp="http://schemas.openxmlformats.org/drawingml/2006/wordprocessingDrawing" xmlns:w10="urn:schemas-microsoft-com:office:word" xmlns:w="http://schemas.openxmlformats.org/wordprocessingml/2006/main" xmlns:w14="http://schemas.microsoft.com/office/word/2010/wordml" xmlns:w15="http://schemas.microsoft.com/office/word/2012/wordml" xmlns:w16cex="http://schemas.microsoft.com/office/word/2018/wordml/cex" xmlns:w16cid="http://schemas.microsoft.com/office/word/2016/wordml/cid" xmlns:w16="http://schemas.microsoft.com/office/word/2018/wordml" xmlns:w16du="http://schemas.microsoft.com/office/word/2023/wordml/word16du" xmlns:w16sdtdh="http://schemas.microsoft.com/office/word/2020/wordml/sdtdatahash" xmlns:w16sdtfl="http://schemas.microsoft.com/office/word/2024/wordml/sdtformatlock" xmlns:w16se="http://schemas.microsoft.com/office/word/2015/wordml/symex" xmlns:wpg="http://schemas.microsoft.com/office/word/2010/wordprocessingGroup" xmlns:wpi="http://schemas.microsoft.com/office/word/2010/wordprocessingInk" xmlns:wne="http://schemas.microsoft.com/office/word/2006/wordml" xmlns:wps="http://schemas.microsoft.com/office/word/2010/wordprocessingShape" mc:Ignorable="w14 w15 w16se w16cid w16 w16cex w16sdtdh w16sdtfl w16du wp14">
+<w:ftr xmlns:wpc="http://schemas.microsoft.com/office/word/2010/wordprocessingCanvas" xmlns:cx="http://schemas.microsoft.com/office/drawing/2014/chartex" xmlns:cx1="http://schemas.microsoft.com/office/drawing/2015/9/8/chartex" xmlns:cx2="http://schemas.microsoft.com/office/drawing/2015/10/21/chartex" xmlns:cx3="http://schemas.microsoft.com/office/drawing/2016/5/9/chartex" xmlns:cx4="http://schemas.microsoft.com/office/drawing/2016/5/10/chartex" xmlns:cx5="http://schemas.microsoft.com/office/drawing/2016/5/11/chartex" xmlns:cx6="http://schemas.microsoft.com/office/drawing/2016/5/12/chartex" xmlns:cx7="http://schemas.microsoft.com/office/drawing/2016/5/13/chartex" xmlns:cx8="http://schemas.microsoft.com/office/drawing/2016/5/14/chartex" xmlns:mc="http://schemas.openxmlformats.org/markup-compatibility/2006" xmlns:aink="http://schemas.microsoft.com/office/drawing/2016/ink" xmlns:am3d="http://schemas.microsoft.com/office/drawing/2017/model3d" xmlns:o="urn:schemas-microsoft-com:office:office" xmlns:oel="http://schemas.microsoft.com/office/2019/extlst" xmlns:r="http://schemas.openxmlformats.org/officeDocument/2006/relationships" xmlns:m="http://schemas.openxmlformats.org/officeDocument/2006/math" xmlns:v="urn:schemas-microsoft-com:vml" xmlns:wp14="http://schemas.microsoft.com/office/word/2010/wordprocessingDrawing" xmlns:wp="http://schemas.openxmlformats.org/drawingml/2006/wordprocessingDrawing" xmlns:w10="urn:schemas-microsoft-com:office:word" xmlns:w="http://schemas.openxmlformats.org/wordprocessingml/2006/main" xmlns:w14="http://schemas.microsoft.com/office/word/2010/wordml" xmlns:w15="http://schemas.microsoft.com/office/word/2012/wordml" xmlns:w16cei="http://schemas.microsoft.com/office/word/2026/wordml/cei" xmlns:w16cex="http://schemas.microsoft.com/office/word/2018/wordml/cex" xmlns:w16cid="http://schemas.microsoft.com/office/word/2016/wordml/cid" xmlns:w16="http://schemas.microsoft.com/office/word/2018/wordml" xmlns:w16du="http://schemas.microsoft.com/office/word/2023/wordml/word16du" xmlns:w16sdtdh="http://schemas.microsoft.com/office/word/2020/wordml/sdtdatahash" xmlns:w16sdtfl="http://schemas.microsoft.com/office/word/2024/wordml/sdtformatlock" xmlns:w16se="http://schemas.microsoft.com/office/word/2015/wordml/symex" xmlns:wpg="http://schemas.microsoft.com/office/word/2010/wordprocessingGroup" xmlns:wpi="http://schemas.microsoft.com/office/word/2010/wordprocessingInk" xmlns:wne="http://schemas.microsoft.com/office/word/2006/wordml" xmlns:wps="http://schemas.microsoft.com/office/word/2010/wordprocessingShape" mc:Ignorable="w14 w15 w16se w16cid w16 w16cex w16sdtdh w16sdtfl w16du wp14">
   <w:tbl>
     <w:tblPr>
       <w:tblW w:w="0" w:type="auto"/>
@@ -8785,18 +10209,8 @@
 </w:ftr>
 </file>
 
-<file path=word/footer3.xml><?xml version="1.0" encoding="utf-8"?>
-<w:ftr xmlns:wpc="http://schemas.microsoft.com/office/word/2010/wordprocessingCanvas" xmlns:cx="http://schemas.microsoft.com/office/drawing/2014/chartex" xmlns:cx1="http://schemas.microsoft.com/office/drawing/2015/9/8/chartex" xmlns:cx2="http://schemas.microsoft.com/office/drawing/2015/10/21/chartex" xmlns:cx3="http://schemas.microsoft.com/office/drawing/2016/5/9/chartex" xmlns:cx4="http://schemas.microsoft.com/office/drawing/2016/5/10/chartex" xmlns:cx5="http://schemas.microsoft.com/office/drawing/2016/5/11/chartex" xmlns:cx6="http://schemas.microsoft.com/office/drawing/2016/5/12/chartex" xmlns:cx7="http://schemas.microsoft.com/office/drawing/2016/5/13/chartex" xmlns:cx8="http://schemas.microsoft.com/office/drawing/2016/5/14/chartex" xmlns:mc="http://schemas.openxmlformats.org/markup-compatibility/2006" xmlns:aink="http://schemas.microsoft.com/office/drawing/2016/ink" xmlns:am3d="http://schemas.microsoft.com/office/drawing/2017/model3d" xmlns:o="urn:schemas-microsoft-com:office:office" xmlns:oel="http://schemas.microsoft.com/office/2019/extlst" xmlns:r="http://schemas.openxmlformats.org/officeDocument/2006/relationships" xmlns:m="http://schemas.openxmlformats.org/officeDocument/2006/math" xmlns:v="urn:schemas-microsoft-com:vml" xmlns:wp14="http://schemas.microsoft.com/office/word/2010/wordprocessingDrawing" xmlns:wp="http://schemas.openxmlformats.org/drawingml/2006/wordprocessingDrawing" xmlns:w10="urn:schemas-microsoft-com:office:word" xmlns:w="http://schemas.openxmlformats.org/wordprocessingml/2006/main" xmlns:w14="http://schemas.microsoft.com/office/word/2010/wordml" xmlns:w15="http://schemas.microsoft.com/office/word/2012/wordml" xmlns:w16cex="http://schemas.microsoft.com/office/word/2018/wordml/cex" xmlns:w16cid="http://schemas.microsoft.com/office/word/2016/wordml/cid" xmlns:w16="http://schemas.microsoft.com/office/word/2018/wordml" xmlns:w16du="http://schemas.microsoft.com/office/word/2023/wordml/word16du" xmlns:w16sdtdh="http://schemas.microsoft.com/office/word/2020/wordml/sdtdatahash" xmlns:w16sdtfl="http://schemas.microsoft.com/office/word/2024/wordml/sdtformatlock" xmlns:w16se="http://schemas.microsoft.com/office/word/2015/wordml/symex" xmlns:wpg="http://schemas.microsoft.com/office/word/2010/wordprocessingGroup" xmlns:wpi="http://schemas.microsoft.com/office/word/2010/wordprocessingInk" xmlns:wne="http://schemas.microsoft.com/office/word/2006/wordml" xmlns:wps="http://schemas.microsoft.com/office/word/2010/wordprocessingShape" mc:Ignorable="w14 w15 w16se w16cid w16 w16cex w16sdtdh w16sdtfl w16du wp14">
-  <w:p>
-    <w:pPr>
-      <w:pStyle w:val="Footer"/>
-    </w:pPr>
-  </w:p>
-</w:ftr>
-</file>
-
 <file path=word/footnotes.xml><?xml version="1.0" encoding="utf-8"?>
-<w:footnotes xmlns:wpc="http://schemas.microsoft.com/office/word/2010/wordprocessingCanvas" xmlns:cx="http://schemas.microsoft.com/office/drawing/2014/chartex" xmlns:cx1="http://schemas.microsoft.com/office/drawing/2015/9/8/chartex" xmlns:cx2="http://schemas.microsoft.com/office/drawing/2015/10/21/chartex" xmlns:cx3="http://schemas.microsoft.com/office/drawing/2016/5/9/chartex" xmlns:cx4="http://schemas.microsoft.com/office/drawing/2016/5/10/chartex" xmlns:cx5="http://schemas.microsoft.com/office/drawing/2016/5/11/chartex" xmlns:cx6="http://schemas.microsoft.com/office/drawing/2016/5/12/chartex" xmlns:cx7="http://schemas.microsoft.com/office/drawing/2016/5/13/chartex" xmlns:cx8="http://schemas.microsoft.com/office/drawing/2016/5/14/chartex" xmlns:mc="http://schemas.openxmlformats.org/markup-compatibility/2006" xmlns:aink="http://schemas.microsoft.com/office/drawing/2016/ink" xmlns:am3d="http://schemas.microsoft.com/office/drawing/2017/model3d" xmlns:o="urn:schemas-microsoft-com:office:office" xmlns:oel="http://schemas.microsoft.com/office/2019/extlst" xmlns:r="http://schemas.openxmlformats.org/officeDocument/2006/relationships" xmlns:m="http://schemas.openxmlformats.org/officeDocument/2006/math" xmlns:v="urn:schemas-microsoft-com:vml" xmlns:wp14="http://schemas.microsoft.com/office/word/2010/wordprocessingDrawing" xmlns:wp="http://schemas.openxmlformats.org/drawingml/2006/wordprocessingDrawing" xmlns:w10="urn:schemas-microsoft-com:office:word" xmlns:w="http://schemas.openxmlformats.org/wordprocessingml/2006/main" xmlns:w14="http://schemas.microsoft.com/office/word/2010/wordml" xmlns:w15="http://schemas.microsoft.com/office/word/2012/wordml" xmlns:w16cex="http://schemas.microsoft.com/office/word/2018/wordml/cex" xmlns:w16cid="http://schemas.microsoft.com/office/word/2016/wordml/cid" xmlns:w16="http://schemas.microsoft.com/office/word/2018/wordml" xmlns:w16du="http://schemas.microsoft.com/office/word/2023/wordml/word16du" xmlns:w16sdtdh="http://schemas.microsoft.com/office/word/2020/wordml/sdtdatahash" xmlns:w16sdtfl="http://schemas.microsoft.com/office/word/2024/wordml/sdtformatlock" xmlns:w16se="http://schemas.microsoft.com/office/word/2015/wordml/symex" xmlns:wpg="http://schemas.microsoft.com/office/word/2010/wordprocessingGroup" xmlns:wpi="http://schemas.microsoft.com/office/word/2010/wordprocessingInk" xmlns:wne="http://schemas.microsoft.com/office/word/2006/wordml" xmlns:wps="http://schemas.microsoft.com/office/word/2010/wordprocessingShape" mc:Ignorable="w14 w15 w16se w16cid w16 w16cex w16sdtdh w16sdtfl w16du wp14">
+<w:footnotes xmlns:wpc="http://schemas.microsoft.com/office/word/2010/wordprocessingCanvas" xmlns:cx="http://schemas.microsoft.com/office/drawing/2014/chartex" xmlns:cx1="http://schemas.microsoft.com/office/drawing/2015/9/8/chartex" xmlns:cx2="http://schemas.microsoft.com/office/drawing/2015/10/21/chartex" xmlns:cx3="http://schemas.microsoft.com/office/drawing/2016/5/9/chartex" xmlns:cx4="http://schemas.microsoft.com/office/drawing/2016/5/10/chartex" xmlns:cx5="http://schemas.microsoft.com/office/drawing/2016/5/11/chartex" xmlns:cx6="http://schemas.microsoft.com/office/drawing/2016/5/12/chartex" xmlns:cx7="http://schemas.microsoft.com/office/drawing/2016/5/13/chartex" xmlns:cx8="http://schemas.microsoft.com/office/drawing/2016/5/14/chartex" xmlns:mc="http://schemas.openxmlformats.org/markup-compatibility/2006" xmlns:aink="http://schemas.microsoft.com/office/drawing/2016/ink" xmlns:am3d="http://schemas.microsoft.com/office/drawing/2017/model3d" xmlns:o="urn:schemas-microsoft-com:office:office" xmlns:oel="http://schemas.microsoft.com/office/2019/extlst" xmlns:r="http://schemas.openxmlformats.org/officeDocument/2006/relationships" xmlns:m="http://schemas.openxmlformats.org/officeDocument/2006/math" xmlns:v="urn:schemas-microsoft-com:vml" xmlns:wp14="http://schemas.microsoft.com/office/word/2010/wordprocessingDrawing" xmlns:wp="http://schemas.openxmlformats.org/drawingml/2006/wordprocessingDrawing" xmlns:w10="urn:schemas-microsoft-com:office:word" xmlns:w="http://schemas.openxmlformats.org/wordprocessingml/2006/main" xmlns:w14="http://schemas.microsoft.com/office/word/2010/wordml" xmlns:w15="http://schemas.microsoft.com/office/word/2012/wordml" xmlns:w16cei="http://schemas.microsoft.com/office/word/2026/wordml/cei" xmlns:w16cex="http://schemas.microsoft.com/office/word/2018/wordml/cex" xmlns:w16cid="http://schemas.microsoft.com/office/word/2016/wordml/cid" xmlns:w16="http://schemas.microsoft.com/office/word/2018/wordml" xmlns:w16du="http://schemas.microsoft.com/office/word/2023/wordml/word16du" xmlns:w16sdtdh="http://schemas.microsoft.com/office/word/2020/wordml/sdtdatahash" xmlns:w16sdtfl="http://schemas.microsoft.com/office/word/2024/wordml/sdtformatlock" xmlns:w16se="http://schemas.microsoft.com/office/word/2015/wordml/symex" xmlns:wpg="http://schemas.microsoft.com/office/word/2010/wordprocessingGroup" xmlns:wpi="http://schemas.microsoft.com/office/word/2010/wordprocessingInk" xmlns:wne="http://schemas.microsoft.com/office/word/2006/wordml" xmlns:wps="http://schemas.microsoft.com/office/word/2010/wordprocessingShape" mc:Ignorable="w14 w15 w16se w16cid w16 w16cex w16sdtdh w16sdtfl w16du wp14">
   <w:footnote w:type="separator" w:id="-1">
     <w:p>
       <w:pPr>
@@ -8821,17 +10235,7 @@
 </file>
 
 <file path=word/header1.xml><?xml version="1.0" encoding="utf-8"?>
-<w:hdr xmlns:wpc="http://schemas.microsoft.com/office/word/2010/wordprocessingCanvas" xmlns:cx="http://schemas.microsoft.com/office/drawing/2014/chartex" xmlns:cx1="http://schemas.microsoft.com/office/drawing/2015/9/8/chartex" xmlns:cx2="http://schemas.microsoft.com/office/drawing/2015/10/21/chartex" xmlns:cx3="http://schemas.microsoft.com/office/drawing/2016/5/9/chartex" xmlns:cx4="http://schemas.microsoft.com/office/drawing/2016/5/10/chartex" xmlns:cx5="http://schemas.microsoft.com/office/drawing/2016/5/11/chartex" xmlns:cx6="http://schemas.microsoft.com/office/drawing/2016/5/12/chartex" xmlns:cx7="http://schemas.microsoft.com/office/drawing/2016/5/13/chartex" xmlns:cx8="http://schemas.microsoft.com/office/drawing/2016/5/14/chartex" xmlns:mc="http://schemas.openxmlformats.org/markup-compatibility/2006" xmlns:aink="http://schemas.microsoft.com/office/drawing/2016/ink" xmlns:am3d="http://schemas.microsoft.com/office/drawing/2017/model3d" xmlns:o="urn:schemas-microsoft-com:office:office" xmlns:oel="http://schemas.microsoft.com/office/2019/extlst" xmlns:r="http://schemas.openxmlformats.org/officeDocument/2006/relationships" xmlns:m="http://schemas.openxmlformats.org/officeDocument/2006/math" xmlns:v="urn:schemas-microsoft-com:vml" xmlns:wp14="http://schemas.microsoft.com/office/word/2010/wordprocessingDrawing" xmlns:wp="http://schemas.openxmlformats.org/drawingml/2006/wordprocessingDrawing" xmlns:w10="urn:schemas-microsoft-com:office:word" xmlns:w="http://schemas.openxmlformats.org/wordprocessingml/2006/main" xmlns:w14="http://schemas.microsoft.com/office/word/2010/wordml" xmlns:w15="http://schemas.microsoft.com/office/word/2012/wordml" xmlns:w16cex="http://schemas.microsoft.com/office/word/2018/wordml/cex" xmlns:w16cid="http://schemas.microsoft.com/office/word/2016/wordml/cid" xmlns:w16="http://schemas.microsoft.com/office/word/2018/wordml" xmlns:w16du="http://schemas.microsoft.com/office/word/2023/wordml/word16du" xmlns:w16sdtdh="http://schemas.microsoft.com/office/word/2020/wordml/sdtdatahash" xmlns:w16sdtfl="http://schemas.microsoft.com/office/word/2024/wordml/sdtformatlock" xmlns:w16se="http://schemas.microsoft.com/office/word/2015/wordml/symex" xmlns:wpg="http://schemas.microsoft.com/office/word/2010/wordprocessingGroup" xmlns:wpi="http://schemas.microsoft.com/office/word/2010/wordprocessingInk" xmlns:wne="http://schemas.microsoft.com/office/word/2006/wordml" xmlns:wps="http://schemas.microsoft.com/office/word/2010/wordprocessingShape" mc:Ignorable="w14 w15 w16se w16cid w16 w16cex w16sdtdh w16sdtfl w16du wp14">
-  <w:p>
-    <w:pPr>
-      <w:pStyle w:val="Header"/>
-    </w:pPr>
-  </w:p>
-</w:hdr>
-</file>
-
-<file path=word/header2.xml><?xml version="1.0" encoding="utf-8"?>
-<w:hdr xmlns:wpc="http://schemas.microsoft.com/office/word/2010/wordprocessingCanvas" xmlns:cx="http://schemas.microsoft.com/office/drawing/2014/chartex" xmlns:cx1="http://schemas.microsoft.com/office/drawing/2015/9/8/chartex" xmlns:cx2="http://schemas.microsoft.com/office/drawing/2015/10/21/chartex" xmlns:cx3="http://schemas.microsoft.com/office/drawing/2016/5/9/chartex" xmlns:cx4="http://schemas.microsoft.com/office/drawing/2016/5/10/chartex" xmlns:cx5="http://schemas.microsoft.com/office/drawing/2016/5/11/chartex" xmlns:cx6="http://schemas.microsoft.com/office/drawing/2016/5/12/chartex" xmlns:cx7="http://schemas.microsoft.com/office/drawing/2016/5/13/chartex" xmlns:cx8="http://schemas.microsoft.com/office/drawing/2016/5/14/chartex" xmlns:mc="http://schemas.openxmlformats.org/markup-compatibility/2006" xmlns:aink="http://schemas.microsoft.com/office/drawing/2016/ink" xmlns:am3d="http://schemas.microsoft.com/office/drawing/2017/model3d" xmlns:o="urn:schemas-microsoft-com:office:office" xmlns:oel="http://schemas.microsoft.com/office/2019/extlst" xmlns:r="http://schemas.openxmlformats.org/officeDocument/2006/relationships" xmlns:m="http://schemas.openxmlformats.org/officeDocument/2006/math" xmlns:v="urn:schemas-microsoft-com:vml" xmlns:wp14="http://schemas.microsoft.com/office/word/2010/wordprocessingDrawing" xmlns:wp="http://schemas.openxmlformats.org/drawingml/2006/wordprocessingDrawing" xmlns:w10="urn:schemas-microsoft-com:office:word" xmlns:w="http://schemas.openxmlformats.org/wordprocessingml/2006/main" xmlns:w14="http://schemas.microsoft.com/office/word/2010/wordml" xmlns:w15="http://schemas.microsoft.com/office/word/2012/wordml" xmlns:w16cex="http://schemas.microsoft.com/office/word/2018/wordml/cex" xmlns:w16cid="http://schemas.microsoft.com/office/word/2016/wordml/cid" xmlns:w16="http://schemas.microsoft.com/office/word/2018/wordml" xmlns:w16du="http://schemas.microsoft.com/office/word/2023/wordml/word16du" xmlns:w16sdtdh="http://schemas.microsoft.com/office/word/2020/wordml/sdtdatahash" xmlns:w16sdtfl="http://schemas.microsoft.com/office/word/2024/wordml/sdtformatlock" xmlns:w16se="http://schemas.microsoft.com/office/word/2015/wordml/symex" xmlns:wpg="http://schemas.microsoft.com/office/word/2010/wordprocessingGroup" xmlns:wpi="http://schemas.microsoft.com/office/word/2010/wordprocessingInk" xmlns:wne="http://schemas.microsoft.com/office/word/2006/wordml" xmlns:wps="http://schemas.microsoft.com/office/word/2010/wordprocessingShape" mc:Ignorable="w14 w15 w16se w16cid w16 w16cex w16sdtdh w16sdtfl w16du wp14">
+<w:hdr xmlns:wpc="http://schemas.microsoft.com/office/word/2010/wordprocessingCanvas" xmlns:cx="http://schemas.microsoft.com/office/drawing/2014/chartex" xmlns:cx1="http://schemas.microsoft.com/office/drawing/2015/9/8/chartex" xmlns:cx2="http://schemas.microsoft.com/office/drawing/2015/10/21/chartex" xmlns:cx3="http://schemas.microsoft.com/office/drawing/2016/5/9/chartex" xmlns:cx4="http://schemas.microsoft.com/office/drawing/2016/5/10/chartex" xmlns:cx5="http://schemas.microsoft.com/office/drawing/2016/5/11/chartex" xmlns:cx6="http://schemas.microsoft.com/office/drawing/2016/5/12/chartex" xmlns:cx7="http://schemas.microsoft.com/office/drawing/2016/5/13/chartex" xmlns:cx8="http://schemas.microsoft.com/office/drawing/2016/5/14/chartex" xmlns:mc="http://schemas.openxmlformats.org/markup-compatibility/2006" xmlns:aink="http://schemas.microsoft.com/office/drawing/2016/ink" xmlns:am3d="http://schemas.microsoft.com/office/drawing/2017/model3d" xmlns:o="urn:schemas-microsoft-com:office:office" xmlns:oel="http://schemas.microsoft.com/office/2019/extlst" xmlns:r="http://schemas.openxmlformats.org/officeDocument/2006/relationships" xmlns:m="http://schemas.openxmlformats.org/officeDocument/2006/math" xmlns:v="urn:schemas-microsoft-com:vml" xmlns:wp14="http://schemas.microsoft.com/office/word/2010/wordprocessingDrawing" xmlns:wp="http://schemas.openxmlformats.org/drawingml/2006/wordprocessingDrawing" xmlns:w10="urn:schemas-microsoft-com:office:word" xmlns:w="http://schemas.openxmlformats.org/wordprocessingml/2006/main" xmlns:w14="http://schemas.microsoft.com/office/word/2010/wordml" xmlns:w15="http://schemas.microsoft.com/office/word/2012/wordml" xmlns:w16cei="http://schemas.microsoft.com/office/word/2026/wordml/cei" xmlns:w16cex="http://schemas.microsoft.com/office/word/2018/wordml/cex" xmlns:w16cid="http://schemas.microsoft.com/office/word/2016/wordml/cid" xmlns:w16="http://schemas.microsoft.com/office/word/2018/wordml" xmlns:w16du="http://schemas.microsoft.com/office/word/2023/wordml/word16du" xmlns:w16sdtdh="http://schemas.microsoft.com/office/word/2020/wordml/sdtdatahash" xmlns:w16sdtfl="http://schemas.microsoft.com/office/word/2024/wordml/sdtformatlock" xmlns:w16se="http://schemas.microsoft.com/office/word/2015/wordml/symex" xmlns:wpg="http://schemas.microsoft.com/office/word/2010/wordprocessingGroup" xmlns:wpi="http://schemas.microsoft.com/office/word/2010/wordprocessingInk" xmlns:wne="http://schemas.microsoft.com/office/word/2006/wordml" xmlns:wps="http://schemas.microsoft.com/office/word/2010/wordprocessingShape" mc:Ignorable="w14 w15 w16se w16cid w16 w16cex w16sdtdh w16sdtfl w16du wp14">
   <w:tbl>
     <w:tblPr>
       <w:tblW w:w="0" w:type="auto"/>
@@ -8855,10 +10259,10 @@
             <w:pStyle w:val="Header"/>
           </w:pPr>
           <w:r>
-            <w:t xml:space="preserve">Spring </w:t>
+            <w:t>Fall</w:t>
           </w:r>
           <w:r>
-            <w:t>2026</w:t>
+            <w:t xml:space="preserve"> 2026</w:t>
           </w:r>
         </w:p>
       </w:tc>
@@ -8884,18 +10288,8 @@
 </w:hdr>
 </file>
 
-<file path=word/header3.xml><?xml version="1.0" encoding="utf-8"?>
-<w:hdr xmlns:wpc="http://schemas.microsoft.com/office/word/2010/wordprocessingCanvas" xmlns:cx="http://schemas.microsoft.com/office/drawing/2014/chartex" xmlns:cx1="http://schemas.microsoft.com/office/drawing/2015/9/8/chartex" xmlns:cx2="http://schemas.microsoft.com/office/drawing/2015/10/21/chartex" xmlns:cx3="http://schemas.microsoft.com/office/drawing/2016/5/9/chartex" xmlns:cx4="http://schemas.microsoft.com/office/drawing/2016/5/10/chartex" xmlns:cx5="http://schemas.microsoft.com/office/drawing/2016/5/11/chartex" xmlns:cx6="http://schemas.microsoft.com/office/drawing/2016/5/12/chartex" xmlns:cx7="http://schemas.microsoft.com/office/drawing/2016/5/13/chartex" xmlns:cx8="http://schemas.microsoft.com/office/drawing/2016/5/14/chartex" xmlns:mc="http://schemas.openxmlformats.org/markup-compatibility/2006" xmlns:aink="http://schemas.microsoft.com/office/drawing/2016/ink" xmlns:am3d="http://schemas.microsoft.com/office/drawing/2017/model3d" xmlns:o="urn:schemas-microsoft-com:office:office" xmlns:oel="http://schemas.microsoft.com/office/2019/extlst" xmlns:r="http://schemas.openxmlformats.org/officeDocument/2006/relationships" xmlns:m="http://schemas.openxmlformats.org/officeDocument/2006/math" xmlns:v="urn:schemas-microsoft-com:vml" xmlns:wp14="http://schemas.microsoft.com/office/word/2010/wordprocessingDrawing" xmlns:wp="http://schemas.openxmlformats.org/drawingml/2006/wordprocessingDrawing" xmlns:w10="urn:schemas-microsoft-com:office:word" xmlns:w="http://schemas.openxmlformats.org/wordprocessingml/2006/main" xmlns:w14="http://schemas.microsoft.com/office/word/2010/wordml" xmlns:w15="http://schemas.microsoft.com/office/word/2012/wordml" xmlns:w16cex="http://schemas.microsoft.com/office/word/2018/wordml/cex" xmlns:w16cid="http://schemas.microsoft.com/office/word/2016/wordml/cid" xmlns:w16="http://schemas.microsoft.com/office/word/2018/wordml" xmlns:w16du="http://schemas.microsoft.com/office/word/2023/wordml/word16du" xmlns:w16sdtdh="http://schemas.microsoft.com/office/word/2020/wordml/sdtdatahash" xmlns:w16sdtfl="http://schemas.microsoft.com/office/word/2024/wordml/sdtformatlock" xmlns:w16se="http://schemas.microsoft.com/office/word/2015/wordml/symex" xmlns:wpg="http://schemas.microsoft.com/office/word/2010/wordprocessingGroup" xmlns:wpi="http://schemas.microsoft.com/office/word/2010/wordprocessingInk" xmlns:wne="http://schemas.microsoft.com/office/word/2006/wordml" xmlns:wps="http://schemas.microsoft.com/office/word/2010/wordprocessingShape" mc:Ignorable="w14 w15 w16se w16cid w16 w16cex w16sdtdh w16sdtfl w16du wp14">
-  <w:p>
-    <w:pPr>
-      <w:pStyle w:val="Header"/>
-    </w:pPr>
-  </w:p>
-</w:hdr>
-</file>
-
 <file path=word/numbering.xml><?xml version="1.0" encoding="utf-8"?>
-<w:numbering xmlns:wpc="http://schemas.microsoft.com/office/word/2010/wordprocessingCanvas" xmlns:cx="http://schemas.microsoft.com/office/drawing/2014/chartex" xmlns:cx1="http://schemas.microsoft.com/office/drawing/2015/9/8/chartex" xmlns:cx2="http://schemas.microsoft.com/office/drawing/2015/10/21/chartex" xmlns:cx3="http://schemas.microsoft.com/office/drawing/2016/5/9/chartex" xmlns:cx4="http://schemas.microsoft.com/office/drawing/2016/5/10/chartex" xmlns:cx5="http://schemas.microsoft.com/office/drawing/2016/5/11/chartex" xmlns:cx6="http://schemas.microsoft.com/office/drawing/2016/5/12/chartex" xmlns:cx7="http://schemas.microsoft.com/office/drawing/2016/5/13/chartex" xmlns:cx8="http://schemas.microsoft.com/office/drawing/2016/5/14/chartex" xmlns:mc="http://schemas.openxmlformats.org/markup-compatibility/2006" xmlns:aink="http://schemas.microsoft.com/office/drawing/2016/ink" xmlns:am3d="http://schemas.microsoft.com/office/drawing/2017/model3d" xmlns:o="urn:schemas-microsoft-com:office:office" xmlns:oel="http://schemas.microsoft.com/office/2019/extlst" xmlns:r="http://schemas.openxmlformats.org/officeDocument/2006/relationships" xmlns:m="http://schemas.openxmlformats.org/officeDocument/2006/math" xmlns:v="urn:schemas-microsoft-com:vml" xmlns:wp14="http://schemas.microsoft.com/office/word/2010/wordprocessingDrawing" xmlns:wp="http://schemas.openxmlformats.org/drawingml/2006/wordprocessingDrawing" xmlns:w10="urn:schemas-microsoft-com:office:word" xmlns:w="http://schemas.openxmlformats.org/wordprocessingml/2006/main" xmlns:w14="http://schemas.microsoft.com/office/word/2010/wordml" xmlns:w15="http://schemas.microsoft.com/office/word/2012/wordml" xmlns:w16cex="http://schemas.microsoft.com/office/word/2018/wordml/cex" xmlns:w16cid="http://schemas.microsoft.com/office/word/2016/wordml/cid" xmlns:w16="http://schemas.microsoft.com/office/word/2018/wordml" xmlns:w16du="http://schemas.microsoft.com/office/word/2023/wordml/word16du" xmlns:w16sdtdh="http://schemas.microsoft.com/office/word/2020/wordml/sdtdatahash" xmlns:w16sdtfl="http://schemas.microsoft.com/office/word/2024/wordml/sdtformatlock" xmlns:w16se="http://schemas.microsoft.com/office/word/2015/wordml/symex" xmlns:wpg="http://schemas.microsoft.com/office/word/2010/wordprocessingGroup" xmlns:wpi="http://schemas.microsoft.com/office/word/2010/wordprocessingInk" xmlns:wne="http://schemas.microsoft.com/office/word/2006/wordml" xmlns:wps="http://schemas.microsoft.com/office/word/2010/wordprocessingShape" mc:Ignorable="w14 w15 w16se w16cid w16 w16cex w16sdtdh w16sdtfl w16du wp14">
+<w:numbering xmlns:wpc="http://schemas.microsoft.com/office/word/2010/wordprocessingCanvas" xmlns:cx="http://schemas.microsoft.com/office/drawing/2014/chartex" xmlns:cx1="http://schemas.microsoft.com/office/drawing/2015/9/8/chartex" xmlns:cx2="http://schemas.microsoft.com/office/drawing/2015/10/21/chartex" xmlns:cx3="http://schemas.microsoft.com/office/drawing/2016/5/9/chartex" xmlns:cx4="http://schemas.microsoft.com/office/drawing/2016/5/10/chartex" xmlns:cx5="http://schemas.microsoft.com/office/drawing/2016/5/11/chartex" xmlns:cx6="http://schemas.microsoft.com/office/drawing/2016/5/12/chartex" xmlns:cx7="http://schemas.microsoft.com/office/drawing/2016/5/13/chartex" xmlns:cx8="http://schemas.microsoft.com/office/drawing/2016/5/14/chartex" xmlns:mc="http://schemas.openxmlformats.org/markup-compatibility/2006" xmlns:aink="http://schemas.microsoft.com/office/drawing/2016/ink" xmlns:am3d="http://schemas.microsoft.com/office/drawing/2017/model3d" xmlns:o="urn:schemas-microsoft-com:office:office" xmlns:oel="http://schemas.microsoft.com/office/2019/extlst" xmlns:r="http://schemas.openxmlformats.org/officeDocument/2006/relationships" xmlns:m="http://schemas.openxmlformats.org/officeDocument/2006/math" xmlns:v="urn:schemas-microsoft-com:vml" xmlns:wp14="http://schemas.microsoft.com/office/word/2010/wordprocessingDrawing" xmlns:wp="http://schemas.openxmlformats.org/drawingml/2006/wordprocessingDrawing" xmlns:w10="urn:schemas-microsoft-com:office:word" xmlns:w="http://schemas.openxmlformats.org/wordprocessingml/2006/main" xmlns:w14="http://schemas.microsoft.com/office/word/2010/wordml" xmlns:w15="http://schemas.microsoft.com/office/word/2012/wordml" xmlns:w16cei="http://schemas.microsoft.com/office/word/2026/wordml/cei" xmlns:w16cex="http://schemas.microsoft.com/office/word/2018/wordml/cex" xmlns:w16cid="http://schemas.microsoft.com/office/word/2016/wordml/cid" xmlns:w16="http://schemas.microsoft.com/office/word/2018/wordml" xmlns:w16du="http://schemas.microsoft.com/office/word/2023/wordml/word16du" xmlns:w16sdtdh="http://schemas.microsoft.com/office/word/2020/wordml/sdtdatahash" xmlns:w16sdtfl="http://schemas.microsoft.com/office/word/2024/wordml/sdtformatlock" xmlns:w16se="http://schemas.microsoft.com/office/word/2015/wordml/symex" xmlns:wpg="http://schemas.microsoft.com/office/word/2010/wordprocessingGroup" xmlns:wpi="http://schemas.microsoft.com/office/word/2010/wordprocessingInk" xmlns:wne="http://schemas.microsoft.com/office/word/2006/wordml" xmlns:wps="http://schemas.microsoft.com/office/word/2010/wordprocessingShape" mc:Ignorable="w14 w15 w16se w16cid w16 w16cex w16sdtdh w16sdtfl w16du wp14">
   <w:abstractNum w:abstractNumId="0" w15:restartNumberingAfterBreak="0">
     <w:nsid w:val="002D4B57"/>
     <w:multiLevelType w:val="hybridMultilevel"/>

</xml_diff>